<commit_message>
Revert "Add/update UWTranslationNotes resource data"
</commit_message>
<xml_diff>
--- a/arb/docx/31.content.docx
+++ b/arb/docx/31.content.docx
@@ -32,16 +32,51 @@
     </w:p>
     <w:p>
       <w:pPr>
-        <w:bidi/>
-      </w:pPr>
-      <w:r>
-        <w:rPr>
-          <w:lang w:val="ar_AE" w:bidi="ar_AE"/>
-        </w:rPr>
-      </w:r>
-      <w:r>
-        <w:rPr>
-          <w:b/>
+        <w:pStyle w:val="Heading2"/>
+        <w:bidi/>
+      </w:pPr>
+      <w:r>
+        <w:rPr>
+          <w:lang w:val="ar_AE" w:bidi="ar_AE"/>
+        </w:rPr>
+        <w:t>License Information</w:t>
+      </w:r>
+      <w:r>
+        <w:rPr>
+          <w:lang w:val="ar_AE" w:bidi="ar_AE"/>
+        </w:rPr>
+      </w:r>
+    </w:p>
+    <w:p>
+      <w:pPr>
+        <w:bidi/>
+      </w:pPr>
+      <w:r>
+        <w:rPr>
+          <w:lang w:val="ar_AE" w:bidi="ar_AE"/>
+        </w:rPr>
+      </w:r>
+      <w:r>
+        <w:rPr>
+          <w:b/>
+          <w:lang w:val="ar_AE" w:bidi="ar_AE"/>
+        </w:rPr>
+        <w:t>ملاحظات الترجمة (كلمة متكشفة)</w:t>
+      </w:r>
+      <w:r>
+        <w:rPr>
+          <w:lang w:val="ar_AE" w:bidi="ar_AE"/>
+        </w:rPr>
+        <w:t xml:space="preserve"> (Arabic) is based on</w:t>
+      </w:r>
+      <w:r>
+        <w:rPr>
+          <w:lang w:val="ar_AE" w:bidi="ar_AE"/>
+        </w:rPr>
+        <w:t xml:space="preserve">: </w:t>
+      </w:r>
+      <w:r>
+        <w:rPr>
           <w:lang w:val="ar_AE" w:bidi="ar_AE"/>
         </w:rPr>
         <w:t>unfoldingWord® Translation Notes</w:t>
@@ -50,31 +85,64 @@
         <w:rPr>
           <w:lang w:val="ar_AE" w:bidi="ar_AE"/>
         </w:rPr>
-        <w:t xml:space="preserve"> © 2022 unfoldingWord. Released under CC BY-SA 4.0 license. </w:t>
-      </w:r>
-      <w:r>
-        <w:rPr>
-          <w:lang w:val="ar_AE" w:bidi="ar_AE"/>
-        </w:rPr>
-        <w:t>unfoldingWord® Translation Notes</w:t>
-      </w:r>
-      <w:r>
-        <w:rPr>
-          <w:lang w:val="ar_AE" w:bidi="ar_AE"/>
-        </w:rPr>
-        <w:t xml:space="preserve"> has been adapted in the following languages: Tok Pisin, Arabic (عربي), French (Français), Hindi (हिंदी), Indonesian (Bahasa Indonesia), Portuguese (Português), Russian (Русский), Spanish (Español), Swahili (Kiswahili), and Simplified Chinese (简体中文) from </w:t>
-      </w:r>
-      <w:r>
-        <w:rPr>
-          <w:lang w:val="ar_AE" w:bidi="ar_AE"/>
-        </w:rPr>
-        <w:t>unfoldingWord® Translation Notes</w:t>
-      </w:r>
-      <w:r>
-        <w:rPr>
-          <w:lang w:val="ar_AE" w:bidi="ar_AE"/>
-        </w:rPr>
-        <w:t xml:space="preserve"> © 2022 unfoldingWord. Released under CC BY-SA 4.0 license by Mission Mutual</w:t>
+        <w:t xml:space="preserve">, </w:t>
+      </w:r>
+      <w:hyperlink r:id="rId13">
+        <w:r>
+          <w:rPr>
+            <w:lang w:val="ar_AE" w:bidi="ar_AE"/>
+          </w:rPr>
+          <w:rPr>
+            <w:color w:val="0000EE"/>
+            <w:u w:val="single"/>
+          </w:rPr>
+          <w:t>unfoldingWord</w:t>
+        </w:r>
+      </w:hyperlink>
+      <w:r>
+        <w:rPr>
+          <w:lang w:val="ar_AE" w:bidi="ar_AE"/>
+        </w:rPr>
+        <w:t xml:space="preserve">, 2022, which is licensed under a </w:t>
+      </w:r>
+      <w:hyperlink r:id="rId14">
+        <w:r>
+          <w:rPr>
+            <w:lang w:val="ar_AE" w:bidi="ar_AE"/>
+          </w:rPr>
+          <w:rPr>
+            <w:color w:val="0000EE"/>
+            <w:u w:val="single"/>
+          </w:rPr>
+          <w:t>CC BY-SA 4.0 license</w:t>
+        </w:r>
+      </w:hyperlink>
+      <w:r>
+        <w:rPr>
+          <w:lang w:val="ar_AE" w:bidi="ar_AE"/>
+        </w:rPr>
+        <w:t>.</w:t>
+      </w:r>
+      <w:r>
+        <w:rPr>
+          <w:lang w:val="ar_AE" w:bidi="ar_AE"/>
+        </w:rPr>
+      </w:r>
+    </w:p>
+    <w:p>
+      <w:pPr>
+        <w:bidi/>
+      </w:pPr>
+      <w:r>
+        <w:rPr>
+          <w:lang w:val="ar_AE" w:bidi="ar_AE"/>
+        </w:rPr>
+      </w:r>
+      <w:r>
+        <w:rPr>
+          <w:lang w:val="ar_AE" w:bidi="ar_AE"/>
+        </w:rPr>
+        <w:t>This PDF version is provided under the same license.</w:t>
       </w:r>
       <w:r>
         <w:rPr>
@@ -606,6 +674,22 @@
       </w:r>
       <w:r>
         <w:rPr>
+          <w:lang w:val="ar_AE" w:bidi="ar_AE"/>
+        </w:rPr>
+        <w:t>יְהוִ֜ה</w:t>
+      </w:r>
+    </w:p>
+    <w:p>
+      <w:pPr>
+        <w:bidi/>
+      </w:pPr>
+      <w:r>
+        <w:rPr>
+          <w:lang w:val="ar_AE" w:bidi="ar_AE"/>
+        </w:rPr>
+      </w:r>
+      <w:r>
+        <w:rPr>
           <w:b/>
           <w:lang w:val="ar_AE" w:bidi="ar_AE"/>
         </w:rPr>
@@ -711,6 +795,22 @@
       </w:r>
       <w:r>
         <w:rPr>
+          <w:lang w:val="ar_AE" w:bidi="ar_AE"/>
+        </w:rPr>
+        <w:t>ק֛וּמוּ</w:t>
+      </w:r>
+    </w:p>
+    <w:p>
+      <w:pPr>
+        <w:bidi/>
+      </w:pPr>
+      <w:r>
+        <w:rPr>
+          <w:lang w:val="ar_AE" w:bidi="ar_AE"/>
+        </w:rPr>
+      </w:r>
+      <w:r>
+        <w:rPr>
           <w:b/>
           <w:lang w:val="ar_AE" w:bidi="ar_AE"/>
         </w:rPr>
@@ -803,6 +903,22 @@
       </w:r>
       <w:r>
         <w:rPr>
+          <w:lang w:val="ar_AE" w:bidi="ar_AE"/>
+        </w:rPr>
+        <w:t>הִנֵּ֥ה קָטֹ֛ן נְתַתִּ֖י⁠ךָ</w:t>
+      </w:r>
+    </w:p>
+    <w:p>
+      <w:pPr>
+        <w:bidi/>
+      </w:pPr>
+      <w:r>
+        <w:rPr>
+          <w:lang w:val="ar_AE" w:bidi="ar_AE"/>
+        </w:rPr>
+      </w:r>
+      <w:r>
+        <w:rPr>
           <w:b/>
           <w:lang w:val="ar_AE" w:bidi="ar_AE"/>
         </w:rPr>
@@ -895,6 +1011,22 @@
       </w:r>
       <w:r>
         <w:rPr>
+          <w:lang w:val="ar_AE" w:bidi="ar_AE"/>
+        </w:rPr>
+        <w:t>הִנֵּ֥ה</w:t>
+      </w:r>
+    </w:p>
+    <w:p>
+      <w:pPr>
+        <w:bidi/>
+      </w:pPr>
+      <w:r>
+        <w:rPr>
+          <w:lang w:val="ar_AE" w:bidi="ar_AE"/>
+        </w:rPr>
+      </w:r>
+      <w:r>
+        <w:rPr>
           <w:b/>
           <w:lang w:val="ar_AE" w:bidi="ar_AE"/>
         </w:rPr>
@@ -965,6 +1097,22 @@
       </w:r>
       <w:r>
         <w:rPr>
+          <w:lang w:val="ar_AE" w:bidi="ar_AE"/>
+        </w:rPr>
+        <w:t>קָטֹ֛ן נְתַתִּ֖י⁠ךָ בַּ⁠גּוֹיִ֑ם בָּז֥וּי אַתָּ֖ה מְאֹֽד</w:t>
+      </w:r>
+    </w:p>
+    <w:p>
+      <w:pPr>
+        <w:bidi/>
+      </w:pPr>
+      <w:r>
+        <w:rPr>
+          <w:lang w:val="ar_AE" w:bidi="ar_AE"/>
+        </w:rPr>
+      </w:r>
+      <w:r>
+        <w:rPr>
           <w:b/>
           <w:lang w:val="ar_AE" w:bidi="ar_AE"/>
         </w:rPr>
@@ -1057,6 +1205,22 @@
       </w:r>
       <w:r>
         <w:rPr>
+          <w:lang w:val="ar_AE" w:bidi="ar_AE"/>
+        </w:rPr>
+        <w:t>קָטֹ֛ן נְתַתִּ֖י⁠ךָ בַּ⁠גּוֹיִ֑ם</w:t>
+      </w:r>
+    </w:p>
+    <w:p>
+      <w:pPr>
+        <w:bidi/>
+      </w:pPr>
+      <w:r>
+        <w:rPr>
+          <w:lang w:val="ar_AE" w:bidi="ar_AE"/>
+        </w:rPr>
+      </w:r>
+      <w:r>
+        <w:rPr>
           <w:b/>
           <w:lang w:val="ar_AE" w:bidi="ar_AE"/>
         </w:rPr>
@@ -1149,6 +1313,22 @@
       </w:r>
       <w:r>
         <w:rPr>
+          <w:lang w:val="ar_AE" w:bidi="ar_AE"/>
+        </w:rPr>
+        <w:t>בָּז֥וּי אַתָּ֖ה מְאֹֽד</w:t>
+      </w:r>
+    </w:p>
+    <w:p>
+      <w:pPr>
+        <w:bidi/>
+      </w:pPr>
+      <w:r>
+        <w:rPr>
+          <w:lang w:val="ar_AE" w:bidi="ar_AE"/>
+        </w:rPr>
+      </w:r>
+      <w:r>
+        <w:rPr>
           <w:b/>
           <w:lang w:val="ar_AE" w:bidi="ar_AE"/>
         </w:rPr>
@@ -1241,6 +1421,22 @@
       </w:r>
       <w:r>
         <w:rPr>
+          <w:lang w:val="ar_AE" w:bidi="ar_AE"/>
+        </w:rPr>
+        <w:t>זְד֤וֹן לִבְּ⁠ךָ֙ הִשִּׁיאֶ֔⁠ךָ</w:t>
+      </w:r>
+    </w:p>
+    <w:p>
+      <w:pPr>
+        <w:bidi/>
+      </w:pPr>
+      <w:r>
+        <w:rPr>
+          <w:lang w:val="ar_AE" w:bidi="ar_AE"/>
+        </w:rPr>
+      </w:r>
+      <w:r>
+        <w:rPr>
           <w:b/>
           <w:lang w:val="ar_AE" w:bidi="ar_AE"/>
         </w:rPr>
@@ -1346,6 +1542,22 @@
       </w:r>
       <w:r>
         <w:rPr>
+          <w:lang w:val="ar_AE" w:bidi="ar_AE"/>
+        </w:rPr>
+        <w:t>זְד֤וֹן לִבְּ⁠ךָ֙ הִשִּׁיאֶ֔⁠ךָ</w:t>
+      </w:r>
+    </w:p>
+    <w:p>
+      <w:pPr>
+        <w:bidi/>
+      </w:pPr>
+      <w:r>
+        <w:rPr>
+          <w:lang w:val="ar_AE" w:bidi="ar_AE"/>
+        </w:rPr>
+      </w:r>
+      <w:r>
+        <w:rPr>
           <w:b/>
           <w:lang w:val="ar_AE" w:bidi="ar_AE"/>
         </w:rPr>
@@ -1451,6 +1663,22 @@
       </w:r>
       <w:r>
         <w:rPr>
+          <w:lang w:val="ar_AE" w:bidi="ar_AE"/>
+        </w:rPr>
+        <w:t>זְד֤וֹן לִבְּ⁠ךָ֙</w:t>
+      </w:r>
+    </w:p>
+    <w:p>
+      <w:pPr>
+        <w:bidi/>
+      </w:pPr>
+      <w:r>
+        <w:rPr>
+          <w:lang w:val="ar_AE" w:bidi="ar_AE"/>
+        </w:rPr>
+      </w:r>
+      <w:r>
+        <w:rPr>
           <w:b/>
           <w:lang w:val="ar_AE" w:bidi="ar_AE"/>
         </w:rPr>
@@ -1556,6 +1784,22 @@
       </w:r>
       <w:r>
         <w:rPr>
+          <w:lang w:val="ar_AE" w:bidi="ar_AE"/>
+        </w:rPr>
+        <w:t>זְד֤וֹן לִבְּ⁠ךָ֙</w:t>
+      </w:r>
+    </w:p>
+    <w:p>
+      <w:pPr>
+        <w:bidi/>
+      </w:pPr>
+      <w:r>
+        <w:rPr>
+          <w:lang w:val="ar_AE" w:bidi="ar_AE"/>
+        </w:rPr>
+      </w:r>
+      <w:r>
+        <w:rPr>
           <w:b/>
           <w:lang w:val="ar_AE" w:bidi="ar_AE"/>
         </w:rPr>
@@ -1661,6 +1905,22 @@
       </w:r>
       <w:r>
         <w:rPr>
+          <w:lang w:val="ar_AE" w:bidi="ar_AE"/>
+        </w:rPr>
+        <w:t>שֹׁכְנִ֥י בְ⁠חַגְוֵי־סֶּ֖לַע</w:t>
+      </w:r>
+    </w:p>
+    <w:p>
+      <w:pPr>
+        <w:bidi/>
+      </w:pPr>
+      <w:r>
+        <w:rPr>
+          <w:lang w:val="ar_AE" w:bidi="ar_AE"/>
+        </w:rPr>
+      </w:r>
+      <w:r>
+        <w:rPr>
           <w:b/>
           <w:lang w:val="ar_AE" w:bidi="ar_AE"/>
         </w:rPr>
@@ -1792,6 +2052,22 @@
       </w:r>
       <w:r>
         <w:rPr>
+          <w:lang w:val="ar_AE" w:bidi="ar_AE"/>
+        </w:rPr>
+        <w:t>בְ⁠חַגְוֵי־סֶּ֖לַע</w:t>
+      </w:r>
+    </w:p>
+    <w:p>
+      <w:pPr>
+        <w:bidi/>
+      </w:pPr>
+      <w:r>
+        <w:rPr>
+          <w:lang w:val="ar_AE" w:bidi="ar_AE"/>
+        </w:rPr>
+      </w:r>
+      <w:r>
+        <w:rPr>
           <w:b/>
           <w:lang w:val="ar_AE" w:bidi="ar_AE"/>
         </w:rPr>
@@ -1862,6 +2138,22 @@
       </w:r>
       <w:r>
         <w:rPr>
+          <w:lang w:val="ar_AE" w:bidi="ar_AE"/>
+        </w:rPr>
+        <w:t>אֹמֵ֣ר בְּ⁠לִבּ֔⁠וֹ</w:t>
+      </w:r>
+    </w:p>
+    <w:p>
+      <w:pPr>
+        <w:bidi/>
+      </w:pPr>
+      <w:r>
+        <w:rPr>
+          <w:lang w:val="ar_AE" w:bidi="ar_AE"/>
+        </w:rPr>
+      </w:r>
+      <w:r>
+        <w:rPr>
           <w:b/>
           <w:lang w:val="ar_AE" w:bidi="ar_AE"/>
         </w:rPr>
@@ -1993,6 +2285,22 @@
       </w:r>
       <w:r>
         <w:rPr>
+          <w:lang w:val="ar_AE" w:bidi="ar_AE"/>
+        </w:rPr>
+        <w:t>אֹמֵ֣ר בְּ⁠לִבּ֔⁠וֹ</w:t>
+      </w:r>
+    </w:p>
+    <w:p>
+      <w:pPr>
+        <w:bidi/>
+      </w:pPr>
+      <w:r>
+        <w:rPr>
+          <w:lang w:val="ar_AE" w:bidi="ar_AE"/>
+        </w:rPr>
+      </w:r>
+      <w:r>
+        <w:rPr>
           <w:b/>
           <w:lang w:val="ar_AE" w:bidi="ar_AE"/>
         </w:rPr>
@@ -2085,6 +2393,22 @@
       </w:r>
       <w:r>
         <w:rPr>
+          <w:lang w:val="ar_AE" w:bidi="ar_AE"/>
+        </w:rPr>
+        <w:t>מִ֥י יוֹרִדֵ֖⁠נִי אָֽרֶץ</w:t>
+      </w:r>
+    </w:p>
+    <w:p>
+      <w:pPr>
+        <w:bidi/>
+      </w:pPr>
+      <w:r>
+        <w:rPr>
+          <w:lang w:val="ar_AE" w:bidi="ar_AE"/>
+        </w:rPr>
+      </w:r>
+      <w:r>
+        <w:rPr>
           <w:b/>
           <w:lang w:val="ar_AE" w:bidi="ar_AE"/>
         </w:rPr>
@@ -2177,6 +2501,22 @@
       </w:r>
       <w:r>
         <w:rPr>
+          <w:lang w:val="ar_AE" w:bidi="ar_AE"/>
+        </w:rPr>
+        <w:t>אִם־תַּגְבִּ֣יהַּ כַּ⁠נֶּ֔שֶׁר וְ⁠אִם־בֵּ֥ין כּֽוֹכָבִ֖ים שִׂ֣ים קִנֶּ֑⁠ךָ</w:t>
+      </w:r>
+    </w:p>
+    <w:p>
+      <w:pPr>
+        <w:bidi/>
+      </w:pPr>
+      <w:r>
+        <w:rPr>
+          <w:lang w:val="ar_AE" w:bidi="ar_AE"/>
+        </w:rPr>
+      </w:r>
+      <w:r>
+        <w:rPr>
           <w:b/>
           <w:lang w:val="ar_AE" w:bidi="ar_AE"/>
         </w:rPr>
@@ -2269,6 +2609,22 @@
       </w:r>
       <w:r>
         <w:rPr>
+          <w:lang w:val="ar_AE" w:bidi="ar_AE"/>
+        </w:rPr>
+        <w:t>אִם־תַּגְבִּ֣יהַּ כַּ⁠נֶּ֔שֶׁר וְ⁠אִם־בֵּ֥ין כּֽוֹכָבִ֖ים שִׂ֣ים קִנֶּ֑⁠ךָ</w:t>
+      </w:r>
+    </w:p>
+    <w:p>
+      <w:pPr>
+        <w:bidi/>
+      </w:pPr>
+      <w:r>
+        <w:rPr>
+          <w:lang w:val="ar_AE" w:bidi="ar_AE"/>
+        </w:rPr>
+      </w:r>
+      <w:r>
+        <w:rPr>
           <w:b/>
           <w:lang w:val="ar_AE" w:bidi="ar_AE"/>
         </w:rPr>
@@ -2361,6 +2717,22 @@
       </w:r>
       <w:r>
         <w:rPr>
+          <w:lang w:val="ar_AE" w:bidi="ar_AE"/>
+        </w:rPr>
+        <w:t>שִׂ֣ים קִנֶּ֑⁠ךָ</w:t>
+      </w:r>
+    </w:p>
+    <w:p>
+      <w:pPr>
+        <w:bidi/>
+      </w:pPr>
+      <w:r>
+        <w:rPr>
+          <w:lang w:val="ar_AE" w:bidi="ar_AE"/>
+        </w:rPr>
+      </w:r>
+      <w:r>
+        <w:rPr>
           <w:b/>
           <w:lang w:val="ar_AE" w:bidi="ar_AE"/>
         </w:rPr>
@@ -2453,6 +2825,22 @@
       </w:r>
       <w:r>
         <w:rPr>
+          <w:lang w:val="ar_AE" w:bidi="ar_AE"/>
+        </w:rPr>
+        <w:t>מִ⁠שָּׁ֥ם אוֹרִֽידְ⁠ךָ֖</w:t>
+      </w:r>
+    </w:p>
+    <w:p>
+      <w:pPr>
+        <w:bidi/>
+      </w:pPr>
+      <w:r>
+        <w:rPr>
+          <w:lang w:val="ar_AE" w:bidi="ar_AE"/>
+        </w:rPr>
+      </w:r>
+      <w:r>
+        <w:rPr>
           <w:b/>
           <w:lang w:val="ar_AE" w:bidi="ar_AE"/>
         </w:rPr>
@@ -2558,6 +2946,22 @@
       </w:r>
       <w:r>
         <w:rPr>
+          <w:lang w:val="ar_AE" w:bidi="ar_AE"/>
+        </w:rPr>
+        <w:t>נְאֻם־יְהוָֽה</w:t>
+      </w:r>
+    </w:p>
+    <w:p>
+      <w:pPr>
+        <w:bidi/>
+      </w:pPr>
+      <w:r>
+        <w:rPr>
+          <w:lang w:val="ar_AE" w:bidi="ar_AE"/>
+        </w:rPr>
+      </w:r>
+      <w:r>
+        <w:rPr>
           <w:b/>
           <w:lang w:val="ar_AE" w:bidi="ar_AE"/>
         </w:rPr>
@@ -2650,6 +3054,22 @@
       </w:r>
       <w:r>
         <w:rPr>
+          <w:lang w:val="ar_AE" w:bidi="ar_AE"/>
+        </w:rPr>
+        <w:t>נְאֻם־יְהוָֽה</w:t>
+      </w:r>
+    </w:p>
+    <w:p>
+      <w:pPr>
+        <w:bidi/>
+      </w:pPr>
+      <w:r>
+        <w:rPr>
+          <w:lang w:val="ar_AE" w:bidi="ar_AE"/>
+        </w:rPr>
+      </w:r>
+      <w:r>
+        <w:rPr>
           <w:b/>
           <w:lang w:val="ar_AE" w:bidi="ar_AE"/>
         </w:rPr>
@@ -2755,6 +3175,22 @@
       </w:r>
       <w:r>
         <w:rPr>
+          <w:lang w:val="ar_AE" w:bidi="ar_AE"/>
+        </w:rPr>
+        <w:t>אִם־גַּנָּבִ֤ים בָּאֽוּ־לְ⁠ךָ֙ אִם־שׁ֣וֹדְדֵי לַ֔יְלָה</w:t>
+      </w:r>
+    </w:p>
+    <w:p>
+      <w:pPr>
+        <w:bidi/>
+      </w:pPr>
+      <w:r>
+        <w:rPr>
+          <w:lang w:val="ar_AE" w:bidi="ar_AE"/>
+        </w:rPr>
+      </w:r>
+      <w:r>
+        <w:rPr>
           <w:b/>
           <w:lang w:val="ar_AE" w:bidi="ar_AE"/>
         </w:rPr>
@@ -2847,6 +3283,22 @@
       </w:r>
       <w:r>
         <w:rPr>
+          <w:lang w:val="ar_AE" w:bidi="ar_AE"/>
+        </w:rPr>
+        <w:t>אֵ֣יךְ נִדְמֵ֔יתָה</w:t>
+      </w:r>
+    </w:p>
+    <w:p>
+      <w:pPr>
+        <w:bidi/>
+      </w:pPr>
+      <w:r>
+        <w:rPr>
+          <w:lang w:val="ar_AE" w:bidi="ar_AE"/>
+        </w:rPr>
+      </w:r>
+      <w:r>
+        <w:rPr>
           <w:b/>
           <w:lang w:val="ar_AE" w:bidi="ar_AE"/>
         </w:rPr>
@@ -2939,6 +3391,22 @@
       </w:r>
       <w:r>
         <w:rPr>
+          <w:lang w:val="ar_AE" w:bidi="ar_AE"/>
+        </w:rPr>
+        <w:t>אֵ֣יךְ נִדְמֵ֔יתָה</w:t>
+      </w:r>
+    </w:p>
+    <w:p>
+      <w:pPr>
+        <w:bidi/>
+      </w:pPr>
+      <w:r>
+        <w:rPr>
+          <w:lang w:val="ar_AE" w:bidi="ar_AE"/>
+        </w:rPr>
+      </w:r>
+      <w:r>
+        <w:rPr>
           <w:b/>
           <w:lang w:val="ar_AE" w:bidi="ar_AE"/>
         </w:rPr>
@@ -3031,6 +3499,22 @@
       </w:r>
       <w:r>
         <w:rPr>
+          <w:lang w:val="ar_AE" w:bidi="ar_AE"/>
+        </w:rPr>
+        <w:t>הֲ⁠ל֥וֹא יִגְנְב֖וּ דַּיָּ֑⁠ם</w:t>
+      </w:r>
+    </w:p>
+    <w:p>
+      <w:pPr>
+        <w:bidi/>
+      </w:pPr>
+      <w:r>
+        <w:rPr>
+          <w:lang w:val="ar_AE" w:bidi="ar_AE"/>
+        </w:rPr>
+      </w:r>
+      <w:r>
+        <w:rPr>
           <w:b/>
           <w:lang w:val="ar_AE" w:bidi="ar_AE"/>
         </w:rPr>
@@ -3123,6 +3607,22 @@
       </w:r>
       <w:r>
         <w:rPr>
+          <w:lang w:val="ar_AE" w:bidi="ar_AE"/>
+        </w:rPr>
+        <w:t>אִם־בֹּֽצְרִים֙ בָּ֣אוּ לָ֔⁠ךְ הֲ⁠ל֖וֹא יַשְׁאִ֥ירוּ עֹלֵלֽוֹת</w:t>
+      </w:r>
+    </w:p>
+    <w:p>
+      <w:pPr>
+        <w:bidi/>
+      </w:pPr>
+      <w:r>
+        <w:rPr>
+          <w:lang w:val="ar_AE" w:bidi="ar_AE"/>
+        </w:rPr>
+      </w:r>
+      <w:r>
+        <w:rPr>
           <w:b/>
           <w:lang w:val="ar_AE" w:bidi="ar_AE"/>
         </w:rPr>
@@ -3215,6 +3715,22 @@
       </w:r>
       <w:r>
         <w:rPr>
+          <w:lang w:val="ar_AE" w:bidi="ar_AE"/>
+        </w:rPr>
+        <w:t>אֵ֚יךְ</w:t>
+      </w:r>
+    </w:p>
+    <w:p>
+      <w:pPr>
+        <w:bidi/>
+      </w:pPr>
+      <w:r>
+        <w:rPr>
+          <w:lang w:val="ar_AE" w:bidi="ar_AE"/>
+        </w:rPr>
+      </w:r>
+      <w:r>
+        <w:rPr>
           <w:b/>
           <w:lang w:val="ar_AE" w:bidi="ar_AE"/>
         </w:rPr>
@@ -3320,6 +3836,22 @@
       </w:r>
       <w:r>
         <w:rPr>
+          <w:lang w:val="ar_AE" w:bidi="ar_AE"/>
+        </w:rPr>
+        <w:t>אֵ֚יךְ נֶחְפְּשׂ֣וּ עֵשָׂ֔ו</w:t>
+      </w:r>
+    </w:p>
+    <w:p>
+      <w:pPr>
+        <w:bidi/>
+      </w:pPr>
+      <w:r>
+        <w:rPr>
+          <w:lang w:val="ar_AE" w:bidi="ar_AE"/>
+        </w:rPr>
+      </w:r>
+      <w:r>
+        <w:rPr>
           <w:b/>
           <w:lang w:val="ar_AE" w:bidi="ar_AE"/>
         </w:rPr>
@@ -3412,6 +3944,22 @@
       </w:r>
       <w:r>
         <w:rPr>
+          <w:lang w:val="ar_AE" w:bidi="ar_AE"/>
+        </w:rPr>
+        <w:t>עֵשָׂ֔ו</w:t>
+      </w:r>
+    </w:p>
+    <w:p>
+      <w:pPr>
+        <w:bidi/>
+      </w:pPr>
+      <w:r>
+        <w:rPr>
+          <w:lang w:val="ar_AE" w:bidi="ar_AE"/>
+        </w:rPr>
+      </w:r>
+      <w:r>
+        <w:rPr>
           <w:b/>
           <w:lang w:val="ar_AE" w:bidi="ar_AE"/>
         </w:rPr>
@@ -3517,6 +4065,22 @@
       </w:r>
       <w:r>
         <w:rPr>
+          <w:lang w:val="ar_AE" w:bidi="ar_AE"/>
+        </w:rPr>
+        <w:t>נֶחְפְּשׂ֣וּ</w:t>
+      </w:r>
+    </w:p>
+    <w:p>
+      <w:pPr>
+        <w:bidi/>
+      </w:pPr>
+      <w:r>
+        <w:rPr>
+          <w:lang w:val="ar_AE" w:bidi="ar_AE"/>
+        </w:rPr>
+      </w:r>
+      <w:r>
+        <w:rPr>
           <w:b/>
           <w:lang w:val="ar_AE" w:bidi="ar_AE"/>
         </w:rPr>
@@ -3600,6 +4164,22 @@
       </w:r>
       <w:r>
         <w:rPr>
+          <w:lang w:val="ar_AE" w:bidi="ar_AE"/>
+        </w:rPr>
+        <w:t>נִבְע֖וּ מַצְפֻּנָֽי⁠ו</w:t>
+      </w:r>
+    </w:p>
+    <w:p>
+      <w:pPr>
+        <w:bidi/>
+      </w:pPr>
+      <w:r>
+        <w:rPr>
+          <w:lang w:val="ar_AE" w:bidi="ar_AE"/>
+        </w:rPr>
+      </w:r>
+      <w:r>
+        <w:rPr>
           <w:b/>
           <w:lang w:val="ar_AE" w:bidi="ar_AE"/>
         </w:rPr>
@@ -3692,6 +4272,22 @@
       </w:r>
       <w:r>
         <w:rPr>
+          <w:lang w:val="ar_AE" w:bidi="ar_AE"/>
+        </w:rPr>
+        <w:t>עַֽד־הַ⁠גְּב֣וּל שִׁלְּח֗וּ⁠ךָ כֹּ֚ל אַנְשֵׁ֣י בְרִיתֶ֔⁠ךָ</w:t>
+      </w:r>
+    </w:p>
+    <w:p>
+      <w:pPr>
+        <w:bidi/>
+      </w:pPr>
+      <w:r>
+        <w:rPr>
+          <w:lang w:val="ar_AE" w:bidi="ar_AE"/>
+        </w:rPr>
+      </w:r>
+      <w:r>
+        <w:rPr>
           <w:b/>
           <w:lang w:val="ar_AE" w:bidi="ar_AE"/>
         </w:rPr>
@@ -3797,6 +4393,22 @@
       </w:r>
       <w:r>
         <w:rPr>
+          <w:lang w:val="ar_AE" w:bidi="ar_AE"/>
+        </w:rPr>
+        <w:t>בְרִיתֶ֔⁠ךָ</w:t>
+      </w:r>
+    </w:p>
+    <w:p>
+      <w:pPr>
+        <w:bidi/>
+      </w:pPr>
+      <w:r>
+        <w:rPr>
+          <w:lang w:val="ar_AE" w:bidi="ar_AE"/>
+        </w:rPr>
+      </w:r>
+      <w:r>
+        <w:rPr>
           <w:b/>
           <w:lang w:val="ar_AE" w:bidi="ar_AE"/>
         </w:rPr>
@@ -3902,6 +4514,22 @@
       </w:r>
       <w:r>
         <w:rPr>
+          <w:lang w:val="ar_AE" w:bidi="ar_AE"/>
+        </w:rPr>
+        <w:t>עַֽד־הַ⁠גְּב֣וּל שִׁלְּח֗וּ⁠ךָ</w:t>
+      </w:r>
+    </w:p>
+    <w:p>
+      <w:pPr>
+        <w:bidi/>
+      </w:pPr>
+      <w:r>
+        <w:rPr>
+          <w:lang w:val="ar_AE" w:bidi="ar_AE"/>
+        </w:rPr>
+      </w:r>
+      <w:r>
+        <w:rPr>
           <w:b/>
           <w:lang w:val="ar_AE" w:bidi="ar_AE"/>
         </w:rPr>
@@ -3985,6 +4613,22 @@
       </w:r>
       <w:r>
         <w:rPr>
+          <w:lang w:val="ar_AE" w:bidi="ar_AE"/>
+        </w:rPr>
+        <w:t>כֹּ֚ל אַנְשֵׁ֣י בְרִיתֶ֔⁠ךָ &amp; אַנְשֵׁ֣י שְׁלֹמֶ֑⁠ךָ לַחְמְ⁠ךָ֗</w:t>
+      </w:r>
+    </w:p>
+    <w:p>
+      <w:pPr>
+        <w:bidi/>
+      </w:pPr>
+      <w:r>
+        <w:rPr>
+          <w:lang w:val="ar_AE" w:bidi="ar_AE"/>
+        </w:rPr>
+      </w:r>
+      <w:r>
+        <w:rPr>
           <w:b/>
           <w:lang w:val="ar_AE" w:bidi="ar_AE"/>
         </w:rPr>
@@ -4103,6 +4747,22 @@
       </w:r>
       <w:r>
         <w:rPr>
+          <w:lang w:val="ar_AE" w:bidi="ar_AE"/>
+        </w:rPr>
+        <w:t>לַחְמְ⁠ךָ֗ יָשִׂ֤ימוּ מָזוֹר֙ תַּחְתֶּ֔י⁠ךָ</w:t>
+      </w:r>
+    </w:p>
+    <w:p>
+      <w:pPr>
+        <w:bidi/>
+      </w:pPr>
+      <w:r>
+        <w:rPr>
+          <w:lang w:val="ar_AE" w:bidi="ar_AE"/>
+        </w:rPr>
+      </w:r>
+      <w:r>
+        <w:rPr>
           <w:b/>
           <w:lang w:val="ar_AE" w:bidi="ar_AE"/>
         </w:rPr>
@@ -4221,6 +4881,22 @@
       </w:r>
       <w:r>
         <w:rPr>
+          <w:lang w:val="ar_AE" w:bidi="ar_AE"/>
+        </w:rPr>
+        <w:t>אֵ֥ין תְּבוּנָ֖ה בּֽ⁠וֹ</w:t>
+      </w:r>
+    </w:p>
+    <w:p>
+      <w:pPr>
+        <w:bidi/>
+      </w:pPr>
+      <w:r>
+        <w:rPr>
+          <w:lang w:val="ar_AE" w:bidi="ar_AE"/>
+        </w:rPr>
+      </w:r>
+      <w:r>
+        <w:rPr>
           <w:b/>
           <w:lang w:val="ar_AE" w:bidi="ar_AE"/>
         </w:rPr>
@@ -4327,6 +5003,22 @@
       </w:r>
       <w:r>
         <w:rPr>
+          <w:lang w:val="ar_AE" w:bidi="ar_AE"/>
+        </w:rPr>
+        <w:t>אֵ֥ין תְּבוּנָ֖ה בּֽ⁠וֹ</w:t>
+      </w:r>
+    </w:p>
+    <w:p>
+      <w:pPr>
+        <w:bidi/>
+      </w:pPr>
+      <w:r>
+        <w:rPr>
+          <w:lang w:val="ar_AE" w:bidi="ar_AE"/>
+        </w:rPr>
+      </w:r>
+      <w:r>
+        <w:rPr>
           <w:b/>
           <w:lang w:val="ar_AE" w:bidi="ar_AE"/>
         </w:rPr>
@@ -4432,6 +5124,22 @@
       </w:r>
       <w:r>
         <w:rPr>
+          <w:lang w:val="ar_AE" w:bidi="ar_AE"/>
+        </w:rPr>
+        <w:t>בּֽ⁠וֹ</w:t>
+      </w:r>
+    </w:p>
+    <w:p>
+      <w:pPr>
+        <w:bidi/>
+      </w:pPr>
+      <w:r>
+        <w:rPr>
+          <w:lang w:val="ar_AE" w:bidi="ar_AE"/>
+        </w:rPr>
+      </w:r>
+      <w:r>
+        <w:rPr>
           <w:b/>
           <w:lang w:val="ar_AE" w:bidi="ar_AE"/>
         </w:rPr>
@@ -4537,6 +5245,22 @@
       </w:r>
       <w:r>
         <w:rPr>
+          <w:lang w:val="ar_AE" w:bidi="ar_AE"/>
+        </w:rPr>
+        <w:t>הֲ⁠ל֛וֹא בַּ⁠יּ֥וֹם הַ⁠ה֖וּא &amp; וְ⁠הַאֲבַדְתִּ֤י חֲכָמִים֙ מֵֽ⁠אֱד֔וֹם</w:t>
+      </w:r>
+    </w:p>
+    <w:p>
+      <w:pPr>
+        <w:bidi/>
+      </w:pPr>
+      <w:r>
+        <w:rPr>
+          <w:lang w:val="ar_AE" w:bidi="ar_AE"/>
+        </w:rPr>
+      </w:r>
+      <w:r>
+        <w:rPr>
           <w:b/>
           <w:lang w:val="ar_AE" w:bidi="ar_AE"/>
         </w:rPr>
@@ -4629,6 +5353,22 @@
       </w:r>
       <w:r>
         <w:rPr>
+          <w:lang w:val="ar_AE" w:bidi="ar_AE"/>
+        </w:rPr>
+        <w:t>וְ⁠הַאֲבַדְתִּ֤י חֲכָמִים֙ מֵֽ⁠אֱד֔וֹם</w:t>
+      </w:r>
+    </w:p>
+    <w:p>
+      <w:pPr>
+        <w:bidi/>
+      </w:pPr>
+      <w:r>
+        <w:rPr>
+          <w:lang w:val="ar_AE" w:bidi="ar_AE"/>
+        </w:rPr>
+      </w:r>
+      <w:r>
+        <w:rPr>
           <w:b/>
           <w:lang w:val="ar_AE" w:bidi="ar_AE"/>
         </w:rPr>
@@ -4734,6 +5474,22 @@
       </w:r>
       <w:r>
         <w:rPr>
+          <w:lang w:val="ar_AE" w:bidi="ar_AE"/>
+        </w:rPr>
+        <w:t>וּ⁠תְבוּנָ֖ה מֵ⁠הַ֥ר עֵשָֽׂו</w:t>
+      </w:r>
+    </w:p>
+    <w:p>
+      <w:pPr>
+        <w:bidi/>
+      </w:pPr>
+      <w:r>
+        <w:rPr>
+          <w:lang w:val="ar_AE" w:bidi="ar_AE"/>
+        </w:rPr>
+      </w:r>
+      <w:r>
+        <w:rPr>
           <w:b/>
           <w:lang w:val="ar_AE" w:bidi="ar_AE"/>
         </w:rPr>
@@ -4826,6 +5582,22 @@
       </w:r>
       <w:r>
         <w:rPr>
+          <w:lang w:val="ar_AE" w:bidi="ar_AE"/>
+        </w:rPr>
+        <w:t>וּ⁠תְבוּנָ֖ה מֵ⁠הַ֥ר עֵשָֽׂו</w:t>
+      </w:r>
+    </w:p>
+    <w:p>
+      <w:pPr>
+        <w:bidi/>
+      </w:pPr>
+      <w:r>
+        <w:rPr>
+          <w:lang w:val="ar_AE" w:bidi="ar_AE"/>
+        </w:rPr>
+      </w:r>
+      <w:r>
+        <w:rPr>
           <w:b/>
           <w:lang w:val="ar_AE" w:bidi="ar_AE"/>
         </w:rPr>
@@ -4931,6 +5703,22 @@
       </w:r>
       <w:r>
         <w:rPr>
+          <w:lang w:val="ar_AE" w:bidi="ar_AE"/>
+        </w:rPr>
+        <w:t>חֲכָמִים֙ מֵֽ⁠אֱד֔וֹם וּ⁠תְבוּנָ֖ה מֵ⁠הַ֥ר עֵשָֽׂו</w:t>
+      </w:r>
+    </w:p>
+    <w:p>
+      <w:pPr>
+        <w:bidi/>
+      </w:pPr>
+      <w:r>
+        <w:rPr>
+          <w:lang w:val="ar_AE" w:bidi="ar_AE"/>
+        </w:rPr>
+      </w:r>
+      <w:r>
+        <w:rPr>
           <w:b/>
           <w:lang w:val="ar_AE" w:bidi="ar_AE"/>
         </w:rPr>
@@ -5075,6 +5863,22 @@
       </w:r>
       <w:r>
         <w:rPr>
+          <w:lang w:val="ar_AE" w:bidi="ar_AE"/>
+        </w:rPr>
+        <w:t>וּ⁠תְבוּנָ֖ה</w:t>
+      </w:r>
+    </w:p>
+    <w:p>
+      <w:pPr>
+        <w:bidi/>
+      </w:pPr>
+      <w:r>
+        <w:rPr>
+          <w:lang w:val="ar_AE" w:bidi="ar_AE"/>
+        </w:rPr>
+      </w:r>
+      <w:r>
+        <w:rPr>
           <w:b/>
           <w:lang w:val="ar_AE" w:bidi="ar_AE"/>
         </w:rPr>
@@ -5180,6 +5984,22 @@
       </w:r>
       <w:r>
         <w:rPr>
+          <w:lang w:val="ar_AE" w:bidi="ar_AE"/>
+        </w:rPr>
+        <w:t>מֵ⁠הַ֥ר עֵשָֽׂו</w:t>
+      </w:r>
+    </w:p>
+    <w:p>
+      <w:pPr>
+        <w:bidi/>
+      </w:pPr>
+      <w:r>
+        <w:rPr>
+          <w:lang w:val="ar_AE" w:bidi="ar_AE"/>
+        </w:rPr>
+      </w:r>
+      <w:r>
+        <w:rPr>
           <w:b/>
           <w:lang w:val="ar_AE" w:bidi="ar_AE"/>
         </w:rPr>
@@ -5285,6 +6105,22 @@
       </w:r>
       <w:r>
         <w:rPr>
+          <w:lang w:val="ar_AE" w:bidi="ar_AE"/>
+        </w:rPr>
+        <w:t>עֵשָֽׂו</w:t>
+      </w:r>
+    </w:p>
+    <w:p>
+      <w:pPr>
+        <w:bidi/>
+      </w:pPr>
+      <w:r>
+        <w:rPr>
+          <w:lang w:val="ar_AE" w:bidi="ar_AE"/>
+        </w:rPr>
+      </w:r>
+      <w:r>
+        <w:rPr>
           <w:b/>
           <w:lang w:val="ar_AE" w:bidi="ar_AE"/>
         </w:rPr>
@@ -5306,7 +6142,7 @@
         </w:rPr>
         <w:t xml:space="preserve">هذا هو اسم الرجُل الذي كان سَلَف شعب أدوم. انظر كيف ترجمتَ هذا في </w:t>
       </w:r>
-      <w:hyperlink r:id="rId13">
+      <w:hyperlink r:id="rId15">
         <w:r>
           <w:rPr>
             <w:lang w:val="ar_AE" w:bidi="ar_AE"/>
@@ -5395,6 +6231,22 @@
       </w:r>
       <w:r>
         <w:rPr>
+          <w:lang w:val="ar_AE" w:bidi="ar_AE"/>
+        </w:rPr>
+        <w:t>וְ⁠חַתּ֥וּ גִבּוֹרֶ֖י⁠ךָ תֵּימָ֑ן</w:t>
+      </w:r>
+    </w:p>
+    <w:p>
+      <w:pPr>
+        <w:bidi/>
+      </w:pPr>
+      <w:r>
+        <w:rPr>
+          <w:lang w:val="ar_AE" w:bidi="ar_AE"/>
+        </w:rPr>
+      </w:r>
+      <w:r>
+        <w:rPr>
           <w:b/>
           <w:lang w:val="ar_AE" w:bidi="ar_AE"/>
         </w:rPr>
@@ -5500,6 +6352,22 @@
       </w:r>
       <w:r>
         <w:rPr>
+          <w:lang w:val="ar_AE" w:bidi="ar_AE"/>
+        </w:rPr>
+        <w:t>תֵּימָ֑ן</w:t>
+      </w:r>
+    </w:p>
+    <w:p>
+      <w:pPr>
+        <w:bidi/>
+      </w:pPr>
+      <w:r>
+        <w:rPr>
+          <w:lang w:val="ar_AE" w:bidi="ar_AE"/>
+        </w:rPr>
+      </w:r>
+      <w:r>
+        <w:rPr>
           <w:b/>
           <w:lang w:val="ar_AE" w:bidi="ar_AE"/>
         </w:rPr>
@@ -5592,6 +6460,22 @@
       </w:r>
       <w:r>
         <w:rPr>
+          <w:lang w:val="ar_AE" w:bidi="ar_AE"/>
+        </w:rPr>
+        <w:t>לְמַ֧עַן</w:t>
+      </w:r>
+    </w:p>
+    <w:p>
+      <w:pPr>
+        <w:bidi/>
+      </w:pPr>
+      <w:r>
+        <w:rPr>
+          <w:lang w:val="ar_AE" w:bidi="ar_AE"/>
+        </w:rPr>
+      </w:r>
+      <w:r>
+        <w:rPr>
           <w:b/>
           <w:lang w:val="ar_AE" w:bidi="ar_AE"/>
         </w:rPr>
@@ -5684,6 +6568,22 @@
       </w:r>
       <w:r>
         <w:rPr>
+          <w:lang w:val="ar_AE" w:bidi="ar_AE"/>
+        </w:rPr>
+        <w:t>יִכָּֽרֶת־אִ֛ישׁ</w:t>
+      </w:r>
+    </w:p>
+    <w:p>
+      <w:pPr>
+        <w:bidi/>
+      </w:pPr>
+      <w:r>
+        <w:rPr>
+          <w:lang w:val="ar_AE" w:bidi="ar_AE"/>
+        </w:rPr>
+      </w:r>
+      <w:r>
+        <w:rPr>
           <w:b/>
           <w:lang w:val="ar_AE" w:bidi="ar_AE"/>
         </w:rPr>
@@ -5789,6 +6689,22 @@
       </w:r>
       <w:r>
         <w:rPr>
+          <w:lang w:val="ar_AE" w:bidi="ar_AE"/>
+        </w:rPr>
+        <w:t>יִכָּֽרֶת־אִ֛ישׁ</w:t>
+      </w:r>
+    </w:p>
+    <w:p>
+      <w:pPr>
+        <w:bidi/>
+      </w:pPr>
+      <w:r>
+        <w:rPr>
+          <w:lang w:val="ar_AE" w:bidi="ar_AE"/>
+        </w:rPr>
+      </w:r>
+      <w:r>
+        <w:rPr>
           <w:b/>
           <w:lang w:val="ar_AE" w:bidi="ar_AE"/>
         </w:rPr>
@@ -5895,6 +6811,22 @@
       </w:r>
       <w:r>
         <w:rPr>
+          <w:lang w:val="ar_AE" w:bidi="ar_AE"/>
+        </w:rPr>
+        <w:t>אִ֛ישׁ</w:t>
+      </w:r>
+    </w:p>
+    <w:p>
+      <w:pPr>
+        <w:bidi/>
+      </w:pPr>
+      <w:r>
+        <w:rPr>
+          <w:lang w:val="ar_AE" w:bidi="ar_AE"/>
+        </w:rPr>
+      </w:r>
+      <w:r>
+        <w:rPr>
           <w:b/>
           <w:lang w:val="ar_AE" w:bidi="ar_AE"/>
         </w:rPr>
@@ -6008,6 +6940,22 @@
       </w:r>
       <w:r>
         <w:rPr>
+          <w:lang w:val="ar_AE" w:bidi="ar_AE"/>
+        </w:rPr>
+        <w:t>מֵ⁠הַ֥ר עֵשָׂ֖ו</w:t>
+      </w:r>
+    </w:p>
+    <w:p>
+      <w:pPr>
+        <w:bidi/>
+      </w:pPr>
+      <w:r>
+        <w:rPr>
+          <w:lang w:val="ar_AE" w:bidi="ar_AE"/>
+        </w:rPr>
+      </w:r>
+      <w:r>
+        <w:rPr>
           <w:b/>
           <w:lang w:val="ar_AE" w:bidi="ar_AE"/>
         </w:rPr>
@@ -6114,6 +7062,22 @@
       </w:r>
       <w:r>
         <w:rPr>
+          <w:lang w:val="ar_AE" w:bidi="ar_AE"/>
+        </w:rPr>
+        <w:t>מִ⁠קָּֽטֶל</w:t>
+      </w:r>
+    </w:p>
+    <w:p>
+      <w:pPr>
+        <w:bidi/>
+      </w:pPr>
+      <w:r>
+        <w:rPr>
+          <w:lang w:val="ar_AE" w:bidi="ar_AE"/>
+        </w:rPr>
+      </w:r>
+      <w:r>
+        <w:rPr>
           <w:b/>
           <w:lang w:val="ar_AE" w:bidi="ar_AE"/>
         </w:rPr>
@@ -6325,6 +7289,22 @@
       </w:r>
       <w:r>
         <w:rPr>
+          <w:lang w:val="ar_AE" w:bidi="ar_AE"/>
+        </w:rPr>
+        <w:t>אָחִ֥י⁠ךָ</w:t>
+      </w:r>
+    </w:p>
+    <w:p>
+      <w:pPr>
+        <w:bidi/>
+      </w:pPr>
+      <w:r>
+        <w:rPr>
+          <w:lang w:val="ar_AE" w:bidi="ar_AE"/>
+        </w:rPr>
+      </w:r>
+      <w:r>
+        <w:rPr>
           <w:b/>
           <w:lang w:val="ar_AE" w:bidi="ar_AE"/>
         </w:rPr>
@@ -6444,6 +7424,22 @@
       </w:r>
       <w:r>
         <w:rPr>
+          <w:lang w:val="ar_AE" w:bidi="ar_AE"/>
+        </w:rPr>
+        <w:t>יַעֲקֹ֖ב</w:t>
+      </w:r>
+    </w:p>
+    <w:p>
+      <w:pPr>
+        <w:bidi/>
+      </w:pPr>
+      <w:r>
+        <w:rPr>
+          <w:lang w:val="ar_AE" w:bidi="ar_AE"/>
+        </w:rPr>
+      </w:r>
+      <w:r>
+        <w:rPr>
           <w:b/>
           <w:lang w:val="ar_AE" w:bidi="ar_AE"/>
         </w:rPr>
@@ -6563,6 +7559,22 @@
       </w:r>
       <w:r>
         <w:rPr>
+          <w:lang w:val="ar_AE" w:bidi="ar_AE"/>
+        </w:rPr>
+        <w:t>תְּכַסְּ⁠ךָ֣ בוּשָׁ֑ה</w:t>
+      </w:r>
+    </w:p>
+    <w:p>
+      <w:pPr>
+        <w:bidi/>
+      </w:pPr>
+      <w:r>
+        <w:rPr>
+          <w:lang w:val="ar_AE" w:bidi="ar_AE"/>
+        </w:rPr>
+      </w:r>
+      <w:r>
+        <w:rPr>
           <w:b/>
           <w:lang w:val="ar_AE" w:bidi="ar_AE"/>
         </w:rPr>
@@ -6682,6 +7694,22 @@
       </w:r>
       <w:r>
         <w:rPr>
+          <w:lang w:val="ar_AE" w:bidi="ar_AE"/>
+        </w:rPr>
+        <w:t>תְּכַסְּ⁠ךָ֣ בוּשָׁ֑ה</w:t>
+      </w:r>
+    </w:p>
+    <w:p>
+      <w:pPr>
+        <w:bidi/>
+      </w:pPr>
+      <w:r>
+        <w:rPr>
+          <w:lang w:val="ar_AE" w:bidi="ar_AE"/>
+        </w:rPr>
+      </w:r>
+      <w:r>
+        <w:rPr>
           <w:b/>
           <w:lang w:val="ar_AE" w:bidi="ar_AE"/>
         </w:rPr>
@@ -6801,6 +7829,22 @@
       </w:r>
       <w:r>
         <w:rPr>
+          <w:lang w:val="ar_AE" w:bidi="ar_AE"/>
+        </w:rPr>
+        <w:t>וְ⁠נִכְרַ֖תָּ</w:t>
+      </w:r>
+    </w:p>
+    <w:p>
+      <w:pPr>
+        <w:bidi/>
+      </w:pPr>
+      <w:r>
+        <w:rPr>
+          <w:lang w:val="ar_AE" w:bidi="ar_AE"/>
+        </w:rPr>
+      </w:r>
+      <w:r>
+        <w:rPr>
           <w:b/>
           <w:lang w:val="ar_AE" w:bidi="ar_AE"/>
         </w:rPr>
@@ -6907,6 +7951,22 @@
       </w:r>
       <w:r>
         <w:rPr>
+          <w:lang w:val="ar_AE" w:bidi="ar_AE"/>
+        </w:rPr>
+        <w:t>וְ⁠נִכְרַ֖תָּ</w:t>
+      </w:r>
+    </w:p>
+    <w:p>
+      <w:pPr>
+        <w:bidi/>
+      </w:pPr>
+      <w:r>
+        <w:rPr>
+          <w:lang w:val="ar_AE" w:bidi="ar_AE"/>
+        </w:rPr>
+      </w:r>
+      <w:r>
+        <w:rPr>
           <w:b/>
           <w:lang w:val="ar_AE" w:bidi="ar_AE"/>
         </w:rPr>
@@ -6999,6 +8059,22 @@
       </w:r>
       <w:r>
         <w:rPr>
+          <w:lang w:val="ar_AE" w:bidi="ar_AE"/>
+        </w:rPr>
+        <w:t>וְ⁠נִכְרַ֖תָּ</w:t>
+      </w:r>
+    </w:p>
+    <w:p>
+      <w:pPr>
+        <w:bidi/>
+      </w:pPr>
+      <w:r>
+        <w:rPr>
+          <w:lang w:val="ar_AE" w:bidi="ar_AE"/>
+        </w:rPr>
+      </w:r>
+      <w:r>
+        <w:rPr>
           <w:b/>
           <w:lang w:val="ar_AE" w:bidi="ar_AE"/>
         </w:rPr>
@@ -7020,7 +8096,7 @@
         </w:rPr>
         <w:t xml:space="preserve">على غرار ما ورد في </w:t>
       </w:r>
-      <w:hyperlink r:id="rId14">
+      <w:hyperlink r:id="rId16">
         <w:r>
           <w:rPr>
             <w:lang w:val="ar_AE" w:bidi="ar_AE"/>
@@ -7122,6 +8198,22 @@
       </w:r>
       <w:r>
         <w:rPr>
+          <w:lang w:val="ar_AE" w:bidi="ar_AE"/>
+        </w:rPr>
+        <w:t>עֲמָֽדְ⁠ךָ֣ מִ⁠נֶּ֔גֶד</w:t>
+      </w:r>
+    </w:p>
+    <w:p>
+      <w:pPr>
+        <w:bidi/>
+      </w:pPr>
+      <w:r>
+        <w:rPr>
+          <w:lang w:val="ar_AE" w:bidi="ar_AE"/>
+        </w:rPr>
+      </w:r>
+      <w:r>
+        <w:rPr>
           <w:b/>
           <w:lang w:val="ar_AE" w:bidi="ar_AE"/>
         </w:rPr>
@@ -7228,6 +8320,22 @@
       </w:r>
       <w:r>
         <w:rPr>
+          <w:lang w:val="ar_AE" w:bidi="ar_AE"/>
+        </w:rPr>
+        <w:t>שְׁב֥וֹת זָרִ֖ים חֵיל֑⁠וֹ וְ⁠נָכְרִ֞ים בָּ֣אוּ שְׁעָרָ֗יו</w:t>
+      </w:r>
+    </w:p>
+    <w:p>
+      <w:pPr>
+        <w:bidi/>
+      </w:pPr>
+      <w:r>
+        <w:rPr>
+          <w:lang w:val="ar_AE" w:bidi="ar_AE"/>
+        </w:rPr>
+      </w:r>
+      <w:r>
+        <w:rPr>
           <w:b/>
           <w:lang w:val="ar_AE" w:bidi="ar_AE"/>
         </w:rPr>
@@ -7382,7 +8490,7 @@
         </w:rPr>
         <w:t xml:space="preserve">" على "أخيك يعقوب" المذكور في </w:t>
       </w:r>
-      <w:hyperlink r:id="rId15">
+      <w:hyperlink r:id="rId17">
         <w:r>
           <w:rPr>
             <w:lang w:val="ar_AE" w:bidi="ar_AE"/>
@@ -7471,6 +8579,22 @@
       </w:r>
       <w:r>
         <w:rPr>
+          <w:lang w:val="ar_AE" w:bidi="ar_AE"/>
+        </w:rPr>
+        <w:t>חֵיל֑⁠וֹ</w:t>
+      </w:r>
+    </w:p>
+    <w:p>
+      <w:pPr>
+        <w:bidi/>
+      </w:pPr>
+      <w:r>
+        <w:rPr>
+          <w:lang w:val="ar_AE" w:bidi="ar_AE"/>
+        </w:rPr>
+      </w:r>
+      <w:r>
+        <w:rPr>
           <w:b/>
           <w:lang w:val="ar_AE" w:bidi="ar_AE"/>
         </w:rPr>
@@ -7519,7 +8643,7 @@
         </w:rPr>
         <w:t xml:space="preserve">" أيضًا إلى "جيشه". ولكن بما أنه يعني بوضوح "ثروة" في </w:t>
       </w:r>
-      <w:hyperlink r:id="rId16">
+      <w:hyperlink r:id="rId18">
         <w:r>
           <w:rPr>
             <w:lang w:val="ar_AE" w:bidi="ar_AE"/>
@@ -7586,6 +8710,22 @@
       </w:r>
       <w:r>
         <w:rPr>
+          <w:lang w:val="ar_AE" w:bidi="ar_AE"/>
+        </w:rPr>
+        <w:t>שְׁעָרָ֗יו</w:t>
+      </w:r>
+    </w:p>
+    <w:p>
+      <w:pPr>
+        <w:bidi/>
+      </w:pPr>
+      <w:r>
+        <w:rPr>
+          <w:lang w:val="ar_AE" w:bidi="ar_AE"/>
+        </w:rPr>
+      </w:r>
+      <w:r>
+        <w:rPr>
           <w:b/>
           <w:lang w:val="ar_AE" w:bidi="ar_AE"/>
         </w:rPr>
@@ -7705,6 +8845,22 @@
       </w:r>
       <w:r>
         <w:rPr>
+          <w:lang w:val="ar_AE" w:bidi="ar_AE"/>
+        </w:rPr>
+        <w:t>וְ⁠עַל־יְרוּשָׁלִַ֨ם֙ יַדּ֣וּ גוֹרָ֔ל</w:t>
+      </w:r>
+    </w:p>
+    <w:p>
+      <w:pPr>
+        <w:bidi/>
+      </w:pPr>
+      <w:r>
+        <w:rPr>
+          <w:lang w:val="ar_AE" w:bidi="ar_AE"/>
+        </w:rPr>
+      </w:r>
+      <w:r>
+        <w:rPr>
           <w:b/>
           <w:lang w:val="ar_AE" w:bidi="ar_AE"/>
         </w:rPr>
@@ -7837,6 +8993,22 @@
       </w:r>
       <w:r>
         <w:rPr>
+          <w:lang w:val="ar_AE" w:bidi="ar_AE"/>
+        </w:rPr>
+        <w:t>גַּם־אַתָּ֖ה כְּ⁠אַחַ֥ד מֵ⁠הֶֽם</w:t>
+      </w:r>
+    </w:p>
+    <w:p>
+      <w:pPr>
+        <w:bidi/>
+      </w:pPr>
+      <w:r>
+        <w:rPr>
+          <w:lang w:val="ar_AE" w:bidi="ar_AE"/>
+        </w:rPr>
+      </w:r>
+      <w:r>
+        <w:rPr>
           <w:b/>
           <w:lang w:val="ar_AE" w:bidi="ar_AE"/>
         </w:rPr>
@@ -7969,6 +9141,22 @@
       </w:r>
       <w:r>
         <w:rPr>
+          <w:lang w:val="ar_AE" w:bidi="ar_AE"/>
+        </w:rPr>
+        <w:t>וְ⁠אַל &amp; וְ⁠אַל &amp; וְ⁠אַל</w:t>
+      </w:r>
+    </w:p>
+    <w:p>
+      <w:pPr>
+        <w:bidi/>
+      </w:pPr>
+      <w:r>
+        <w:rPr>
+          <w:lang w:val="ar_AE" w:bidi="ar_AE"/>
+        </w:rPr>
+      </w:r>
+      <w:r>
+        <w:rPr>
           <w:b/>
           <w:lang w:val="ar_AE" w:bidi="ar_AE"/>
         </w:rPr>
@@ -8088,6 +9276,22 @@
       </w:r>
       <w:r>
         <w:rPr>
+          <w:lang w:val="ar_AE" w:bidi="ar_AE"/>
+        </w:rPr>
+        <w:t>וְ⁠אַל־תֵּ֤רֶא</w:t>
+      </w:r>
+    </w:p>
+    <w:p>
+      <w:pPr>
+        <w:bidi/>
+      </w:pPr>
+      <w:r>
+        <w:rPr>
+          <w:lang w:val="ar_AE" w:bidi="ar_AE"/>
+        </w:rPr>
+      </w:r>
+      <w:r>
+        <w:rPr>
           <w:b/>
           <w:lang w:val="ar_AE" w:bidi="ar_AE"/>
         </w:rPr>
@@ -8207,6 +9411,22 @@
       </w:r>
       <w:r>
         <w:rPr>
+          <w:lang w:val="ar_AE" w:bidi="ar_AE"/>
+        </w:rPr>
+        <w:t>בְ⁠יוֹם־אָחִ֨י⁠ךָ֙ בְּ⁠י֣וֹם נָכְר֔⁠וֹ</w:t>
+      </w:r>
+    </w:p>
+    <w:p>
+      <w:pPr>
+        <w:bidi/>
+      </w:pPr>
+      <w:r>
+        <w:rPr>
+          <w:lang w:val="ar_AE" w:bidi="ar_AE"/>
+        </w:rPr>
+      </w:r>
+      <w:r>
+        <w:rPr>
           <w:b/>
           <w:lang w:val="ar_AE" w:bidi="ar_AE"/>
         </w:rPr>
@@ -8339,6 +9559,22 @@
       </w:r>
       <w:r>
         <w:rPr>
+          <w:lang w:val="ar_AE" w:bidi="ar_AE"/>
+        </w:rPr>
+        <w:t>בְ⁠יוֹם</w:t>
+      </w:r>
+    </w:p>
+    <w:p>
+      <w:pPr>
+        <w:bidi/>
+      </w:pPr>
+      <w:r>
+        <w:rPr>
+          <w:lang w:val="ar_AE" w:bidi="ar_AE"/>
+        </w:rPr>
+      </w:r>
+      <w:r>
+        <w:rPr>
           <w:b/>
           <w:lang w:val="ar_AE" w:bidi="ar_AE"/>
         </w:rPr>
@@ -8458,6 +9694,22 @@
       </w:r>
       <w:r>
         <w:rPr>
+          <w:lang w:val="ar_AE" w:bidi="ar_AE"/>
+        </w:rPr>
+        <w:t>אָחִ֨י⁠ךָ֙</w:t>
+      </w:r>
+    </w:p>
+    <w:p>
+      <w:pPr>
+        <w:bidi/>
+      </w:pPr>
+      <w:r>
+        <w:rPr>
+          <w:lang w:val="ar_AE" w:bidi="ar_AE"/>
+        </w:rPr>
+      </w:r>
+      <w:r>
+        <w:rPr>
           <w:b/>
           <w:lang w:val="ar_AE" w:bidi="ar_AE"/>
         </w:rPr>
@@ -8493,7 +9745,7 @@
         </w:rPr>
         <w:t xml:space="preserve">على غرار ما ورد في </w:t>
       </w:r>
-      <w:hyperlink r:id="rId15">
+      <w:hyperlink r:id="rId17">
         <w:r>
           <w:rPr>
             <w:lang w:val="ar_AE" w:bidi="ar_AE"/>
@@ -8595,6 +9847,22 @@
       </w:r>
       <w:r>
         <w:rPr>
+          <w:lang w:val="ar_AE" w:bidi="ar_AE"/>
+        </w:rPr>
+        <w:t>לִ⁠בְנֵֽי־יְהוּדָ֖ה</w:t>
+      </w:r>
+    </w:p>
+    <w:p>
+      <w:pPr>
+        <w:bidi/>
+      </w:pPr>
+      <w:r>
+        <w:rPr>
+          <w:lang w:val="ar_AE" w:bidi="ar_AE"/>
+        </w:rPr>
+      </w:r>
+      <w:r>
+        <w:rPr>
           <w:b/>
           <w:lang w:val="ar_AE" w:bidi="ar_AE"/>
         </w:rPr>
@@ -8714,6 +9982,22 @@
       </w:r>
       <w:r>
         <w:rPr>
+          <w:lang w:val="ar_AE" w:bidi="ar_AE"/>
+        </w:rPr>
+        <w:t>וְ⁠אַל־תַּגְדֵּ֥ל פִּ֖י⁠ךָ</w:t>
+      </w:r>
+    </w:p>
+    <w:p>
+      <w:pPr>
+        <w:bidi/>
+      </w:pPr>
+      <w:r>
+        <w:rPr>
+          <w:lang w:val="ar_AE" w:bidi="ar_AE"/>
+        </w:rPr>
+      </w:r>
+      <w:r>
+        <w:rPr>
           <w:b/>
           <w:lang w:val="ar_AE" w:bidi="ar_AE"/>
         </w:rPr>
@@ -8820,6 +10104,22 @@
       </w:r>
       <w:r>
         <w:rPr>
+          <w:lang w:val="ar_AE" w:bidi="ar_AE"/>
+        </w:rPr>
+        <w:t>בְּ⁠י֣וֹם אֵידָ֔⁠ם &amp; בְּ⁠י֣וֹם אֵיד֑⁠וֹ &amp; בְּ⁠י֥וֹם אֵידֽ⁠וֹ</w:t>
+      </w:r>
+    </w:p>
+    <w:p>
+      <w:pPr>
+        <w:bidi/>
+      </w:pPr>
+      <w:r>
+        <w:rPr>
+          <w:lang w:val="ar_AE" w:bidi="ar_AE"/>
+        </w:rPr>
+      </w:r>
+      <w:r>
+        <w:rPr>
           <w:b/>
           <w:lang w:val="ar_AE" w:bidi="ar_AE"/>
         </w:rPr>
@@ -8939,6 +10239,22 @@
       </w:r>
       <w:r>
         <w:rPr>
+          <w:lang w:val="ar_AE" w:bidi="ar_AE"/>
+        </w:rPr>
+        <w:t>אֵידָ֔⁠ם &amp; אֵיד֑⁠וֹ &amp; אֵידֽ⁠וֹ</w:t>
+      </w:r>
+    </w:p>
+    <w:p>
+      <w:pPr>
+        <w:bidi/>
+      </w:pPr>
+      <w:r>
+        <w:rPr>
+          <w:lang w:val="ar_AE" w:bidi="ar_AE"/>
+        </w:rPr>
+      </w:r>
+      <w:r>
+        <w:rPr>
           <w:b/>
           <w:lang w:val="ar_AE" w:bidi="ar_AE"/>
         </w:rPr>
@@ -9013,7 +10329,7 @@
         </w:rPr>
         <w:t xml:space="preserve">" (انظر: </w:t>
       </w:r>
-      <w:hyperlink r:id="rId15">
+      <w:hyperlink r:id="rId17">
         <w:r>
           <w:rPr>
             <w:lang w:val="ar_AE" w:bidi="ar_AE"/>
@@ -9102,6 +10418,22 @@
       </w:r>
       <w:r>
         <w:rPr>
+          <w:lang w:val="ar_AE" w:bidi="ar_AE"/>
+        </w:rPr>
+        <w:t>גַם־אַתָּ֛ה</w:t>
+      </w:r>
+    </w:p>
+    <w:p>
+      <w:pPr>
+        <w:bidi/>
+      </w:pPr>
+      <w:r>
+        <w:rPr>
+          <w:lang w:val="ar_AE" w:bidi="ar_AE"/>
+        </w:rPr>
+      </w:r>
+      <w:r>
+        <w:rPr>
           <w:b/>
           <w:lang w:val="ar_AE" w:bidi="ar_AE"/>
         </w:rPr>
@@ -9208,6 +10540,22 @@
       </w:r>
       <w:r>
         <w:rPr>
+          <w:lang w:val="ar_AE" w:bidi="ar_AE"/>
+        </w:rPr>
+        <w:t>אַל־תֵּ֧רֶא</w:t>
+      </w:r>
+    </w:p>
+    <w:p>
+      <w:pPr>
+        <w:bidi/>
+      </w:pPr>
+      <w:r>
+        <w:rPr>
+          <w:lang w:val="ar_AE" w:bidi="ar_AE"/>
+        </w:rPr>
+      </w:r>
+      <w:r>
+        <w:rPr>
           <w:b/>
           <w:lang w:val="ar_AE" w:bidi="ar_AE"/>
         </w:rPr>
@@ -9256,7 +10604,7 @@
         </w:rPr>
         <w:t xml:space="preserve">" في هذا السياق، هو اصطلاح يُقصد به "التمتع بالنظر". راجع كيف ترجمته في </w:t>
       </w:r>
-      <w:hyperlink r:id="rId17">
+      <w:hyperlink r:id="rId19">
         <w:r>
           <w:rPr>
             <w:lang w:val="ar_AE" w:bidi="ar_AE"/>
@@ -9345,6 +10693,22 @@
       </w:r>
       <w:r>
         <w:rPr>
+          <w:lang w:val="ar_AE" w:bidi="ar_AE"/>
+        </w:rPr>
+        <w:t>וְ⁠אַל־תִּשְׁלַ֥חְנָה בְ⁠חֵיל֖⁠וֹ</w:t>
+      </w:r>
+    </w:p>
+    <w:p>
+      <w:pPr>
+        <w:bidi/>
+      </w:pPr>
+      <w:r>
+        <w:rPr>
+          <w:lang w:val="ar_AE" w:bidi="ar_AE"/>
+        </w:rPr>
+      </w:r>
+      <w:r>
+        <w:rPr>
           <w:b/>
           <w:lang w:val="ar_AE" w:bidi="ar_AE"/>
         </w:rPr>
@@ -9451,6 +10815,22 @@
       </w:r>
       <w:r>
         <w:rPr>
+          <w:lang w:val="ar_AE" w:bidi="ar_AE"/>
+        </w:rPr>
+        <w:t>הַ⁠פֶּ֔רֶק</w:t>
+      </w:r>
+    </w:p>
+    <w:p>
+      <w:pPr>
+        <w:bidi/>
+      </w:pPr>
+      <w:r>
+        <w:rPr>
+          <w:lang w:val="ar_AE" w:bidi="ar_AE"/>
+        </w:rPr>
+      </w:r>
+      <w:r>
+        <w:rPr>
           <w:b/>
           <w:lang w:val="ar_AE" w:bidi="ar_AE"/>
         </w:rPr>
@@ -9564,6 +10944,22 @@
       </w:r>
       <w:r>
         <w:rPr>
+          <w:lang w:val="ar_AE" w:bidi="ar_AE"/>
+        </w:rPr>
+        <w:t>לְ⁠הַכְרִ֖ית</w:t>
+      </w:r>
+    </w:p>
+    <w:p>
+      <w:pPr>
+        <w:bidi/>
+      </w:pPr>
+      <w:r>
+        <w:rPr>
+          <w:lang w:val="ar_AE" w:bidi="ar_AE"/>
+        </w:rPr>
+      </w:r>
+      <w:r>
+        <w:rPr>
           <w:b/>
           <w:lang w:val="ar_AE" w:bidi="ar_AE"/>
         </w:rPr>
@@ -9612,7 +11008,7 @@
         </w:rPr>
         <w:t xml:space="preserve">" هنا، هو استعارة يقصد بها "يقتل". ومن المرجح أن المقارنة مأخوذة من طريقة حصاد الحبوب حين تُقطع عند جمعها. راجع كيف ترجمت هذا التعبير نفسه في </w:t>
       </w:r>
-      <w:hyperlink r:id="rId18">
+      <w:hyperlink r:id="rId20">
         <w:r>
           <w:rPr>
             <w:lang w:val="ar_AE" w:bidi="ar_AE"/>
@@ -9701,6 +11097,22 @@
       </w:r>
       <w:r>
         <w:rPr>
+          <w:lang w:val="ar_AE" w:bidi="ar_AE"/>
+        </w:rPr>
+        <w:t>וְ⁠אַל־תַּסְגֵּ֥ר שְׂרִידָ֖י⁠ו</w:t>
+      </w:r>
+    </w:p>
+    <w:p>
+      <w:pPr>
+        <w:bidi/>
+      </w:pPr>
+      <w:r>
+        <w:rPr>
+          <w:lang w:val="ar_AE" w:bidi="ar_AE"/>
+        </w:rPr>
+      </w:r>
+      <w:r>
+        <w:rPr>
           <w:b/>
           <w:lang w:val="ar_AE" w:bidi="ar_AE"/>
         </w:rPr>
@@ -9891,6 +11303,22 @@
       </w:r>
       <w:r>
         <w:rPr>
+          <w:lang w:val="ar_AE" w:bidi="ar_AE"/>
+        </w:rPr>
+        <w:t>כִּֽי־קָר֥וֹב יוֹם־יְהוָ֖ה עַל־כָּל־הַ⁠גּוֹיִ֑ם</w:t>
+      </w:r>
+    </w:p>
+    <w:p>
+      <w:pPr>
+        <w:bidi/>
+      </w:pPr>
+      <w:r>
+        <w:rPr>
+          <w:lang w:val="ar_AE" w:bidi="ar_AE"/>
+        </w:rPr>
+      </w:r>
+      <w:r>
+        <w:rPr>
           <w:b/>
           <w:lang w:val="ar_AE" w:bidi="ar_AE"/>
         </w:rPr>
@@ -9983,6 +11411,22 @@
       </w:r>
       <w:r>
         <w:rPr>
+          <w:lang w:val="ar_AE" w:bidi="ar_AE"/>
+        </w:rPr>
+        <w:t>יוֹם־יְהוָ֖ה</w:t>
+      </w:r>
+    </w:p>
+    <w:p>
+      <w:pPr>
+        <w:bidi/>
+      </w:pPr>
+      <w:r>
+        <w:rPr>
+          <w:lang w:val="ar_AE" w:bidi="ar_AE"/>
+        </w:rPr>
+      </w:r>
+      <w:r>
+        <w:rPr>
           <w:b/>
           <w:lang w:val="ar_AE" w:bidi="ar_AE"/>
         </w:rPr>
@@ -10102,6 +11546,22 @@
       </w:r>
       <w:r>
         <w:rPr>
+          <w:lang w:val="ar_AE" w:bidi="ar_AE"/>
+        </w:rPr>
+        <w:t>קָר֥וֹב</w:t>
+      </w:r>
+    </w:p>
+    <w:p>
+      <w:pPr>
+        <w:bidi/>
+      </w:pPr>
+      <w:r>
+        <w:rPr>
+          <w:lang w:val="ar_AE" w:bidi="ar_AE"/>
+        </w:rPr>
+      </w:r>
+      <w:r>
+        <w:rPr>
           <w:b/>
           <w:lang w:val="ar_AE" w:bidi="ar_AE"/>
         </w:rPr>
@@ -10199,6 +11659,22 @@
       </w:r>
       <w:r>
         <w:rPr>
+          <w:lang w:val="ar_AE" w:bidi="ar_AE"/>
+        </w:rPr>
+        <w:t>יֵעָ֣שֶׂה לָּ֔⁠ךְ</w:t>
+      </w:r>
+    </w:p>
+    <w:p>
+      <w:pPr>
+        <w:bidi/>
+      </w:pPr>
+      <w:r>
+        <w:rPr>
+          <w:lang w:val="ar_AE" w:bidi="ar_AE"/>
+        </w:rPr>
+      </w:r>
+      <w:r>
+        <w:rPr>
           <w:b/>
           <w:lang w:val="ar_AE" w:bidi="ar_AE"/>
         </w:rPr>
@@ -10305,6 +11781,22 @@
       </w:r>
       <w:r>
         <w:rPr>
+          <w:lang w:val="ar_AE" w:bidi="ar_AE"/>
+        </w:rPr>
+        <w:t>גְּמֻלְ⁠ךָ֖ יָשׁ֥וּב בְּ⁠רֹאשֶֽׁ⁠ךָ</w:t>
+      </w:r>
+    </w:p>
+    <w:p>
+      <w:pPr>
+        <w:bidi/>
+      </w:pPr>
+      <w:r>
+        <w:rPr>
+          <w:lang w:val="ar_AE" w:bidi="ar_AE"/>
+        </w:rPr>
+      </w:r>
+      <w:r>
+        <w:rPr>
           <w:b/>
           <w:lang w:val="ar_AE" w:bidi="ar_AE"/>
         </w:rPr>
@@ -10411,6 +11903,22 @@
       </w:r>
       <w:r>
         <w:rPr>
+          <w:lang w:val="ar_AE" w:bidi="ar_AE"/>
+        </w:rPr>
+        <w:t>בְּ⁠רֹאשֶֽׁ⁠ךָ</w:t>
+      </w:r>
+    </w:p>
+    <w:p>
+      <w:pPr>
+        <w:bidi/>
+      </w:pPr>
+      <w:r>
+        <w:rPr>
+          <w:lang w:val="ar_AE" w:bidi="ar_AE"/>
+        </w:rPr>
+      </w:r>
+      <w:r>
+        <w:rPr>
           <w:b/>
           <w:lang w:val="ar_AE" w:bidi="ar_AE"/>
         </w:rPr>
@@ -10530,6 +12038,22 @@
       </w:r>
       <w:r>
         <w:rPr>
+          <w:lang w:val="ar_AE" w:bidi="ar_AE"/>
+        </w:rPr>
+        <w:t>כִּ֗י כַּֽ⁠אֲשֶׁ֤ר שְׁתִיתֶם֙</w:t>
+      </w:r>
+    </w:p>
+    <w:p>
+      <w:pPr>
+        <w:bidi/>
+      </w:pPr>
+      <w:r>
+        <w:rPr>
+          <w:lang w:val="ar_AE" w:bidi="ar_AE"/>
+        </w:rPr>
+      </w:r>
+      <w:r>
+        <w:rPr>
           <w:b/>
           <w:lang w:val="ar_AE" w:bidi="ar_AE"/>
         </w:rPr>
@@ -10622,6 +12146,22 @@
       </w:r>
       <w:r>
         <w:rPr>
+          <w:lang w:val="ar_AE" w:bidi="ar_AE"/>
+        </w:rPr>
+        <w:t>כַּֽ⁠אֲשֶׁ֤ר שְׁתִיתֶם֙</w:t>
+      </w:r>
+    </w:p>
+    <w:p>
+      <w:pPr>
+        <w:bidi/>
+      </w:pPr>
+      <w:r>
+        <w:rPr>
+          <w:lang w:val="ar_AE" w:bidi="ar_AE"/>
+        </w:rPr>
+      </w:r>
+      <w:r>
+        <w:rPr>
           <w:b/>
           <w:lang w:val="ar_AE" w:bidi="ar_AE"/>
         </w:rPr>
@@ -10727,6 +12267,22 @@
       </w:r>
       <w:r>
         <w:rPr>
+          <w:lang w:val="ar_AE" w:bidi="ar_AE"/>
+        </w:rPr>
+        <w:t>שְׁתִיתֶם֙</w:t>
+      </w:r>
+    </w:p>
+    <w:p>
+      <w:pPr>
+        <w:bidi/>
+      </w:pPr>
+      <w:r>
+        <w:rPr>
+          <w:lang w:val="ar_AE" w:bidi="ar_AE"/>
+        </w:rPr>
+      </w:r>
+      <w:r>
+        <w:rPr>
           <w:b/>
           <w:lang w:val="ar_AE" w:bidi="ar_AE"/>
         </w:rPr>
@@ -10833,6 +12389,22 @@
       </w:r>
       <w:r>
         <w:rPr>
+          <w:lang w:val="ar_AE" w:bidi="ar_AE"/>
+        </w:rPr>
+        <w:t>עַל־הַ֣ר קָדְשִׁ֔⁠י</w:t>
+      </w:r>
+    </w:p>
+    <w:p>
+      <w:pPr>
+        <w:bidi/>
+      </w:pPr>
+      <w:r>
+        <w:rPr>
+          <w:lang w:val="ar_AE" w:bidi="ar_AE"/>
+        </w:rPr>
+      </w:r>
+      <w:r>
+        <w:rPr>
           <w:b/>
           <w:lang w:val="ar_AE" w:bidi="ar_AE"/>
         </w:rPr>
@@ -10952,6 +12524,22 @@
       </w:r>
       <w:r>
         <w:rPr>
+          <w:lang w:val="ar_AE" w:bidi="ar_AE"/>
+        </w:rPr>
+        <w:t>יִשְׁתּ֥וּ כָֽל־הַ⁠גּוֹיִ֖ם תָּמִ֑יד</w:t>
+      </w:r>
+    </w:p>
+    <w:p>
+      <w:pPr>
+        <w:bidi/>
+      </w:pPr>
+      <w:r>
+        <w:rPr>
+          <w:lang w:val="ar_AE" w:bidi="ar_AE"/>
+        </w:rPr>
+      </w:r>
+      <w:r>
+        <w:rPr>
           <w:b/>
           <w:lang w:val="ar_AE" w:bidi="ar_AE"/>
         </w:rPr>
@@ -11071,6 +12659,22 @@
       </w:r>
       <w:r>
         <w:rPr>
+          <w:lang w:val="ar_AE" w:bidi="ar_AE"/>
+        </w:rPr>
+        <w:t>וְ⁠שָׁת֣וּ וְ⁠לָע֔וּ</w:t>
+      </w:r>
+    </w:p>
+    <w:p>
+      <w:pPr>
+        <w:bidi/>
+      </w:pPr>
+      <w:r>
+        <w:rPr>
+          <w:lang w:val="ar_AE" w:bidi="ar_AE"/>
+        </w:rPr>
+      </w:r>
+      <w:r>
+        <w:rPr>
           <w:b/>
           <w:lang w:val="ar_AE" w:bidi="ar_AE"/>
         </w:rPr>
@@ -11203,6 +12807,22 @@
       </w:r>
       <w:r>
         <w:rPr>
+          <w:lang w:val="ar_AE" w:bidi="ar_AE"/>
+        </w:rPr>
+        <w:t>וְ⁠שָׁת֣וּ וְ⁠לָע֔וּ</w:t>
+      </w:r>
+    </w:p>
+    <w:p>
+      <w:pPr>
+        <w:bidi/>
+      </w:pPr>
+      <w:r>
+        <w:rPr>
+          <w:lang w:val="ar_AE" w:bidi="ar_AE"/>
+        </w:rPr>
+      </w:r>
+      <w:r>
+        <w:rPr>
           <w:b/>
           <w:lang w:val="ar_AE" w:bidi="ar_AE"/>
         </w:rPr>
@@ -11321,6 +12941,22 @@
       </w:r>
       <w:r>
         <w:rPr>
+          <w:lang w:val="ar_AE" w:bidi="ar_AE"/>
+        </w:rPr>
+        <w:t>וּ⁠בְ⁠הַ֥ר צִיּ֛וֹן תִּהְיֶ֥ה פְלֵיטָ֖ה</w:t>
+      </w:r>
+    </w:p>
+    <w:p>
+      <w:pPr>
+        <w:bidi/>
+      </w:pPr>
+      <w:r>
+        <w:rPr>
+          <w:lang w:val="ar_AE" w:bidi="ar_AE"/>
+        </w:rPr>
+      </w:r>
+      <w:r>
+        <w:rPr>
           <w:b/>
           <w:lang w:val="ar_AE" w:bidi="ar_AE"/>
         </w:rPr>
@@ -11369,7 +13005,7 @@
         </w:rPr>
         <w:t xml:space="preserve">" إلى شعب إسرائيل الذين سيبقون أحياء في أورشليم بعد أن يُكمل يهوه عقاب الأمم الأخرى. وكما جاء في </w:t>
       </w:r>
-      <w:hyperlink r:id="rId19">
+      <w:hyperlink r:id="rId21">
         <w:r>
           <w:rPr>
             <w:lang w:val="ar_AE" w:bidi="ar_AE"/>
@@ -11458,6 +13094,22 @@
       </w:r>
       <w:r>
         <w:rPr>
+          <w:lang w:val="ar_AE" w:bidi="ar_AE"/>
+        </w:rPr>
+        <w:t>וּ⁠בְ⁠הַ֥ר צִיּ֛וֹן</w:t>
+      </w:r>
+    </w:p>
+    <w:p>
+      <w:pPr>
+        <w:bidi/>
+      </w:pPr>
+      <w:r>
+        <w:rPr>
+          <w:lang w:val="ar_AE" w:bidi="ar_AE"/>
+        </w:rPr>
+      </w:r>
+      <w:r>
+        <w:rPr>
           <w:b/>
           <w:lang w:val="ar_AE" w:bidi="ar_AE"/>
         </w:rPr>
@@ -11550,6 +13202,22 @@
       </w:r>
       <w:r>
         <w:rPr>
+          <w:lang w:val="ar_AE" w:bidi="ar_AE"/>
+        </w:rPr>
+        <w:t>וְ⁠הָ֣יָה קֹ֑דֶשׁ</w:t>
+      </w:r>
+    </w:p>
+    <w:p>
+      <w:pPr>
+        <w:bidi/>
+      </w:pPr>
+      <w:r>
+        <w:rPr>
+          <w:lang w:val="ar_AE" w:bidi="ar_AE"/>
+        </w:rPr>
+      </w:r>
+      <w:r>
+        <w:rPr>
           <w:b/>
           <w:lang w:val="ar_AE" w:bidi="ar_AE"/>
         </w:rPr>
@@ -11669,6 +13337,22 @@
       </w:r>
       <w:r>
         <w:rPr>
+          <w:lang w:val="ar_AE" w:bidi="ar_AE"/>
+        </w:rPr>
+        <w:t>בֵּ֣ית יַֽעֲקֹ֔ב</w:t>
+      </w:r>
+    </w:p>
+    <w:p>
+      <w:pPr>
+        <w:bidi/>
+      </w:pPr>
+      <w:r>
+        <w:rPr>
+          <w:lang w:val="ar_AE" w:bidi="ar_AE"/>
+        </w:rPr>
+      </w:r>
+      <w:r>
+        <w:rPr>
           <w:b/>
           <w:lang w:val="ar_AE" w:bidi="ar_AE"/>
         </w:rPr>
@@ -11788,6 +13472,22 @@
       </w:r>
       <w:r>
         <w:rPr>
+          <w:lang w:val="ar_AE" w:bidi="ar_AE"/>
+        </w:rPr>
+        <w:t>אֵ֖ת מוֹרָֽשֵׁי⁠הֶם</w:t>
+      </w:r>
+    </w:p>
+    <w:p>
+      <w:pPr>
+        <w:bidi/>
+      </w:pPr>
+      <w:r>
+        <w:rPr>
+          <w:lang w:val="ar_AE" w:bidi="ar_AE"/>
+        </w:rPr>
+      </w:r>
+      <w:r>
+        <w:rPr>
           <w:b/>
           <w:lang w:val="ar_AE" w:bidi="ar_AE"/>
         </w:rPr>
@@ -11885,6 +13585,22 @@
       </w:r>
       <w:r>
         <w:rPr>
+          <w:lang w:val="ar_AE" w:bidi="ar_AE"/>
+        </w:rPr>
+        <w:t>וְ⁠הָיָה֩ בֵית־יַעֲקֹ֨ב אֵ֜שׁ וּ⁠בֵ֧ית יוֹסֵ֣ף לֶהָבָ֗ה</w:t>
+      </w:r>
+    </w:p>
+    <w:p>
+      <w:pPr>
+        <w:bidi/>
+      </w:pPr>
+      <w:r>
+        <w:rPr>
+          <w:lang w:val="ar_AE" w:bidi="ar_AE"/>
+        </w:rPr>
+      </w:r>
+      <w:r>
+        <w:rPr>
           <w:b/>
           <w:lang w:val="ar_AE" w:bidi="ar_AE"/>
         </w:rPr>
@@ -11991,6 +13707,22 @@
       </w:r>
       <w:r>
         <w:rPr>
+          <w:lang w:val="ar_AE" w:bidi="ar_AE"/>
+        </w:rPr>
+        <w:t>בֵית־יַעֲקֹ֨ב</w:t>
+      </w:r>
+    </w:p>
+    <w:p>
+      <w:pPr>
+        <w:bidi/>
+      </w:pPr>
+      <w:r>
+        <w:rPr>
+          <w:lang w:val="ar_AE" w:bidi="ar_AE"/>
+        </w:rPr>
+      </w:r>
+      <w:r>
+        <w:rPr>
           <w:b/>
           <w:lang w:val="ar_AE" w:bidi="ar_AE"/>
         </w:rPr>
@@ -12110,6 +13842,22 @@
       </w:r>
       <w:r>
         <w:rPr>
+          <w:lang w:val="ar_AE" w:bidi="ar_AE"/>
+        </w:rPr>
+        <w:t>וּ⁠בֵ֧ית יוֹסֵ֣ף</w:t>
+      </w:r>
+    </w:p>
+    <w:p>
+      <w:pPr>
+        <w:bidi/>
+      </w:pPr>
+      <w:r>
+        <w:rPr>
+          <w:lang w:val="ar_AE" w:bidi="ar_AE"/>
+        </w:rPr>
+      </w:r>
+      <w:r>
+        <w:rPr>
           <w:b/>
           <w:lang w:val="ar_AE" w:bidi="ar_AE"/>
         </w:rPr>
@@ -12216,6 +13964,22 @@
       </w:r>
       <w:r>
         <w:rPr>
+          <w:lang w:val="ar_AE" w:bidi="ar_AE"/>
+        </w:rPr>
+        <w:t>וּ⁠בֵ֤ית עֵשָׂו֙ &amp; לְ⁠בֵ֣ית עֵשָׂ֔ו</w:t>
+      </w:r>
+    </w:p>
+    <w:p>
+      <w:pPr>
+        <w:bidi/>
+      </w:pPr>
+      <w:r>
+        <w:rPr>
+          <w:lang w:val="ar_AE" w:bidi="ar_AE"/>
+        </w:rPr>
+      </w:r>
+      <w:r>
+        <w:rPr>
           <w:b/>
           <w:lang w:val="ar_AE" w:bidi="ar_AE"/>
         </w:rPr>
@@ -12336,6 +14100,22 @@
       </w:r>
       <w:r>
         <w:rPr>
+          <w:lang w:val="ar_AE" w:bidi="ar_AE"/>
+        </w:rPr>
+        <w:t>אֵ֜שׁ &amp; לֶהָבָ֗ה &amp; לְ⁠קַ֔שׁ</w:t>
+      </w:r>
+    </w:p>
+    <w:p>
+      <w:pPr>
+        <w:bidi/>
+      </w:pPr>
+      <w:r>
+        <w:rPr>
+          <w:lang w:val="ar_AE" w:bidi="ar_AE"/>
+        </w:rPr>
+      </w:r>
+      <w:r>
+        <w:rPr>
           <w:b/>
           <w:lang w:val="ar_AE" w:bidi="ar_AE"/>
         </w:rPr>
@@ -12428,6 +14208,22 @@
       </w:r>
       <w:r>
         <w:rPr>
+          <w:lang w:val="ar_AE" w:bidi="ar_AE"/>
+        </w:rPr>
+        <w:t>לְ⁠קַ֔שׁ</w:t>
+      </w:r>
+    </w:p>
+    <w:p>
+      <w:pPr>
+        <w:bidi/>
+      </w:pPr>
+      <w:r>
+        <w:rPr>
+          <w:lang w:val="ar_AE" w:bidi="ar_AE"/>
+        </w:rPr>
+      </w:r>
+      <w:r>
+        <w:rPr>
           <w:b/>
           <w:lang w:val="ar_AE" w:bidi="ar_AE"/>
         </w:rPr>
@@ -12547,6 +14343,22 @@
       </w:r>
       <w:r>
         <w:rPr>
+          <w:lang w:val="ar_AE" w:bidi="ar_AE"/>
+        </w:rPr>
+        <w:t>וְ⁠דָלְק֥וּ בָ⁠הֶ֖ם וַ⁠אֲכָל֑וּ⁠ם</w:t>
+      </w:r>
+    </w:p>
+    <w:p>
+      <w:pPr>
+        <w:bidi/>
+      </w:pPr>
+      <w:r>
+        <w:rPr>
+          <w:lang w:val="ar_AE" w:bidi="ar_AE"/>
+        </w:rPr>
+      </w:r>
+      <w:r>
+        <w:rPr>
           <w:b/>
           <w:lang w:val="ar_AE" w:bidi="ar_AE"/>
         </w:rPr>
@@ -12679,6 +14491,22 @@
       </w:r>
       <w:r>
         <w:rPr>
+          <w:lang w:val="ar_AE" w:bidi="ar_AE"/>
+        </w:rPr>
+        <w:t>כִּ֥י</w:t>
+      </w:r>
+    </w:p>
+    <w:p>
+      <w:pPr>
+        <w:bidi/>
+      </w:pPr>
+      <w:r>
+        <w:rPr>
+          <w:lang w:val="ar_AE" w:bidi="ar_AE"/>
+        </w:rPr>
+      </w:r>
+      <w:r>
+        <w:rPr>
           <w:b/>
           <w:lang w:val="ar_AE" w:bidi="ar_AE"/>
         </w:rPr>
@@ -12785,6 +14613,22 @@
       </w:r>
       <w:r>
         <w:rPr>
+          <w:lang w:val="ar_AE" w:bidi="ar_AE"/>
+        </w:rPr>
+        <w:t>כִּ֥י יְהוָ֖ה דִּבֵּֽר</w:t>
+      </w:r>
+    </w:p>
+    <w:p>
+      <w:pPr>
+        <w:bidi/>
+      </w:pPr>
+      <w:r>
+        <w:rPr>
+          <w:lang w:val="ar_AE" w:bidi="ar_AE"/>
+        </w:rPr>
+      </w:r>
+      <w:r>
+        <w:rPr>
           <w:b/>
           <w:lang w:val="ar_AE" w:bidi="ar_AE"/>
         </w:rPr>
@@ -12891,6 +14735,22 @@
       </w:r>
       <w:r>
         <w:rPr>
+          <w:lang w:val="ar_AE" w:bidi="ar_AE"/>
+        </w:rPr>
+        <w:t>וְ⁠יָרְשׁ֨וּ</w:t>
+      </w:r>
+    </w:p>
+    <w:p>
+      <w:pPr>
+        <w:bidi/>
+      </w:pPr>
+      <w:r>
+        <w:rPr>
+          <w:lang w:val="ar_AE" w:bidi="ar_AE"/>
+        </w:rPr>
+      </w:r>
+      <w:r>
+        <w:rPr>
           <w:b/>
           <w:lang w:val="ar_AE" w:bidi="ar_AE"/>
         </w:rPr>
@@ -12975,6 +14835,22 @@
       </w:r>
       <w:r>
         <w:rPr>
+          <w:lang w:val="ar_AE" w:bidi="ar_AE"/>
+        </w:rPr>
+        <w:t>הַ⁠נֶּ֜גֶב</w:t>
+      </w:r>
+    </w:p>
+    <w:p>
+      <w:pPr>
+        <w:bidi/>
+      </w:pPr>
+      <w:r>
+        <w:rPr>
+          <w:lang w:val="ar_AE" w:bidi="ar_AE"/>
+        </w:rPr>
+      </w:r>
+      <w:r>
+        <w:rPr>
           <w:b/>
           <w:lang w:val="ar_AE" w:bidi="ar_AE"/>
         </w:rPr>
@@ -13088,6 +14964,22 @@
       </w:r>
       <w:r>
         <w:rPr>
+          <w:lang w:val="ar_AE" w:bidi="ar_AE"/>
+        </w:rPr>
+        <w:t>אֶת־הַ֣ר עֵשָׂ֗ו</w:t>
+      </w:r>
+    </w:p>
+    <w:p>
+      <w:pPr>
+        <w:bidi/>
+      </w:pPr>
+      <w:r>
+        <w:rPr>
+          <w:lang w:val="ar_AE" w:bidi="ar_AE"/>
+        </w:rPr>
+      </w:r>
+      <w:r>
+        <w:rPr>
           <w:b/>
           <w:lang w:val="ar_AE" w:bidi="ar_AE"/>
         </w:rPr>
@@ -13194,6 +15086,22 @@
       </w:r>
       <w:r>
         <w:rPr>
+          <w:lang w:val="ar_AE" w:bidi="ar_AE"/>
+        </w:rPr>
+        <w:t>וְ⁠הַ⁠שְּׁפֵלָה֙</w:t>
+      </w:r>
+    </w:p>
+    <w:p>
+      <w:pPr>
+        <w:bidi/>
+      </w:pPr>
+      <w:r>
+        <w:rPr>
+          <w:lang w:val="ar_AE" w:bidi="ar_AE"/>
+        </w:rPr>
+      </w:r>
+      <w:r>
+        <w:rPr>
           <w:b/>
           <w:lang w:val="ar_AE" w:bidi="ar_AE"/>
         </w:rPr>
@@ -13307,6 +15215,22 @@
       </w:r>
       <w:r>
         <w:rPr>
+          <w:lang w:val="ar_AE" w:bidi="ar_AE"/>
+        </w:rPr>
+        <w:t>וְ⁠הַ⁠שְּׁפֵלָה֙ אֶת־פְּלִשְׁתִּ֔ים</w:t>
+      </w:r>
+    </w:p>
+    <w:p>
+      <w:pPr>
+        <w:bidi/>
+      </w:pPr>
+      <w:r>
+        <w:rPr>
+          <w:lang w:val="ar_AE" w:bidi="ar_AE"/>
+        </w:rPr>
+      </w:r>
+      <w:r>
+        <w:rPr>
           <w:b/>
           <w:lang w:val="ar_AE" w:bidi="ar_AE"/>
         </w:rPr>
@@ -13426,6 +15350,22 @@
       </w:r>
       <w:r>
         <w:rPr>
+          <w:lang w:val="ar_AE" w:bidi="ar_AE"/>
+        </w:rPr>
+        <w:t>אֶת־פְּלִשְׁתִּ֔ים</w:t>
+      </w:r>
+    </w:p>
+    <w:p>
+      <w:pPr>
+        <w:bidi/>
+      </w:pPr>
+      <w:r>
+        <w:rPr>
+          <w:lang w:val="ar_AE" w:bidi="ar_AE"/>
+        </w:rPr>
+      </w:r>
+      <w:r>
+        <w:rPr>
           <w:b/>
           <w:lang w:val="ar_AE" w:bidi="ar_AE"/>
         </w:rPr>
@@ -13545,6 +15485,22 @@
       </w:r>
       <w:r>
         <w:rPr>
+          <w:lang w:val="ar_AE" w:bidi="ar_AE"/>
+        </w:rPr>
+        <w:t>וְ⁠יָרְשׁוּ֙</w:t>
+      </w:r>
+    </w:p>
+    <w:p>
+      <w:pPr>
+        <w:bidi/>
+      </w:pPr>
+      <w:r>
+        <w:rPr>
+          <w:lang w:val="ar_AE" w:bidi="ar_AE"/>
+        </w:rPr>
+      </w:r>
+      <w:r>
+        <w:rPr>
           <w:b/>
           <w:lang w:val="ar_AE" w:bidi="ar_AE"/>
         </w:rPr>
@@ -13629,6 +15585,22 @@
       </w:r>
       <w:r>
         <w:rPr>
+          <w:lang w:val="ar_AE" w:bidi="ar_AE"/>
+        </w:rPr>
+        <w:t>אֶת־שְׂדֵ֣ה אֶפְרַ֔יִם וְ⁠אֵ֖ת שְׂדֵ֣ה שֹׁמְר֑וֹן</w:t>
+      </w:r>
+    </w:p>
+    <w:p>
+      <w:pPr>
+        <w:bidi/>
+      </w:pPr>
+      <w:r>
+        <w:rPr>
+          <w:lang w:val="ar_AE" w:bidi="ar_AE"/>
+        </w:rPr>
+      </w:r>
+      <w:r>
+        <w:rPr>
           <w:b/>
           <w:lang w:val="ar_AE" w:bidi="ar_AE"/>
         </w:rPr>
@@ -13748,6 +15720,22 @@
       </w:r>
       <w:r>
         <w:rPr>
+          <w:lang w:val="ar_AE" w:bidi="ar_AE"/>
+        </w:rPr>
+        <w:t>וּ⁠בִנְיָמִ֖ן</w:t>
+      </w:r>
+    </w:p>
+    <w:p>
+      <w:pPr>
+        <w:bidi/>
+      </w:pPr>
+      <w:r>
+        <w:rPr>
+          <w:lang w:val="ar_AE" w:bidi="ar_AE"/>
+        </w:rPr>
+      </w:r>
+      <w:r>
+        <w:rPr>
           <w:b/>
           <w:lang w:val="ar_AE" w:bidi="ar_AE"/>
         </w:rPr>
@@ -13867,6 +15855,22 @@
       </w:r>
       <w:r>
         <w:rPr>
+          <w:lang w:val="ar_AE" w:bidi="ar_AE"/>
+        </w:rPr>
+        <w:t>וּ⁠בִנְיָמִ֖ן אֶת־הַ⁠גִּלְעָֽד</w:t>
+      </w:r>
+    </w:p>
+    <w:p>
+      <w:pPr>
+        <w:bidi/>
+      </w:pPr>
+      <w:r>
+        <w:rPr>
+          <w:lang w:val="ar_AE" w:bidi="ar_AE"/>
+        </w:rPr>
+      </w:r>
+      <w:r>
+        <w:rPr>
           <w:b/>
           <w:lang w:val="ar_AE" w:bidi="ar_AE"/>
         </w:rPr>
@@ -13986,6 +15990,22 @@
       </w:r>
       <w:r>
         <w:rPr>
+          <w:lang w:val="ar_AE" w:bidi="ar_AE"/>
+        </w:rPr>
+        <w:t>אֶת־הַ⁠גִּלְעָֽד</w:t>
+      </w:r>
+    </w:p>
+    <w:p>
+      <w:pPr>
+        <w:bidi/>
+      </w:pPr>
+      <w:r>
+        <w:rPr>
+          <w:lang w:val="ar_AE" w:bidi="ar_AE"/>
+        </w:rPr>
+      </w:r>
+      <w:r>
+        <w:rPr>
           <w:b/>
           <w:lang w:val="ar_AE" w:bidi="ar_AE"/>
         </w:rPr>
@@ -14085,6 +16105,22 @@
       </w:r>
       <w:r>
         <w:rPr>
+          <w:lang w:val="ar_AE" w:bidi="ar_AE"/>
+        </w:rPr>
+        <w:t>וְ⁠גָלֻ֣ת הַֽ⁠חֵל־הַ֠⁠זֶּה</w:t>
+      </w:r>
+    </w:p>
+    <w:p>
+      <w:pPr>
+        <w:bidi/>
+      </w:pPr>
+      <w:r>
+        <w:rPr>
+          <w:lang w:val="ar_AE" w:bidi="ar_AE"/>
+        </w:rPr>
+      </w:r>
+      <w:r>
+        <w:rPr>
           <w:b/>
           <w:lang w:val="ar_AE" w:bidi="ar_AE"/>
         </w:rPr>
@@ -14204,6 +16240,22 @@
       </w:r>
       <w:r>
         <w:rPr>
+          <w:lang w:val="ar_AE" w:bidi="ar_AE"/>
+        </w:rPr>
+        <w:t>הַֽ⁠חֵל</w:t>
+      </w:r>
+    </w:p>
+    <w:p>
+      <w:pPr>
+        <w:bidi/>
+      </w:pPr>
+      <w:r>
+        <w:rPr>
+          <w:lang w:val="ar_AE" w:bidi="ar_AE"/>
+        </w:rPr>
+      </w:r>
+      <w:r>
+        <w:rPr>
           <w:b/>
           <w:lang w:val="ar_AE" w:bidi="ar_AE"/>
         </w:rPr>
@@ -14287,6 +16339,22 @@
       </w:r>
       <w:r>
         <w:rPr>
+          <w:lang w:val="ar_AE" w:bidi="ar_AE"/>
+        </w:rPr>
+        <w:t>לִ⁠בְנֵ֨י יִשְׂרָאֵ֤ל</w:t>
+      </w:r>
+    </w:p>
+    <w:p>
+      <w:pPr>
+        <w:bidi/>
+      </w:pPr>
+      <w:r>
+        <w:rPr>
+          <w:lang w:val="ar_AE" w:bidi="ar_AE"/>
+        </w:rPr>
+      </w:r>
+      <w:r>
+        <w:rPr>
           <w:b/>
           <w:lang w:val="ar_AE" w:bidi="ar_AE"/>
         </w:rPr>
@@ -14445,6 +16513,22 @@
       </w:r>
       <w:r>
         <w:rPr>
+          <w:lang w:val="ar_AE" w:bidi="ar_AE"/>
+        </w:rPr>
+        <w:t>אֲשֶֽׁר־כְּנַעֲנִים֙</w:t>
+      </w:r>
+    </w:p>
+    <w:p>
+      <w:pPr>
+        <w:bidi/>
+      </w:pPr>
+      <w:r>
+        <w:rPr>
+          <w:lang w:val="ar_AE" w:bidi="ar_AE"/>
+        </w:rPr>
+      </w:r>
+      <w:r>
+        <w:rPr>
           <w:b/>
           <w:lang w:val="ar_AE" w:bidi="ar_AE"/>
         </w:rPr>
@@ -14551,6 +16635,22 @@
       </w:r>
       <w:r>
         <w:rPr>
+          <w:lang w:val="ar_AE" w:bidi="ar_AE"/>
+        </w:rPr>
+        <w:t>עַד־צָ֣רְפַ֔ת</w:t>
+      </w:r>
+    </w:p>
+    <w:p>
+      <w:pPr>
+        <w:bidi/>
+      </w:pPr>
+      <w:r>
+        <w:rPr>
+          <w:lang w:val="ar_AE" w:bidi="ar_AE"/>
+        </w:rPr>
+      </w:r>
+      <w:r>
+        <w:rPr>
           <w:b/>
           <w:lang w:val="ar_AE" w:bidi="ar_AE"/>
         </w:rPr>
@@ -14657,6 +16757,22 @@
       </w:r>
       <w:r>
         <w:rPr>
+          <w:lang w:val="ar_AE" w:bidi="ar_AE"/>
+        </w:rPr>
+        <w:t>עַד־צָ֣רְפַ֔ת</w:t>
+      </w:r>
+    </w:p>
+    <w:p>
+      <w:pPr>
+        <w:bidi/>
+      </w:pPr>
+      <w:r>
+        <w:rPr>
+          <w:lang w:val="ar_AE" w:bidi="ar_AE"/>
+        </w:rPr>
+      </w:r>
+      <w:r>
+        <w:rPr>
           <w:b/>
           <w:lang w:val="ar_AE" w:bidi="ar_AE"/>
         </w:rPr>
@@ -14761,6 +16877,22 @@
       </w:r>
       <w:r>
         <w:rPr>
+          <w:lang w:val="ar_AE" w:bidi="ar_AE"/>
+        </w:rPr>
+        <w:t>וְ⁠גָלֻ֥ת יְרוּשָׁלִַ֖ם</w:t>
+      </w:r>
+    </w:p>
+    <w:p>
+      <w:pPr>
+        <w:bidi/>
+      </w:pPr>
+      <w:r>
+        <w:rPr>
+          <w:lang w:val="ar_AE" w:bidi="ar_AE"/>
+        </w:rPr>
+      </w:r>
+      <w:r>
+        <w:rPr>
           <w:b/>
           <w:lang w:val="ar_AE" w:bidi="ar_AE"/>
         </w:rPr>
@@ -14880,6 +17012,22 @@
       </w:r>
       <w:r>
         <w:rPr>
+          <w:lang w:val="ar_AE" w:bidi="ar_AE"/>
+        </w:rPr>
+        <w:t>בִּ⁠סְפָרַ֑ד</w:t>
+      </w:r>
+    </w:p>
+    <w:p>
+      <w:pPr>
+        <w:bidi/>
+      </w:pPr>
+      <w:r>
+        <w:rPr>
+          <w:lang w:val="ar_AE" w:bidi="ar_AE"/>
+        </w:rPr>
+      </w:r>
+      <w:r>
+        <w:rPr>
           <w:b/>
           <w:lang w:val="ar_AE" w:bidi="ar_AE"/>
         </w:rPr>
@@ -14993,6 +17141,22 @@
       </w:r>
       <w:r>
         <w:rPr>
+          <w:lang w:val="ar_AE" w:bidi="ar_AE"/>
+        </w:rPr>
+        <w:t>יִֽרְשׁ֕וּ</w:t>
+      </w:r>
+    </w:p>
+    <w:p>
+      <w:pPr>
+        <w:bidi/>
+      </w:pPr>
+      <w:r>
+        <w:rPr>
+          <w:lang w:val="ar_AE" w:bidi="ar_AE"/>
+        </w:rPr>
+      </w:r>
+      <w:r>
+        <w:rPr>
           <w:b/>
           <w:lang w:val="ar_AE" w:bidi="ar_AE"/>
         </w:rPr>
@@ -15112,6 +17276,22 @@
       </w:r>
       <w:r>
         <w:rPr>
+          <w:lang w:val="ar_AE" w:bidi="ar_AE"/>
+        </w:rPr>
+        <w:t>הַ⁠נֶּֽגֶב</w:t>
+      </w:r>
+    </w:p>
+    <w:p>
+      <w:pPr>
+        <w:bidi/>
+      </w:pPr>
+      <w:r>
+        <w:rPr>
+          <w:lang w:val="ar_AE" w:bidi="ar_AE"/>
+        </w:rPr>
+      </w:r>
+      <w:r>
+        <w:rPr>
           <w:b/>
           <w:lang w:val="ar_AE" w:bidi="ar_AE"/>
         </w:rPr>
@@ -15154,7 +17334,7 @@
         </w:rPr>
         <w:t>هو اسم المنطقة الجنوبية من يهوذا، وهي منطقة جافة وصخرية وقاحلة. انظر كيف ترجمت هذا في العدد</w:t>
       </w:r>
-      <w:hyperlink r:id="rId20">
+      <w:hyperlink r:id="rId22">
         <w:r>
           <w:rPr>
             <w:lang w:val="ar_AE" w:bidi="ar_AE"/>
@@ -15243,6 +17423,22 @@
       </w:r>
       <w:r>
         <w:rPr>
+          <w:lang w:val="ar_AE" w:bidi="ar_AE"/>
+        </w:rPr>
+        <w:t>וְ⁠עָל֤וּ מֽוֹשִׁעִים֙ בְּ⁠הַ֣ר צִיּ֔וֹן לִ⁠שְׁפֹּ֖ט אֶת־הַ֣ר עֵשָׂ֑ו</w:t>
+      </w:r>
+    </w:p>
+    <w:p>
+      <w:pPr>
+        <w:bidi/>
+      </w:pPr>
+      <w:r>
+        <w:rPr>
+          <w:lang w:val="ar_AE" w:bidi="ar_AE"/>
+        </w:rPr>
+      </w:r>
+      <w:r>
+        <w:rPr>
           <w:b/>
           <w:lang w:val="ar_AE" w:bidi="ar_AE"/>
         </w:rPr>
@@ -15349,6 +17545,22 @@
       </w:r>
       <w:r>
         <w:rPr>
+          <w:lang w:val="ar_AE" w:bidi="ar_AE"/>
+        </w:rPr>
+        <w:t>מֽוֹשִׁעִים֙</w:t>
+      </w:r>
+    </w:p>
+    <w:p>
+      <w:pPr>
+        <w:bidi/>
+      </w:pPr>
+      <w:r>
+        <w:rPr>
+          <w:lang w:val="ar_AE" w:bidi="ar_AE"/>
+        </w:rPr>
+      </w:r>
+      <w:r>
+        <w:rPr>
           <w:b/>
           <w:lang w:val="ar_AE" w:bidi="ar_AE"/>
         </w:rPr>
@@ -15446,6 +17658,22 @@
       </w:r>
       <w:r>
         <w:rPr>
+          <w:lang w:val="ar_AE" w:bidi="ar_AE"/>
+        </w:rPr>
+        <w:t>בְּ⁠הַ֣ר צִיּ֔וֹן</w:t>
+      </w:r>
+    </w:p>
+    <w:p>
+      <w:pPr>
+        <w:bidi/>
+      </w:pPr>
+      <w:r>
+        <w:rPr>
+          <w:lang w:val="ar_AE" w:bidi="ar_AE"/>
+        </w:rPr>
+      </w:r>
+      <w:r>
+        <w:rPr>
           <w:b/>
           <w:lang w:val="ar_AE" w:bidi="ar_AE"/>
         </w:rPr>
@@ -15552,6 +17780,22 @@
       </w:r>
       <w:r>
         <w:rPr>
+          <w:lang w:val="ar_AE" w:bidi="ar_AE"/>
+        </w:rPr>
+        <w:t>אֶת־הַ֣ר עֵשָׂ֑ו</w:t>
+      </w:r>
+    </w:p>
+    <w:p>
+      <w:pPr>
+        <w:bidi/>
+      </w:pPr>
+      <w:r>
+        <w:rPr>
+          <w:lang w:val="ar_AE" w:bidi="ar_AE"/>
+        </w:rPr>
+      </w:r>
+      <w:r>
+        <w:rPr>
           <w:b/>
           <w:lang w:val="ar_AE" w:bidi="ar_AE"/>
         </w:rPr>
@@ -15645,6 +17889,22 @@
         <w:rPr>
           <w:lang w:val="ar_AE" w:bidi="ar_AE"/>
         </w:rPr>
+      </w:r>
+    </w:p>
+    <w:p>
+      <w:pPr>
+        <w:bidi/>
+      </w:pPr>
+      <w:r>
+        <w:rPr>
+          <w:lang w:val="ar_AE" w:bidi="ar_AE"/>
+        </w:rPr>
+      </w:r>
+      <w:r>
+        <w:rPr>
+          <w:lang w:val="ar_AE" w:bidi="ar_AE"/>
+        </w:rPr>
+        <w:t>וְ⁠הָיְתָ֥ה לַֽ⁠יהוָ֖ה הַ⁠מְּלוּכָֽה</w:t>
       </w:r>
     </w:p>
     <w:p>

</xml_diff>

<commit_message>
Updated Bible translation notes and resources for Arabic, French, Hindi, Portuguese, and other languages for 2026-03-31 release
</commit_message>
<xml_diff>
--- a/arb/docx/31.content.docx
+++ b/arb/docx/31.content.docx
@@ -584,6 +584,22 @@
       </w:r>
       <w:r>
         <w:rPr>
+          <w:lang w:val="ar_AE" w:bidi="ar_AE"/>
+        </w:rPr>
+        <w:t>יְהוִ֜ה</w:t>
+      </w:r>
+    </w:p>
+    <w:p>
+      <w:pPr>
+        <w:bidi/>
+      </w:pPr>
+      <w:r>
+        <w:rPr>
+          <w:lang w:val="ar_AE" w:bidi="ar_AE"/>
+        </w:rPr>
+      </w:r>
+      <w:r>
+        <w:rPr>
           <w:b/>
           <w:lang w:val="ar_AE" w:bidi="ar_AE"/>
         </w:rPr>
@@ -689,6 +705,22 @@
       </w:r>
       <w:r>
         <w:rPr>
+          <w:lang w:val="ar_AE" w:bidi="ar_AE"/>
+        </w:rPr>
+        <w:t>ק֛וּמוּ</w:t>
+      </w:r>
+    </w:p>
+    <w:p>
+      <w:pPr>
+        <w:bidi/>
+      </w:pPr>
+      <w:r>
+        <w:rPr>
+          <w:lang w:val="ar_AE" w:bidi="ar_AE"/>
+        </w:rPr>
+      </w:r>
+      <w:r>
+        <w:rPr>
           <w:b/>
           <w:lang w:val="ar_AE" w:bidi="ar_AE"/>
         </w:rPr>
@@ -1937,6 +1969,22 @@
       </w:r>
       <w:r>
         <w:rPr>
+          <w:lang w:val="ar_AE" w:bidi="ar_AE"/>
+        </w:rPr>
+        <w:t>הִנֵּ֥ה קָטֹ֛ן נְתַתִּ֖י⁠ךָ</w:t>
+      </w:r>
+    </w:p>
+    <w:p>
+      <w:pPr>
+        <w:bidi/>
+      </w:pPr>
+      <w:r>
+        <w:rPr>
+          <w:lang w:val="ar_AE" w:bidi="ar_AE"/>
+        </w:rPr>
+      </w:r>
+      <w:r>
+        <w:rPr>
           <w:b/>
           <w:lang w:val="ar_AE" w:bidi="ar_AE"/>
         </w:rPr>
@@ -2029,6 +2077,22 @@
       </w:r>
       <w:r>
         <w:rPr>
+          <w:lang w:val="ar_AE" w:bidi="ar_AE"/>
+        </w:rPr>
+        <w:t>הִנֵּ֥ה</w:t>
+      </w:r>
+    </w:p>
+    <w:p>
+      <w:pPr>
+        <w:bidi/>
+      </w:pPr>
+      <w:r>
+        <w:rPr>
+          <w:lang w:val="ar_AE" w:bidi="ar_AE"/>
+        </w:rPr>
+      </w:r>
+      <w:r>
+        <w:rPr>
           <w:b/>
           <w:lang w:val="ar_AE" w:bidi="ar_AE"/>
         </w:rPr>
@@ -2099,6 +2163,22 @@
       </w:r>
       <w:r>
         <w:rPr>
+          <w:lang w:val="ar_AE" w:bidi="ar_AE"/>
+        </w:rPr>
+        <w:t>קָטֹ֛ן נְתַתִּ֖י⁠ךָ בַּ⁠גּוֹיִ֑ם בָּז֥וּי אַתָּ֖ה מְאֹֽד</w:t>
+      </w:r>
+    </w:p>
+    <w:p>
+      <w:pPr>
+        <w:bidi/>
+      </w:pPr>
+      <w:r>
+        <w:rPr>
+          <w:lang w:val="ar_AE" w:bidi="ar_AE"/>
+        </w:rPr>
+      </w:r>
+      <w:r>
+        <w:rPr>
           <w:b/>
           <w:lang w:val="ar_AE" w:bidi="ar_AE"/>
         </w:rPr>
@@ -2191,6 +2271,22 @@
       </w:r>
       <w:r>
         <w:rPr>
+          <w:lang w:val="ar_AE" w:bidi="ar_AE"/>
+        </w:rPr>
+        <w:t>קָטֹ֛ן נְתַתִּ֖י⁠ךָ בַּ⁠גּוֹיִ֑ם</w:t>
+      </w:r>
+    </w:p>
+    <w:p>
+      <w:pPr>
+        <w:bidi/>
+      </w:pPr>
+      <w:r>
+        <w:rPr>
+          <w:lang w:val="ar_AE" w:bidi="ar_AE"/>
+        </w:rPr>
+      </w:r>
+      <w:r>
+        <w:rPr>
           <w:b/>
           <w:lang w:val="ar_AE" w:bidi="ar_AE"/>
         </w:rPr>
@@ -2283,6 +2379,22 @@
       </w:r>
       <w:r>
         <w:rPr>
+          <w:lang w:val="ar_AE" w:bidi="ar_AE"/>
+        </w:rPr>
+        <w:t>בָּז֥וּי אַתָּ֖ה מְאֹֽד</w:t>
+      </w:r>
+    </w:p>
+    <w:p>
+      <w:pPr>
+        <w:bidi/>
+      </w:pPr>
+      <w:r>
+        <w:rPr>
+          <w:lang w:val="ar_AE" w:bidi="ar_AE"/>
+        </w:rPr>
+      </w:r>
+      <w:r>
+        <w:rPr>
           <w:b/>
           <w:lang w:val="ar_AE" w:bidi="ar_AE"/>
         </w:rPr>
@@ -2375,6 +2487,22 @@
       </w:r>
       <w:r>
         <w:rPr>
+          <w:lang w:val="ar_AE" w:bidi="ar_AE"/>
+        </w:rPr>
+        <w:t>זְד֤וֹן לִבְּ⁠ךָ֙ הִשִּׁיאֶ֔⁠ךָ</w:t>
+      </w:r>
+    </w:p>
+    <w:p>
+      <w:pPr>
+        <w:bidi/>
+      </w:pPr>
+      <w:r>
+        <w:rPr>
+          <w:lang w:val="ar_AE" w:bidi="ar_AE"/>
+        </w:rPr>
+      </w:r>
+      <w:r>
+        <w:rPr>
           <w:b/>
           <w:lang w:val="ar_AE" w:bidi="ar_AE"/>
         </w:rPr>
@@ -2480,6 +2608,22 @@
       </w:r>
       <w:r>
         <w:rPr>
+          <w:lang w:val="ar_AE" w:bidi="ar_AE"/>
+        </w:rPr>
+        <w:t>זְד֤וֹן לִבְּ⁠ךָ֙ הִשִּׁיאֶ֔⁠ךָ</w:t>
+      </w:r>
+    </w:p>
+    <w:p>
+      <w:pPr>
+        <w:bidi/>
+      </w:pPr>
+      <w:r>
+        <w:rPr>
+          <w:lang w:val="ar_AE" w:bidi="ar_AE"/>
+        </w:rPr>
+      </w:r>
+      <w:r>
+        <w:rPr>
           <w:b/>
           <w:lang w:val="ar_AE" w:bidi="ar_AE"/>
         </w:rPr>
@@ -2585,6 +2729,22 @@
       </w:r>
       <w:r>
         <w:rPr>
+          <w:lang w:val="ar_AE" w:bidi="ar_AE"/>
+        </w:rPr>
+        <w:t>זְד֤וֹן לִבְּ⁠ךָ֙</w:t>
+      </w:r>
+    </w:p>
+    <w:p>
+      <w:pPr>
+        <w:bidi/>
+      </w:pPr>
+      <w:r>
+        <w:rPr>
+          <w:lang w:val="ar_AE" w:bidi="ar_AE"/>
+        </w:rPr>
+      </w:r>
+      <w:r>
+        <w:rPr>
           <w:b/>
           <w:lang w:val="ar_AE" w:bidi="ar_AE"/>
         </w:rPr>
@@ -2690,6 +2850,22 @@
       </w:r>
       <w:r>
         <w:rPr>
+          <w:lang w:val="ar_AE" w:bidi="ar_AE"/>
+        </w:rPr>
+        <w:t>זְד֤וֹן לִבְּ⁠ךָ֙</w:t>
+      </w:r>
+    </w:p>
+    <w:p>
+      <w:pPr>
+        <w:bidi/>
+      </w:pPr>
+      <w:r>
+        <w:rPr>
+          <w:lang w:val="ar_AE" w:bidi="ar_AE"/>
+        </w:rPr>
+      </w:r>
+      <w:r>
+        <w:rPr>
           <w:b/>
           <w:lang w:val="ar_AE" w:bidi="ar_AE"/>
         </w:rPr>
@@ -2795,6 +2971,22 @@
       </w:r>
       <w:r>
         <w:rPr>
+          <w:lang w:val="ar_AE" w:bidi="ar_AE"/>
+        </w:rPr>
+        <w:t>שֹׁכְנִ֥י בְ⁠חַגְוֵי־סֶּ֖לַע</w:t>
+      </w:r>
+    </w:p>
+    <w:p>
+      <w:pPr>
+        <w:bidi/>
+      </w:pPr>
+      <w:r>
+        <w:rPr>
+          <w:lang w:val="ar_AE" w:bidi="ar_AE"/>
+        </w:rPr>
+      </w:r>
+      <w:r>
+        <w:rPr>
           <w:b/>
           <w:lang w:val="ar_AE" w:bidi="ar_AE"/>
         </w:rPr>
@@ -2926,6 +3118,22 @@
       </w:r>
       <w:r>
         <w:rPr>
+          <w:lang w:val="ar_AE" w:bidi="ar_AE"/>
+        </w:rPr>
+        <w:t>בְ⁠חַגְוֵי־סֶּ֖לַע</w:t>
+      </w:r>
+    </w:p>
+    <w:p>
+      <w:pPr>
+        <w:bidi/>
+      </w:pPr>
+      <w:r>
+        <w:rPr>
+          <w:lang w:val="ar_AE" w:bidi="ar_AE"/>
+        </w:rPr>
+      </w:r>
+      <w:r>
+        <w:rPr>
           <w:b/>
           <w:lang w:val="ar_AE" w:bidi="ar_AE"/>
         </w:rPr>
@@ -2996,6 +3204,22 @@
       </w:r>
       <w:r>
         <w:rPr>
+          <w:lang w:val="ar_AE" w:bidi="ar_AE"/>
+        </w:rPr>
+        <w:t>אֹמֵ֣ר בְּ⁠לִבּ֔⁠וֹ</w:t>
+      </w:r>
+    </w:p>
+    <w:p>
+      <w:pPr>
+        <w:bidi/>
+      </w:pPr>
+      <w:r>
+        <w:rPr>
+          <w:lang w:val="ar_AE" w:bidi="ar_AE"/>
+        </w:rPr>
+      </w:r>
+      <w:r>
+        <w:rPr>
           <w:b/>
           <w:lang w:val="ar_AE" w:bidi="ar_AE"/>
         </w:rPr>
@@ -3127,6 +3351,22 @@
       </w:r>
       <w:r>
         <w:rPr>
+          <w:lang w:val="ar_AE" w:bidi="ar_AE"/>
+        </w:rPr>
+        <w:t>אֹמֵ֣ר בְּ⁠לִבּ֔⁠וֹ</w:t>
+      </w:r>
+    </w:p>
+    <w:p>
+      <w:pPr>
+        <w:bidi/>
+      </w:pPr>
+      <w:r>
+        <w:rPr>
+          <w:lang w:val="ar_AE" w:bidi="ar_AE"/>
+        </w:rPr>
+      </w:r>
+      <w:r>
+        <w:rPr>
           <w:b/>
           <w:lang w:val="ar_AE" w:bidi="ar_AE"/>
         </w:rPr>
@@ -3219,6 +3459,22 @@
       </w:r>
       <w:r>
         <w:rPr>
+          <w:lang w:val="ar_AE" w:bidi="ar_AE"/>
+        </w:rPr>
+        <w:t>מִ֥י יוֹרִדֵ֖⁠נִי אָֽרֶץ</w:t>
+      </w:r>
+    </w:p>
+    <w:p>
+      <w:pPr>
+        <w:bidi/>
+      </w:pPr>
+      <w:r>
+        <w:rPr>
+          <w:lang w:val="ar_AE" w:bidi="ar_AE"/>
+        </w:rPr>
+      </w:r>
+      <w:r>
+        <w:rPr>
           <w:b/>
           <w:lang w:val="ar_AE" w:bidi="ar_AE"/>
         </w:rPr>
@@ -3311,6 +3567,22 @@
       </w:r>
       <w:r>
         <w:rPr>
+          <w:lang w:val="ar_AE" w:bidi="ar_AE"/>
+        </w:rPr>
+        <w:t>אִם־תַּגְבִּ֣יהַּ כַּ⁠נֶּ֔שֶׁר וְ⁠אִם־בֵּ֥ין כּֽוֹכָבִ֖ים שִׂ֣ים קִנֶּ֑⁠ךָ</w:t>
+      </w:r>
+    </w:p>
+    <w:p>
+      <w:pPr>
+        <w:bidi/>
+      </w:pPr>
+      <w:r>
+        <w:rPr>
+          <w:lang w:val="ar_AE" w:bidi="ar_AE"/>
+        </w:rPr>
+      </w:r>
+      <w:r>
+        <w:rPr>
           <w:b/>
           <w:lang w:val="ar_AE" w:bidi="ar_AE"/>
         </w:rPr>
@@ -3403,6 +3675,22 @@
       </w:r>
       <w:r>
         <w:rPr>
+          <w:lang w:val="ar_AE" w:bidi="ar_AE"/>
+        </w:rPr>
+        <w:t>אִם־תַּגְבִּ֣יהַּ כַּ⁠נֶּ֔שֶׁר וְ⁠אִם־בֵּ֥ין כּֽוֹכָבִ֖ים שִׂ֣ים קִנֶּ֑⁠ךָ</w:t>
+      </w:r>
+    </w:p>
+    <w:p>
+      <w:pPr>
+        <w:bidi/>
+      </w:pPr>
+      <w:r>
+        <w:rPr>
+          <w:lang w:val="ar_AE" w:bidi="ar_AE"/>
+        </w:rPr>
+      </w:r>
+      <w:r>
+        <w:rPr>
           <w:b/>
           <w:lang w:val="ar_AE" w:bidi="ar_AE"/>
         </w:rPr>
@@ -3495,6 +3783,22 @@
       </w:r>
       <w:r>
         <w:rPr>
+          <w:lang w:val="ar_AE" w:bidi="ar_AE"/>
+        </w:rPr>
+        <w:t>שִׂ֣ים קִנֶּ֑⁠ךָ</w:t>
+      </w:r>
+    </w:p>
+    <w:p>
+      <w:pPr>
+        <w:bidi/>
+      </w:pPr>
+      <w:r>
+        <w:rPr>
+          <w:lang w:val="ar_AE" w:bidi="ar_AE"/>
+        </w:rPr>
+      </w:r>
+      <w:r>
+        <w:rPr>
           <w:b/>
           <w:lang w:val="ar_AE" w:bidi="ar_AE"/>
         </w:rPr>
@@ -3587,6 +3891,22 @@
       </w:r>
       <w:r>
         <w:rPr>
+          <w:lang w:val="ar_AE" w:bidi="ar_AE"/>
+        </w:rPr>
+        <w:t>מִ⁠שָּׁ֥ם אוֹרִֽידְ⁠ךָ֖</w:t>
+      </w:r>
+    </w:p>
+    <w:p>
+      <w:pPr>
+        <w:bidi/>
+      </w:pPr>
+      <w:r>
+        <w:rPr>
+          <w:lang w:val="ar_AE" w:bidi="ar_AE"/>
+        </w:rPr>
+      </w:r>
+      <w:r>
+        <w:rPr>
           <w:b/>
           <w:lang w:val="ar_AE" w:bidi="ar_AE"/>
         </w:rPr>
@@ -3692,6 +4012,22 @@
       </w:r>
       <w:r>
         <w:rPr>
+          <w:lang w:val="ar_AE" w:bidi="ar_AE"/>
+        </w:rPr>
+        <w:t>נְאֻם־יְהוָֽה</w:t>
+      </w:r>
+    </w:p>
+    <w:p>
+      <w:pPr>
+        <w:bidi/>
+      </w:pPr>
+      <w:r>
+        <w:rPr>
+          <w:lang w:val="ar_AE" w:bidi="ar_AE"/>
+        </w:rPr>
+      </w:r>
+      <w:r>
+        <w:rPr>
           <w:b/>
           <w:lang w:val="ar_AE" w:bidi="ar_AE"/>
         </w:rPr>
@@ -3784,6 +4120,22 @@
       </w:r>
       <w:r>
         <w:rPr>
+          <w:lang w:val="ar_AE" w:bidi="ar_AE"/>
+        </w:rPr>
+        <w:t>נְאֻם־יְהוָֽה</w:t>
+      </w:r>
+    </w:p>
+    <w:p>
+      <w:pPr>
+        <w:bidi/>
+      </w:pPr>
+      <w:r>
+        <w:rPr>
+          <w:lang w:val="ar_AE" w:bidi="ar_AE"/>
+        </w:rPr>
+      </w:r>
+      <w:r>
+        <w:rPr>
           <w:b/>
           <w:lang w:val="ar_AE" w:bidi="ar_AE"/>
         </w:rPr>
@@ -3889,6 +4241,22 @@
       </w:r>
       <w:r>
         <w:rPr>
+          <w:lang w:val="ar_AE" w:bidi="ar_AE"/>
+        </w:rPr>
+        <w:t>אִם־גַּנָּבִ֤ים בָּאֽוּ־לְ⁠ךָ֙ אִם־שׁ֣וֹדְדֵי לַ֔יְלָה</w:t>
+      </w:r>
+    </w:p>
+    <w:p>
+      <w:pPr>
+        <w:bidi/>
+      </w:pPr>
+      <w:r>
+        <w:rPr>
+          <w:lang w:val="ar_AE" w:bidi="ar_AE"/>
+        </w:rPr>
+      </w:r>
+      <w:r>
+        <w:rPr>
           <w:b/>
           <w:lang w:val="ar_AE" w:bidi="ar_AE"/>
         </w:rPr>
@@ -3981,6 +4349,22 @@
       </w:r>
       <w:r>
         <w:rPr>
+          <w:lang w:val="ar_AE" w:bidi="ar_AE"/>
+        </w:rPr>
+        <w:t>אֵ֣יךְ נִדְמֵ֔יתָה</w:t>
+      </w:r>
+    </w:p>
+    <w:p>
+      <w:pPr>
+        <w:bidi/>
+      </w:pPr>
+      <w:r>
+        <w:rPr>
+          <w:lang w:val="ar_AE" w:bidi="ar_AE"/>
+        </w:rPr>
+      </w:r>
+      <w:r>
+        <w:rPr>
           <w:b/>
           <w:lang w:val="ar_AE" w:bidi="ar_AE"/>
         </w:rPr>
@@ -4073,6 +4457,22 @@
       </w:r>
       <w:r>
         <w:rPr>
+          <w:lang w:val="ar_AE" w:bidi="ar_AE"/>
+        </w:rPr>
+        <w:t>אֵ֣יךְ נִדְמֵ֔יתָה</w:t>
+      </w:r>
+    </w:p>
+    <w:p>
+      <w:pPr>
+        <w:bidi/>
+      </w:pPr>
+      <w:r>
+        <w:rPr>
+          <w:lang w:val="ar_AE" w:bidi="ar_AE"/>
+        </w:rPr>
+      </w:r>
+      <w:r>
+        <w:rPr>
           <w:b/>
           <w:lang w:val="ar_AE" w:bidi="ar_AE"/>
         </w:rPr>
@@ -4165,6 +4565,22 @@
       </w:r>
       <w:r>
         <w:rPr>
+          <w:lang w:val="ar_AE" w:bidi="ar_AE"/>
+        </w:rPr>
+        <w:t>הֲ⁠ל֥וֹא יִגְנְב֖וּ דַּיָּ֑⁠ם</w:t>
+      </w:r>
+    </w:p>
+    <w:p>
+      <w:pPr>
+        <w:bidi/>
+      </w:pPr>
+      <w:r>
+        <w:rPr>
+          <w:lang w:val="ar_AE" w:bidi="ar_AE"/>
+        </w:rPr>
+      </w:r>
+      <w:r>
+        <w:rPr>
           <w:b/>
           <w:lang w:val="ar_AE" w:bidi="ar_AE"/>
         </w:rPr>
@@ -4257,6 +4673,22 @@
       </w:r>
       <w:r>
         <w:rPr>
+          <w:lang w:val="ar_AE" w:bidi="ar_AE"/>
+        </w:rPr>
+        <w:t>אִם־בֹּֽצְרִים֙ בָּ֣אוּ לָ֔⁠ךְ הֲ⁠ל֖וֹא יַשְׁאִ֥ירוּ עֹלֵלֽוֹת</w:t>
+      </w:r>
+    </w:p>
+    <w:p>
+      <w:pPr>
+        <w:bidi/>
+      </w:pPr>
+      <w:r>
+        <w:rPr>
+          <w:lang w:val="ar_AE" w:bidi="ar_AE"/>
+        </w:rPr>
+      </w:r>
+      <w:r>
+        <w:rPr>
           <w:b/>
           <w:lang w:val="ar_AE" w:bidi="ar_AE"/>
         </w:rPr>
@@ -4349,6 +4781,22 @@
       </w:r>
       <w:r>
         <w:rPr>
+          <w:lang w:val="ar_AE" w:bidi="ar_AE"/>
+        </w:rPr>
+        <w:t>אֵ֚יךְ</w:t>
+      </w:r>
+    </w:p>
+    <w:p>
+      <w:pPr>
+        <w:bidi/>
+      </w:pPr>
+      <w:r>
+        <w:rPr>
+          <w:lang w:val="ar_AE" w:bidi="ar_AE"/>
+        </w:rPr>
+      </w:r>
+      <w:r>
+        <w:rPr>
           <w:b/>
           <w:lang w:val="ar_AE" w:bidi="ar_AE"/>
         </w:rPr>
@@ -4454,6 +4902,22 @@
       </w:r>
       <w:r>
         <w:rPr>
+          <w:lang w:val="ar_AE" w:bidi="ar_AE"/>
+        </w:rPr>
+        <w:t>אֵ֚יךְ נֶחְפְּשׂ֣וּ עֵשָׂ֔ו</w:t>
+      </w:r>
+    </w:p>
+    <w:p>
+      <w:pPr>
+        <w:bidi/>
+      </w:pPr>
+      <w:r>
+        <w:rPr>
+          <w:lang w:val="ar_AE" w:bidi="ar_AE"/>
+        </w:rPr>
+      </w:r>
+      <w:r>
+        <w:rPr>
           <w:b/>
           <w:lang w:val="ar_AE" w:bidi="ar_AE"/>
         </w:rPr>
@@ -4546,6 +5010,22 @@
       </w:r>
       <w:r>
         <w:rPr>
+          <w:lang w:val="ar_AE" w:bidi="ar_AE"/>
+        </w:rPr>
+        <w:t>עֵשָׂ֔ו</w:t>
+      </w:r>
+    </w:p>
+    <w:p>
+      <w:pPr>
+        <w:bidi/>
+      </w:pPr>
+      <w:r>
+        <w:rPr>
+          <w:lang w:val="ar_AE" w:bidi="ar_AE"/>
+        </w:rPr>
+      </w:r>
+      <w:r>
+        <w:rPr>
           <w:b/>
           <w:lang w:val="ar_AE" w:bidi="ar_AE"/>
         </w:rPr>
@@ -4651,6 +5131,22 @@
       </w:r>
       <w:r>
         <w:rPr>
+          <w:lang w:val="ar_AE" w:bidi="ar_AE"/>
+        </w:rPr>
+        <w:t>נֶחְפְּשׂ֣וּ</w:t>
+      </w:r>
+    </w:p>
+    <w:p>
+      <w:pPr>
+        <w:bidi/>
+      </w:pPr>
+      <w:r>
+        <w:rPr>
+          <w:lang w:val="ar_AE" w:bidi="ar_AE"/>
+        </w:rPr>
+      </w:r>
+      <w:r>
+        <w:rPr>
           <w:b/>
           <w:lang w:val="ar_AE" w:bidi="ar_AE"/>
         </w:rPr>
@@ -4734,6 +5230,22 @@
       </w:r>
       <w:r>
         <w:rPr>
+          <w:lang w:val="ar_AE" w:bidi="ar_AE"/>
+        </w:rPr>
+        <w:t>נִבְע֖וּ מַצְפֻּנָֽי⁠ו</w:t>
+      </w:r>
+    </w:p>
+    <w:p>
+      <w:pPr>
+        <w:bidi/>
+      </w:pPr>
+      <w:r>
+        <w:rPr>
+          <w:lang w:val="ar_AE" w:bidi="ar_AE"/>
+        </w:rPr>
+      </w:r>
+      <w:r>
+        <w:rPr>
           <w:b/>
           <w:lang w:val="ar_AE" w:bidi="ar_AE"/>
         </w:rPr>
@@ -4826,6 +5338,22 @@
       </w:r>
       <w:r>
         <w:rPr>
+          <w:lang w:val="ar_AE" w:bidi="ar_AE"/>
+        </w:rPr>
+        <w:t>עַֽד־הַ⁠גְּב֣וּל שִׁלְּח֗וּ⁠ךָ כֹּ֚ל אַנְשֵׁ֣י בְרִיתֶ֔⁠ךָ</w:t>
+      </w:r>
+    </w:p>
+    <w:p>
+      <w:pPr>
+        <w:bidi/>
+      </w:pPr>
+      <w:r>
+        <w:rPr>
+          <w:lang w:val="ar_AE" w:bidi="ar_AE"/>
+        </w:rPr>
+      </w:r>
+      <w:r>
+        <w:rPr>
           <w:b/>
           <w:lang w:val="ar_AE" w:bidi="ar_AE"/>
         </w:rPr>
@@ -4931,6 +5459,22 @@
       </w:r>
       <w:r>
         <w:rPr>
+          <w:lang w:val="ar_AE" w:bidi="ar_AE"/>
+        </w:rPr>
+        <w:t>בְרִיתֶ֔⁠ךָ</w:t>
+      </w:r>
+    </w:p>
+    <w:p>
+      <w:pPr>
+        <w:bidi/>
+      </w:pPr>
+      <w:r>
+        <w:rPr>
+          <w:lang w:val="ar_AE" w:bidi="ar_AE"/>
+        </w:rPr>
+      </w:r>
+      <w:r>
+        <w:rPr>
           <w:b/>
           <w:lang w:val="ar_AE" w:bidi="ar_AE"/>
         </w:rPr>
@@ -5036,6 +5580,22 @@
       </w:r>
       <w:r>
         <w:rPr>
+          <w:lang w:val="ar_AE" w:bidi="ar_AE"/>
+        </w:rPr>
+        <w:t>עַֽד־הַ⁠גְּב֣וּל שִׁלְּח֗וּ⁠ךָ</w:t>
+      </w:r>
+    </w:p>
+    <w:p>
+      <w:pPr>
+        <w:bidi/>
+      </w:pPr>
+      <w:r>
+        <w:rPr>
+          <w:lang w:val="ar_AE" w:bidi="ar_AE"/>
+        </w:rPr>
+      </w:r>
+      <w:r>
+        <w:rPr>
           <w:b/>
           <w:lang w:val="ar_AE" w:bidi="ar_AE"/>
         </w:rPr>
@@ -5119,6 +5679,22 @@
       </w:r>
       <w:r>
         <w:rPr>
+          <w:lang w:val="ar_AE" w:bidi="ar_AE"/>
+        </w:rPr>
+        <w:t>כֹּ֚ל אַנְשֵׁ֣י בְרִיתֶ֔⁠ךָ &amp; אַנְשֵׁ֣י שְׁלֹמֶ֑⁠ךָ לַחְמְ⁠ךָ֗</w:t>
+      </w:r>
+    </w:p>
+    <w:p>
+      <w:pPr>
+        <w:bidi/>
+      </w:pPr>
+      <w:r>
+        <w:rPr>
+          <w:lang w:val="ar_AE" w:bidi="ar_AE"/>
+        </w:rPr>
+      </w:r>
+      <w:r>
+        <w:rPr>
           <w:b/>
           <w:lang w:val="ar_AE" w:bidi="ar_AE"/>
         </w:rPr>
@@ -5237,6 +5813,22 @@
       </w:r>
       <w:r>
         <w:rPr>
+          <w:lang w:val="ar_AE" w:bidi="ar_AE"/>
+        </w:rPr>
+        <w:t>לַחְמְ⁠ךָ֗ יָשִׂ֤ימוּ מָזוֹר֙ תַּחְתֶּ֔י⁠ךָ</w:t>
+      </w:r>
+    </w:p>
+    <w:p>
+      <w:pPr>
+        <w:bidi/>
+      </w:pPr>
+      <w:r>
+        <w:rPr>
+          <w:lang w:val="ar_AE" w:bidi="ar_AE"/>
+        </w:rPr>
+      </w:r>
+      <w:r>
+        <w:rPr>
           <w:b/>
           <w:lang w:val="ar_AE" w:bidi="ar_AE"/>
         </w:rPr>
@@ -5355,6 +5947,22 @@
       </w:r>
       <w:r>
         <w:rPr>
+          <w:lang w:val="ar_AE" w:bidi="ar_AE"/>
+        </w:rPr>
+        <w:t>אֵ֥ין תְּבוּנָ֖ה בּֽ⁠וֹ</w:t>
+      </w:r>
+    </w:p>
+    <w:p>
+      <w:pPr>
+        <w:bidi/>
+      </w:pPr>
+      <w:r>
+        <w:rPr>
+          <w:lang w:val="ar_AE" w:bidi="ar_AE"/>
+        </w:rPr>
+      </w:r>
+      <w:r>
+        <w:rPr>
           <w:b/>
           <w:lang w:val="ar_AE" w:bidi="ar_AE"/>
         </w:rPr>
@@ -5461,6 +6069,22 @@
       </w:r>
       <w:r>
         <w:rPr>
+          <w:lang w:val="ar_AE" w:bidi="ar_AE"/>
+        </w:rPr>
+        <w:t>אֵ֥ין תְּבוּנָ֖ה בּֽ⁠וֹ</w:t>
+      </w:r>
+    </w:p>
+    <w:p>
+      <w:pPr>
+        <w:bidi/>
+      </w:pPr>
+      <w:r>
+        <w:rPr>
+          <w:lang w:val="ar_AE" w:bidi="ar_AE"/>
+        </w:rPr>
+      </w:r>
+      <w:r>
+        <w:rPr>
           <w:b/>
           <w:lang w:val="ar_AE" w:bidi="ar_AE"/>
         </w:rPr>
@@ -5566,6 +6190,22 @@
       </w:r>
       <w:r>
         <w:rPr>
+          <w:lang w:val="ar_AE" w:bidi="ar_AE"/>
+        </w:rPr>
+        <w:t>בּֽ⁠וֹ</w:t>
+      </w:r>
+    </w:p>
+    <w:p>
+      <w:pPr>
+        <w:bidi/>
+      </w:pPr>
+      <w:r>
+        <w:rPr>
+          <w:lang w:val="ar_AE" w:bidi="ar_AE"/>
+        </w:rPr>
+      </w:r>
+      <w:r>
+        <w:rPr>
           <w:b/>
           <w:lang w:val="ar_AE" w:bidi="ar_AE"/>
         </w:rPr>
@@ -5671,6 +6311,22 @@
       </w:r>
       <w:r>
         <w:rPr>
+          <w:lang w:val="ar_AE" w:bidi="ar_AE"/>
+        </w:rPr>
+        <w:t>הֲ⁠ל֛וֹא בַּ⁠יּ֥וֹם הַ⁠ה֖וּא &amp; וְ⁠הַאֲבַדְתִּ֤י חֲכָמִים֙ מֵֽ⁠אֱד֔וֹם</w:t>
+      </w:r>
+    </w:p>
+    <w:p>
+      <w:pPr>
+        <w:bidi/>
+      </w:pPr>
+      <w:r>
+        <w:rPr>
+          <w:lang w:val="ar_AE" w:bidi="ar_AE"/>
+        </w:rPr>
+      </w:r>
+      <w:r>
+        <w:rPr>
           <w:b/>
           <w:lang w:val="ar_AE" w:bidi="ar_AE"/>
         </w:rPr>
@@ -5763,6 +6419,22 @@
       </w:r>
       <w:r>
         <w:rPr>
+          <w:lang w:val="ar_AE" w:bidi="ar_AE"/>
+        </w:rPr>
+        <w:t>וְ⁠הַאֲבַדְתִּ֤י חֲכָמִים֙ מֵֽ⁠אֱד֔וֹם</w:t>
+      </w:r>
+    </w:p>
+    <w:p>
+      <w:pPr>
+        <w:bidi/>
+      </w:pPr>
+      <w:r>
+        <w:rPr>
+          <w:lang w:val="ar_AE" w:bidi="ar_AE"/>
+        </w:rPr>
+      </w:r>
+      <w:r>
+        <w:rPr>
           <w:b/>
           <w:lang w:val="ar_AE" w:bidi="ar_AE"/>
         </w:rPr>
@@ -5868,6 +6540,22 @@
       </w:r>
       <w:r>
         <w:rPr>
+          <w:lang w:val="ar_AE" w:bidi="ar_AE"/>
+        </w:rPr>
+        <w:t>וּ⁠תְבוּנָ֖ה מֵ⁠הַ֥ר עֵשָֽׂו</w:t>
+      </w:r>
+    </w:p>
+    <w:p>
+      <w:pPr>
+        <w:bidi/>
+      </w:pPr>
+      <w:r>
+        <w:rPr>
+          <w:lang w:val="ar_AE" w:bidi="ar_AE"/>
+        </w:rPr>
+      </w:r>
+      <w:r>
+        <w:rPr>
           <w:b/>
           <w:lang w:val="ar_AE" w:bidi="ar_AE"/>
         </w:rPr>
@@ -5960,6 +6648,22 @@
       </w:r>
       <w:r>
         <w:rPr>
+          <w:lang w:val="ar_AE" w:bidi="ar_AE"/>
+        </w:rPr>
+        <w:t>וּ⁠תְבוּנָ֖ה מֵ⁠הַ֥ר עֵשָֽׂו</w:t>
+      </w:r>
+    </w:p>
+    <w:p>
+      <w:pPr>
+        <w:bidi/>
+      </w:pPr>
+      <w:r>
+        <w:rPr>
+          <w:lang w:val="ar_AE" w:bidi="ar_AE"/>
+        </w:rPr>
+      </w:r>
+      <w:r>
+        <w:rPr>
           <w:b/>
           <w:lang w:val="ar_AE" w:bidi="ar_AE"/>
         </w:rPr>
@@ -6065,6 +6769,22 @@
       </w:r>
       <w:r>
         <w:rPr>
+          <w:lang w:val="ar_AE" w:bidi="ar_AE"/>
+        </w:rPr>
+        <w:t>חֲכָמִים֙ מֵֽ⁠אֱד֔וֹם וּ⁠תְבוּנָ֖ה מֵ⁠הַ֥ר עֵשָֽׂו</w:t>
+      </w:r>
+    </w:p>
+    <w:p>
+      <w:pPr>
+        <w:bidi/>
+      </w:pPr>
+      <w:r>
+        <w:rPr>
+          <w:lang w:val="ar_AE" w:bidi="ar_AE"/>
+        </w:rPr>
+      </w:r>
+      <w:r>
+        <w:rPr>
           <w:b/>
           <w:lang w:val="ar_AE" w:bidi="ar_AE"/>
         </w:rPr>
@@ -6209,6 +6929,22 @@
       </w:r>
       <w:r>
         <w:rPr>
+          <w:lang w:val="ar_AE" w:bidi="ar_AE"/>
+        </w:rPr>
+        <w:t>וּ⁠תְבוּנָ֖ה</w:t>
+      </w:r>
+    </w:p>
+    <w:p>
+      <w:pPr>
+        <w:bidi/>
+      </w:pPr>
+      <w:r>
+        <w:rPr>
+          <w:lang w:val="ar_AE" w:bidi="ar_AE"/>
+        </w:rPr>
+      </w:r>
+      <w:r>
+        <w:rPr>
           <w:b/>
           <w:lang w:val="ar_AE" w:bidi="ar_AE"/>
         </w:rPr>
@@ -6314,6 +7050,22 @@
       </w:r>
       <w:r>
         <w:rPr>
+          <w:lang w:val="ar_AE" w:bidi="ar_AE"/>
+        </w:rPr>
+        <w:t>מֵ⁠הַ֥ר עֵשָֽׂו</w:t>
+      </w:r>
+    </w:p>
+    <w:p>
+      <w:pPr>
+        <w:bidi/>
+      </w:pPr>
+      <w:r>
+        <w:rPr>
+          <w:lang w:val="ar_AE" w:bidi="ar_AE"/>
+        </w:rPr>
+      </w:r>
+      <w:r>
+        <w:rPr>
           <w:b/>
           <w:lang w:val="ar_AE" w:bidi="ar_AE"/>
         </w:rPr>
@@ -6406,6 +7158,22 @@
         <w:rPr>
           <w:lang w:val="ar_AE" w:bidi="ar_AE"/>
         </w:rPr>
+      </w:r>
+    </w:p>
+    <w:p>
+      <w:pPr>
+        <w:bidi/>
+      </w:pPr>
+      <w:r>
+        <w:rPr>
+          <w:lang w:val="ar_AE" w:bidi="ar_AE"/>
+        </w:rPr>
+      </w:r>
+      <w:r>
+        <w:rPr>
+          <w:lang w:val="ar_AE" w:bidi="ar_AE"/>
+        </w:rPr>
+        <w:t>עֵשָֽׂו</w:t>
       </w:r>
     </w:p>
     <w:p>
@@ -6529,6 +7297,22 @@
       </w:r>
       <w:r>
         <w:rPr>
+          <w:lang w:val="ar_AE" w:bidi="ar_AE"/>
+        </w:rPr>
+        <w:t>וְ⁠חַתּ֥וּ גִבּוֹרֶ֖י⁠ךָ תֵּימָ֑ן</w:t>
+      </w:r>
+    </w:p>
+    <w:p>
+      <w:pPr>
+        <w:bidi/>
+      </w:pPr>
+      <w:r>
+        <w:rPr>
+          <w:lang w:val="ar_AE" w:bidi="ar_AE"/>
+        </w:rPr>
+      </w:r>
+      <w:r>
+        <w:rPr>
           <w:b/>
           <w:lang w:val="ar_AE" w:bidi="ar_AE"/>
         </w:rPr>
@@ -6634,6 +7418,22 @@
       </w:r>
       <w:r>
         <w:rPr>
+          <w:lang w:val="ar_AE" w:bidi="ar_AE"/>
+        </w:rPr>
+        <w:t>תֵּימָ֑ן</w:t>
+      </w:r>
+    </w:p>
+    <w:p>
+      <w:pPr>
+        <w:bidi/>
+      </w:pPr>
+      <w:r>
+        <w:rPr>
+          <w:lang w:val="ar_AE" w:bidi="ar_AE"/>
+        </w:rPr>
+      </w:r>
+      <w:r>
+        <w:rPr>
           <w:b/>
           <w:lang w:val="ar_AE" w:bidi="ar_AE"/>
         </w:rPr>
@@ -6726,6 +7526,22 @@
       </w:r>
       <w:r>
         <w:rPr>
+          <w:lang w:val="ar_AE" w:bidi="ar_AE"/>
+        </w:rPr>
+        <w:t>לְמַ֧עַן</w:t>
+      </w:r>
+    </w:p>
+    <w:p>
+      <w:pPr>
+        <w:bidi/>
+      </w:pPr>
+      <w:r>
+        <w:rPr>
+          <w:lang w:val="ar_AE" w:bidi="ar_AE"/>
+        </w:rPr>
+      </w:r>
+      <w:r>
+        <w:rPr>
           <w:b/>
           <w:lang w:val="ar_AE" w:bidi="ar_AE"/>
         </w:rPr>
@@ -6818,6 +7634,22 @@
       </w:r>
       <w:r>
         <w:rPr>
+          <w:lang w:val="ar_AE" w:bidi="ar_AE"/>
+        </w:rPr>
+        <w:t>יִכָּֽרֶת־אִ֛ישׁ</w:t>
+      </w:r>
+    </w:p>
+    <w:p>
+      <w:pPr>
+        <w:bidi/>
+      </w:pPr>
+      <w:r>
+        <w:rPr>
+          <w:lang w:val="ar_AE" w:bidi="ar_AE"/>
+        </w:rPr>
+      </w:r>
+      <w:r>
+        <w:rPr>
           <w:b/>
           <w:lang w:val="ar_AE" w:bidi="ar_AE"/>
         </w:rPr>
@@ -6923,6 +7755,22 @@
       </w:r>
       <w:r>
         <w:rPr>
+          <w:lang w:val="ar_AE" w:bidi="ar_AE"/>
+        </w:rPr>
+        <w:t>יִכָּֽרֶת־אִ֛ישׁ</w:t>
+      </w:r>
+    </w:p>
+    <w:p>
+      <w:pPr>
+        <w:bidi/>
+      </w:pPr>
+      <w:r>
+        <w:rPr>
+          <w:lang w:val="ar_AE" w:bidi="ar_AE"/>
+        </w:rPr>
+      </w:r>
+      <w:r>
+        <w:rPr>
           <w:b/>
           <w:lang w:val="ar_AE" w:bidi="ar_AE"/>
         </w:rPr>
@@ -7029,6 +7877,22 @@
       </w:r>
       <w:r>
         <w:rPr>
+          <w:lang w:val="ar_AE" w:bidi="ar_AE"/>
+        </w:rPr>
+        <w:t>אִ֛ישׁ</w:t>
+      </w:r>
+    </w:p>
+    <w:p>
+      <w:pPr>
+        <w:bidi/>
+      </w:pPr>
+      <w:r>
+        <w:rPr>
+          <w:lang w:val="ar_AE" w:bidi="ar_AE"/>
+        </w:rPr>
+      </w:r>
+      <w:r>
+        <w:rPr>
           <w:b/>
           <w:lang w:val="ar_AE" w:bidi="ar_AE"/>
         </w:rPr>
@@ -7142,6 +8006,22 @@
       </w:r>
       <w:r>
         <w:rPr>
+          <w:lang w:val="ar_AE" w:bidi="ar_AE"/>
+        </w:rPr>
+        <w:t>מֵ⁠הַ֥ר עֵשָׂ֖ו</w:t>
+      </w:r>
+    </w:p>
+    <w:p>
+      <w:pPr>
+        <w:bidi/>
+      </w:pPr>
+      <w:r>
+        <w:rPr>
+          <w:lang w:val="ar_AE" w:bidi="ar_AE"/>
+        </w:rPr>
+      </w:r>
+      <w:r>
+        <w:rPr>
           <w:b/>
           <w:lang w:val="ar_AE" w:bidi="ar_AE"/>
         </w:rPr>
@@ -7248,6 +8128,22 @@
       </w:r>
       <w:r>
         <w:rPr>
+          <w:lang w:val="ar_AE" w:bidi="ar_AE"/>
+        </w:rPr>
+        <w:t>מִ⁠קָּֽטֶל</w:t>
+      </w:r>
+    </w:p>
+    <w:p>
+      <w:pPr>
+        <w:bidi/>
+      </w:pPr>
+      <w:r>
+        <w:rPr>
+          <w:lang w:val="ar_AE" w:bidi="ar_AE"/>
+        </w:rPr>
+      </w:r>
+      <w:r>
+        <w:rPr>
           <w:b/>
           <w:lang w:val="ar_AE" w:bidi="ar_AE"/>
         </w:rPr>
@@ -7459,6 +8355,22 @@
       </w:r>
       <w:r>
         <w:rPr>
+          <w:lang w:val="ar_AE" w:bidi="ar_AE"/>
+        </w:rPr>
+        <w:t>אָחִ֥י⁠ךָ</w:t>
+      </w:r>
+    </w:p>
+    <w:p>
+      <w:pPr>
+        <w:bidi/>
+      </w:pPr>
+      <w:r>
+        <w:rPr>
+          <w:lang w:val="ar_AE" w:bidi="ar_AE"/>
+        </w:rPr>
+      </w:r>
+      <w:r>
+        <w:rPr>
           <w:b/>
           <w:lang w:val="ar_AE" w:bidi="ar_AE"/>
         </w:rPr>
@@ -7578,6 +8490,22 @@
       </w:r>
       <w:r>
         <w:rPr>
+          <w:lang w:val="ar_AE" w:bidi="ar_AE"/>
+        </w:rPr>
+        <w:t>יַעֲקֹ֖ב</w:t>
+      </w:r>
+    </w:p>
+    <w:p>
+      <w:pPr>
+        <w:bidi/>
+      </w:pPr>
+      <w:r>
+        <w:rPr>
+          <w:lang w:val="ar_AE" w:bidi="ar_AE"/>
+        </w:rPr>
+      </w:r>
+      <w:r>
+        <w:rPr>
           <w:b/>
           <w:lang w:val="ar_AE" w:bidi="ar_AE"/>
         </w:rPr>
@@ -7697,6 +8625,22 @@
       </w:r>
       <w:r>
         <w:rPr>
+          <w:lang w:val="ar_AE" w:bidi="ar_AE"/>
+        </w:rPr>
+        <w:t>תְּכַסְּ⁠ךָ֣ בוּשָׁ֑ה</w:t>
+      </w:r>
+    </w:p>
+    <w:p>
+      <w:pPr>
+        <w:bidi/>
+      </w:pPr>
+      <w:r>
+        <w:rPr>
+          <w:lang w:val="ar_AE" w:bidi="ar_AE"/>
+        </w:rPr>
+      </w:r>
+      <w:r>
+        <w:rPr>
           <w:b/>
           <w:lang w:val="ar_AE" w:bidi="ar_AE"/>
         </w:rPr>
@@ -7816,6 +8760,22 @@
       </w:r>
       <w:r>
         <w:rPr>
+          <w:lang w:val="ar_AE" w:bidi="ar_AE"/>
+        </w:rPr>
+        <w:t>תְּכַסְּ⁠ךָ֣ בוּשָׁ֑ה</w:t>
+      </w:r>
+    </w:p>
+    <w:p>
+      <w:pPr>
+        <w:bidi/>
+      </w:pPr>
+      <w:r>
+        <w:rPr>
+          <w:lang w:val="ar_AE" w:bidi="ar_AE"/>
+        </w:rPr>
+      </w:r>
+      <w:r>
+        <w:rPr>
           <w:b/>
           <w:lang w:val="ar_AE" w:bidi="ar_AE"/>
         </w:rPr>
@@ -7935,6 +8895,22 @@
       </w:r>
       <w:r>
         <w:rPr>
+          <w:lang w:val="ar_AE" w:bidi="ar_AE"/>
+        </w:rPr>
+        <w:t>וְ⁠נִכְרַ֖תָּ</w:t>
+      </w:r>
+    </w:p>
+    <w:p>
+      <w:pPr>
+        <w:bidi/>
+      </w:pPr>
+      <w:r>
+        <w:rPr>
+          <w:lang w:val="ar_AE" w:bidi="ar_AE"/>
+        </w:rPr>
+      </w:r>
+      <w:r>
+        <w:rPr>
           <w:b/>
           <w:lang w:val="ar_AE" w:bidi="ar_AE"/>
         </w:rPr>
@@ -8041,6 +9017,22 @@
       </w:r>
       <w:r>
         <w:rPr>
+          <w:lang w:val="ar_AE" w:bidi="ar_AE"/>
+        </w:rPr>
+        <w:t>וְ⁠נִכְרַ֖תָּ</w:t>
+      </w:r>
+    </w:p>
+    <w:p>
+      <w:pPr>
+        <w:bidi/>
+      </w:pPr>
+      <w:r>
+        <w:rPr>
+          <w:lang w:val="ar_AE" w:bidi="ar_AE"/>
+        </w:rPr>
+      </w:r>
+      <w:r>
+        <w:rPr>
           <w:b/>
           <w:lang w:val="ar_AE" w:bidi="ar_AE"/>
         </w:rPr>
@@ -8120,6 +9112,22 @@
         <w:rPr>
           <w:lang w:val="ar_AE" w:bidi="ar_AE"/>
         </w:rPr>
+      </w:r>
+    </w:p>
+    <w:p>
+      <w:pPr>
+        <w:bidi/>
+      </w:pPr>
+      <w:r>
+        <w:rPr>
+          <w:lang w:val="ar_AE" w:bidi="ar_AE"/>
+        </w:rPr>
+      </w:r>
+      <w:r>
+        <w:rPr>
+          <w:lang w:val="ar_AE" w:bidi="ar_AE"/>
+        </w:rPr>
+        <w:t>וְ⁠נִכְרַ֖תָּ</w:t>
       </w:r>
     </w:p>
     <w:p>
@@ -8256,6 +9264,22 @@
       </w:r>
       <w:r>
         <w:rPr>
+          <w:lang w:val="ar_AE" w:bidi="ar_AE"/>
+        </w:rPr>
+        <w:t>עֲמָֽדְ⁠ךָ֣ מִ⁠נֶּ֔גֶד</w:t>
+      </w:r>
+    </w:p>
+    <w:p>
+      <w:pPr>
+        <w:bidi/>
+      </w:pPr>
+      <w:r>
+        <w:rPr>
+          <w:lang w:val="ar_AE" w:bidi="ar_AE"/>
+        </w:rPr>
+      </w:r>
+      <w:r>
+        <w:rPr>
           <w:b/>
           <w:lang w:val="ar_AE" w:bidi="ar_AE"/>
         </w:rPr>
@@ -8349,6 +9373,22 @@
         <w:rPr>
           <w:lang w:val="ar_AE" w:bidi="ar_AE"/>
         </w:rPr>
+      </w:r>
+    </w:p>
+    <w:p>
+      <w:pPr>
+        <w:bidi/>
+      </w:pPr>
+      <w:r>
+        <w:rPr>
+          <w:lang w:val="ar_AE" w:bidi="ar_AE"/>
+        </w:rPr>
+      </w:r>
+      <w:r>
+        <w:rPr>
+          <w:lang w:val="ar_AE" w:bidi="ar_AE"/>
+        </w:rPr>
+        <w:t>שְׁב֥וֹת זָרִ֖ים חֵיל֑⁠וֹ וְ⁠נָכְרִ֞ים בָּ֣אוּ שְׁעָרָ֗יו</w:t>
       </w:r>
     </w:p>
     <w:p>
@@ -8605,6 +9645,22 @@
       </w:r>
       <w:r>
         <w:rPr>
+          <w:lang w:val="ar_AE" w:bidi="ar_AE"/>
+        </w:rPr>
+        <w:t>חֵיל֑⁠וֹ</w:t>
+      </w:r>
+    </w:p>
+    <w:p>
+      <w:pPr>
+        <w:bidi/>
+      </w:pPr>
+      <w:r>
+        <w:rPr>
+          <w:lang w:val="ar_AE" w:bidi="ar_AE"/>
+        </w:rPr>
+      </w:r>
+      <w:r>
+        <w:rPr>
           <w:b/>
           <w:lang w:val="ar_AE" w:bidi="ar_AE"/>
         </w:rPr>
@@ -8720,6 +9776,22 @@
       </w:r>
       <w:r>
         <w:rPr>
+          <w:lang w:val="ar_AE" w:bidi="ar_AE"/>
+        </w:rPr>
+        <w:t>שְׁעָרָ֗יו</w:t>
+      </w:r>
+    </w:p>
+    <w:p>
+      <w:pPr>
+        <w:bidi/>
+      </w:pPr>
+      <w:r>
+        <w:rPr>
+          <w:lang w:val="ar_AE" w:bidi="ar_AE"/>
+        </w:rPr>
+      </w:r>
+      <w:r>
+        <w:rPr>
           <w:b/>
           <w:lang w:val="ar_AE" w:bidi="ar_AE"/>
         </w:rPr>
@@ -8839,6 +9911,22 @@
       </w:r>
       <w:r>
         <w:rPr>
+          <w:lang w:val="ar_AE" w:bidi="ar_AE"/>
+        </w:rPr>
+        <w:t>וְ⁠עַל־יְרוּשָׁלִַ֨ם֙ יַדּ֣וּ גוֹרָ֔ל</w:t>
+      </w:r>
+    </w:p>
+    <w:p>
+      <w:pPr>
+        <w:bidi/>
+      </w:pPr>
+      <w:r>
+        <w:rPr>
+          <w:lang w:val="ar_AE" w:bidi="ar_AE"/>
+        </w:rPr>
+      </w:r>
+      <w:r>
+        <w:rPr>
           <w:b/>
           <w:lang w:val="ar_AE" w:bidi="ar_AE"/>
         </w:rPr>
@@ -8971,6 +10059,22 @@
       </w:r>
       <w:r>
         <w:rPr>
+          <w:lang w:val="ar_AE" w:bidi="ar_AE"/>
+        </w:rPr>
+        <w:t>גַּם־אַתָּ֖ה כְּ⁠אַחַ֥ד מֵ⁠הֶֽם</w:t>
+      </w:r>
+    </w:p>
+    <w:p>
+      <w:pPr>
+        <w:bidi/>
+      </w:pPr>
+      <w:r>
+        <w:rPr>
+          <w:lang w:val="ar_AE" w:bidi="ar_AE"/>
+        </w:rPr>
+      </w:r>
+      <w:r>
+        <w:rPr>
           <w:b/>
           <w:lang w:val="ar_AE" w:bidi="ar_AE"/>
         </w:rPr>
@@ -9103,6 +10207,22 @@
       </w:r>
       <w:r>
         <w:rPr>
+          <w:lang w:val="ar_AE" w:bidi="ar_AE"/>
+        </w:rPr>
+        <w:t>וְ⁠אַל &amp; וְ⁠אַל &amp; וְ⁠אַל</w:t>
+      </w:r>
+    </w:p>
+    <w:p>
+      <w:pPr>
+        <w:bidi/>
+      </w:pPr>
+      <w:r>
+        <w:rPr>
+          <w:lang w:val="ar_AE" w:bidi="ar_AE"/>
+        </w:rPr>
+      </w:r>
+      <w:r>
+        <w:rPr>
           <w:b/>
           <w:lang w:val="ar_AE" w:bidi="ar_AE"/>
         </w:rPr>
@@ -9222,6 +10342,22 @@
       </w:r>
       <w:r>
         <w:rPr>
+          <w:lang w:val="ar_AE" w:bidi="ar_AE"/>
+        </w:rPr>
+        <w:t>וְ⁠אַל־תֵּ֤רֶא</w:t>
+      </w:r>
+    </w:p>
+    <w:p>
+      <w:pPr>
+        <w:bidi/>
+      </w:pPr>
+      <w:r>
+        <w:rPr>
+          <w:lang w:val="ar_AE" w:bidi="ar_AE"/>
+        </w:rPr>
+      </w:r>
+      <w:r>
+        <w:rPr>
           <w:b/>
           <w:lang w:val="ar_AE" w:bidi="ar_AE"/>
         </w:rPr>
@@ -9341,6 +10477,22 @@
       </w:r>
       <w:r>
         <w:rPr>
+          <w:lang w:val="ar_AE" w:bidi="ar_AE"/>
+        </w:rPr>
+        <w:t>בְ⁠יוֹם־אָחִ֨י⁠ךָ֙ בְּ⁠י֣וֹם נָכְר֔⁠וֹ</w:t>
+      </w:r>
+    </w:p>
+    <w:p>
+      <w:pPr>
+        <w:bidi/>
+      </w:pPr>
+      <w:r>
+        <w:rPr>
+          <w:lang w:val="ar_AE" w:bidi="ar_AE"/>
+        </w:rPr>
+      </w:r>
+      <w:r>
+        <w:rPr>
           <w:b/>
           <w:lang w:val="ar_AE" w:bidi="ar_AE"/>
         </w:rPr>
@@ -9473,6 +10625,22 @@
       </w:r>
       <w:r>
         <w:rPr>
+          <w:lang w:val="ar_AE" w:bidi="ar_AE"/>
+        </w:rPr>
+        <w:t>בְ⁠יוֹם</w:t>
+      </w:r>
+    </w:p>
+    <w:p>
+      <w:pPr>
+        <w:bidi/>
+      </w:pPr>
+      <w:r>
+        <w:rPr>
+          <w:lang w:val="ar_AE" w:bidi="ar_AE"/>
+        </w:rPr>
+      </w:r>
+      <w:r>
+        <w:rPr>
           <w:b/>
           <w:lang w:val="ar_AE" w:bidi="ar_AE"/>
         </w:rPr>
@@ -9579,6 +10747,22 @@
         <w:rPr>
           <w:lang w:val="ar_AE" w:bidi="ar_AE"/>
         </w:rPr>
+      </w:r>
+    </w:p>
+    <w:p>
+      <w:pPr>
+        <w:bidi/>
+      </w:pPr>
+      <w:r>
+        <w:rPr>
+          <w:lang w:val="ar_AE" w:bidi="ar_AE"/>
+        </w:rPr>
+      </w:r>
+      <w:r>
+        <w:rPr>
+          <w:lang w:val="ar_AE" w:bidi="ar_AE"/>
+        </w:rPr>
+        <w:t>אָחִ֨י⁠ךָ֙</w:t>
       </w:r>
     </w:p>
     <w:p>
@@ -9729,6 +10913,22 @@
       </w:r>
       <w:r>
         <w:rPr>
+          <w:lang w:val="ar_AE" w:bidi="ar_AE"/>
+        </w:rPr>
+        <w:t>לִ⁠בְנֵֽי־יְהוּדָ֖ה</w:t>
+      </w:r>
+    </w:p>
+    <w:p>
+      <w:pPr>
+        <w:bidi/>
+      </w:pPr>
+      <w:r>
+        <w:rPr>
+          <w:lang w:val="ar_AE" w:bidi="ar_AE"/>
+        </w:rPr>
+      </w:r>
+      <w:r>
+        <w:rPr>
           <w:b/>
           <w:lang w:val="ar_AE" w:bidi="ar_AE"/>
         </w:rPr>
@@ -9848,6 +11048,22 @@
       </w:r>
       <w:r>
         <w:rPr>
+          <w:lang w:val="ar_AE" w:bidi="ar_AE"/>
+        </w:rPr>
+        <w:t>וְ⁠אַל־תַּגְדֵּ֥ל פִּ֖י⁠ךָ</w:t>
+      </w:r>
+    </w:p>
+    <w:p>
+      <w:pPr>
+        <w:bidi/>
+      </w:pPr>
+      <w:r>
+        <w:rPr>
+          <w:lang w:val="ar_AE" w:bidi="ar_AE"/>
+        </w:rPr>
+      </w:r>
+      <w:r>
+        <w:rPr>
           <w:b/>
           <w:lang w:val="ar_AE" w:bidi="ar_AE"/>
         </w:rPr>
@@ -9954,6 +11170,22 @@
       </w:r>
       <w:r>
         <w:rPr>
+          <w:lang w:val="ar_AE" w:bidi="ar_AE"/>
+        </w:rPr>
+        <w:t>בְּ⁠י֣וֹם אֵידָ֔⁠ם &amp; בְּ⁠י֣וֹם אֵיד֑⁠וֹ &amp; בְּ⁠י֥וֹם אֵידֽ⁠וֹ</w:t>
+      </w:r>
+    </w:p>
+    <w:p>
+      <w:pPr>
+        <w:bidi/>
+      </w:pPr>
+      <w:r>
+        <w:rPr>
+          <w:lang w:val="ar_AE" w:bidi="ar_AE"/>
+        </w:rPr>
+      </w:r>
+      <w:r>
+        <w:rPr>
           <w:b/>
           <w:lang w:val="ar_AE" w:bidi="ar_AE"/>
         </w:rPr>
@@ -10060,6 +11292,22 @@
         <w:rPr>
           <w:lang w:val="ar_AE" w:bidi="ar_AE"/>
         </w:rPr>
+      </w:r>
+    </w:p>
+    <w:p>
+      <w:pPr>
+        <w:bidi/>
+      </w:pPr>
+      <w:r>
+        <w:rPr>
+          <w:lang w:val="ar_AE" w:bidi="ar_AE"/>
+        </w:rPr>
+      </w:r>
+      <w:r>
+        <w:rPr>
+          <w:lang w:val="ar_AE" w:bidi="ar_AE"/>
+        </w:rPr>
+        <w:t>אֵידָ֔⁠ם &amp; אֵיד֑⁠וֹ &amp; אֵידֽ⁠וֹ</w:t>
       </w:r>
     </w:p>
     <w:p>
@@ -10236,6 +11484,22 @@
       </w:r>
       <w:r>
         <w:rPr>
+          <w:lang w:val="ar_AE" w:bidi="ar_AE"/>
+        </w:rPr>
+        <w:t>גַם־אַתָּ֛ה</w:t>
+      </w:r>
+    </w:p>
+    <w:p>
+      <w:pPr>
+        <w:bidi/>
+      </w:pPr>
+      <w:r>
+        <w:rPr>
+          <w:lang w:val="ar_AE" w:bidi="ar_AE"/>
+        </w:rPr>
+      </w:r>
+      <w:r>
+        <w:rPr>
           <w:b/>
           <w:lang w:val="ar_AE" w:bidi="ar_AE"/>
         </w:rPr>
@@ -10329,6 +11593,22 @@
         <w:rPr>
           <w:lang w:val="ar_AE" w:bidi="ar_AE"/>
         </w:rPr>
+      </w:r>
+    </w:p>
+    <w:p>
+      <w:pPr>
+        <w:bidi/>
+      </w:pPr>
+      <w:r>
+        <w:rPr>
+          <w:lang w:val="ar_AE" w:bidi="ar_AE"/>
+        </w:rPr>
+      </w:r>
+      <w:r>
+        <w:rPr>
+          <w:lang w:val="ar_AE" w:bidi="ar_AE"/>
+        </w:rPr>
+        <w:t>אַל־תֵּ֧רֶא</w:t>
       </w:r>
     </w:p>
     <w:p>
@@ -10479,6 +11759,22 @@
       </w:r>
       <w:r>
         <w:rPr>
+          <w:lang w:val="ar_AE" w:bidi="ar_AE"/>
+        </w:rPr>
+        <w:t>וְ⁠אַל־תִּשְׁלַ֥חְנָה בְ⁠חֵיל֖⁠וֹ</w:t>
+      </w:r>
+    </w:p>
+    <w:p>
+      <w:pPr>
+        <w:bidi/>
+      </w:pPr>
+      <w:r>
+        <w:rPr>
+          <w:lang w:val="ar_AE" w:bidi="ar_AE"/>
+        </w:rPr>
+      </w:r>
+      <w:r>
+        <w:rPr>
           <w:b/>
           <w:lang w:val="ar_AE" w:bidi="ar_AE"/>
         </w:rPr>
@@ -10585,6 +11881,22 @@
       </w:r>
       <w:r>
         <w:rPr>
+          <w:lang w:val="ar_AE" w:bidi="ar_AE"/>
+        </w:rPr>
+        <w:t>הַ⁠פֶּ֔רֶק</w:t>
+      </w:r>
+    </w:p>
+    <w:p>
+      <w:pPr>
+        <w:bidi/>
+      </w:pPr>
+      <w:r>
+        <w:rPr>
+          <w:lang w:val="ar_AE" w:bidi="ar_AE"/>
+        </w:rPr>
+      </w:r>
+      <w:r>
+        <w:rPr>
           <w:b/>
           <w:lang w:val="ar_AE" w:bidi="ar_AE"/>
         </w:rPr>
@@ -10685,6 +11997,22 @@
         <w:rPr>
           <w:lang w:val="ar_AE" w:bidi="ar_AE"/>
         </w:rPr>
+      </w:r>
+    </w:p>
+    <w:p>
+      <w:pPr>
+        <w:bidi/>
+      </w:pPr>
+      <w:r>
+        <w:rPr>
+          <w:lang w:val="ar_AE" w:bidi="ar_AE"/>
+        </w:rPr>
+      </w:r>
+      <w:r>
+        <w:rPr>
+          <w:lang w:val="ar_AE" w:bidi="ar_AE"/>
+        </w:rPr>
+        <w:t>לְ⁠הַכְרִ֖ית</w:t>
       </w:r>
     </w:p>
     <w:p>
@@ -10835,6 +12163,22 @@
       </w:r>
       <w:r>
         <w:rPr>
+          <w:lang w:val="ar_AE" w:bidi="ar_AE"/>
+        </w:rPr>
+        <w:t>וְ⁠אַל־תַּסְגֵּ֥ר שְׂרִידָ֖י⁠ו</w:t>
+      </w:r>
+    </w:p>
+    <w:p>
+      <w:pPr>
+        <w:bidi/>
+      </w:pPr>
+      <w:r>
+        <w:rPr>
+          <w:lang w:val="ar_AE" w:bidi="ar_AE"/>
+        </w:rPr>
+      </w:r>
+      <w:r>
+        <w:rPr>
           <w:b/>
           <w:lang w:val="ar_AE" w:bidi="ar_AE"/>
         </w:rPr>
@@ -11025,6 +12369,22 @@
       </w:r>
       <w:r>
         <w:rPr>
+          <w:lang w:val="ar_AE" w:bidi="ar_AE"/>
+        </w:rPr>
+        <w:t>כִּֽי־קָר֥וֹב יוֹם־יְהוָ֖ה עַל־כָּל־הַ⁠גּוֹיִ֑ם</w:t>
+      </w:r>
+    </w:p>
+    <w:p>
+      <w:pPr>
+        <w:bidi/>
+      </w:pPr>
+      <w:r>
+        <w:rPr>
+          <w:lang w:val="ar_AE" w:bidi="ar_AE"/>
+        </w:rPr>
+      </w:r>
+      <w:r>
+        <w:rPr>
           <w:b/>
           <w:lang w:val="ar_AE" w:bidi="ar_AE"/>
         </w:rPr>
@@ -11117,6 +12477,22 @@
       </w:r>
       <w:r>
         <w:rPr>
+          <w:lang w:val="ar_AE" w:bidi="ar_AE"/>
+        </w:rPr>
+        <w:t>יוֹם־יְהוָ֖ה</w:t>
+      </w:r>
+    </w:p>
+    <w:p>
+      <w:pPr>
+        <w:bidi/>
+      </w:pPr>
+      <w:r>
+        <w:rPr>
+          <w:lang w:val="ar_AE" w:bidi="ar_AE"/>
+        </w:rPr>
+      </w:r>
+      <w:r>
+        <w:rPr>
           <w:b/>
           <w:lang w:val="ar_AE" w:bidi="ar_AE"/>
         </w:rPr>
@@ -11236,6 +12612,22 @@
       </w:r>
       <w:r>
         <w:rPr>
+          <w:lang w:val="ar_AE" w:bidi="ar_AE"/>
+        </w:rPr>
+        <w:t>קָר֥וֹב</w:t>
+      </w:r>
+    </w:p>
+    <w:p>
+      <w:pPr>
+        <w:bidi/>
+      </w:pPr>
+      <w:r>
+        <w:rPr>
+          <w:lang w:val="ar_AE" w:bidi="ar_AE"/>
+        </w:rPr>
+      </w:r>
+      <w:r>
+        <w:rPr>
           <w:b/>
           <w:lang w:val="ar_AE" w:bidi="ar_AE"/>
         </w:rPr>
@@ -11333,6 +12725,22 @@
       </w:r>
       <w:r>
         <w:rPr>
+          <w:lang w:val="ar_AE" w:bidi="ar_AE"/>
+        </w:rPr>
+        <w:t>יֵעָ֣שֶׂה לָּ֔⁠ךְ</w:t>
+      </w:r>
+    </w:p>
+    <w:p>
+      <w:pPr>
+        <w:bidi/>
+      </w:pPr>
+      <w:r>
+        <w:rPr>
+          <w:lang w:val="ar_AE" w:bidi="ar_AE"/>
+        </w:rPr>
+      </w:r>
+      <w:r>
+        <w:rPr>
           <w:b/>
           <w:lang w:val="ar_AE" w:bidi="ar_AE"/>
         </w:rPr>
@@ -11439,6 +12847,22 @@
       </w:r>
       <w:r>
         <w:rPr>
+          <w:lang w:val="ar_AE" w:bidi="ar_AE"/>
+        </w:rPr>
+        <w:t>גְּמֻלְ⁠ךָ֖ יָשׁ֥וּב בְּ⁠רֹאשֶֽׁ⁠ךָ</w:t>
+      </w:r>
+    </w:p>
+    <w:p>
+      <w:pPr>
+        <w:bidi/>
+      </w:pPr>
+      <w:r>
+        <w:rPr>
+          <w:lang w:val="ar_AE" w:bidi="ar_AE"/>
+        </w:rPr>
+      </w:r>
+      <w:r>
+        <w:rPr>
           <w:b/>
           <w:lang w:val="ar_AE" w:bidi="ar_AE"/>
         </w:rPr>
@@ -11545,6 +12969,22 @@
       </w:r>
       <w:r>
         <w:rPr>
+          <w:lang w:val="ar_AE" w:bidi="ar_AE"/>
+        </w:rPr>
+        <w:t>בְּ⁠רֹאשֶֽׁ⁠ךָ</w:t>
+      </w:r>
+    </w:p>
+    <w:p>
+      <w:pPr>
+        <w:bidi/>
+      </w:pPr>
+      <w:r>
+        <w:rPr>
+          <w:lang w:val="ar_AE" w:bidi="ar_AE"/>
+        </w:rPr>
+      </w:r>
+      <w:r>
+        <w:rPr>
           <w:b/>
           <w:lang w:val="ar_AE" w:bidi="ar_AE"/>
         </w:rPr>
@@ -11664,6 +13104,22 @@
       </w:r>
       <w:r>
         <w:rPr>
+          <w:lang w:val="ar_AE" w:bidi="ar_AE"/>
+        </w:rPr>
+        <w:t>כִּ֗י כַּֽ⁠אֲשֶׁ֤ר שְׁתִיתֶם֙</w:t>
+      </w:r>
+    </w:p>
+    <w:p>
+      <w:pPr>
+        <w:bidi/>
+      </w:pPr>
+      <w:r>
+        <w:rPr>
+          <w:lang w:val="ar_AE" w:bidi="ar_AE"/>
+        </w:rPr>
+      </w:r>
+      <w:r>
+        <w:rPr>
           <w:b/>
           <w:lang w:val="ar_AE" w:bidi="ar_AE"/>
         </w:rPr>
@@ -11756,6 +13212,22 @@
       </w:r>
       <w:r>
         <w:rPr>
+          <w:lang w:val="ar_AE" w:bidi="ar_AE"/>
+        </w:rPr>
+        <w:t>כַּֽ⁠אֲשֶׁ֤ר שְׁתִיתֶם֙</w:t>
+      </w:r>
+    </w:p>
+    <w:p>
+      <w:pPr>
+        <w:bidi/>
+      </w:pPr>
+      <w:r>
+        <w:rPr>
+          <w:lang w:val="ar_AE" w:bidi="ar_AE"/>
+        </w:rPr>
+      </w:r>
+      <w:r>
+        <w:rPr>
           <w:b/>
           <w:lang w:val="ar_AE" w:bidi="ar_AE"/>
         </w:rPr>
@@ -11861,6 +13333,22 @@
       </w:r>
       <w:r>
         <w:rPr>
+          <w:lang w:val="ar_AE" w:bidi="ar_AE"/>
+        </w:rPr>
+        <w:t>שְׁתִיתֶם֙</w:t>
+      </w:r>
+    </w:p>
+    <w:p>
+      <w:pPr>
+        <w:bidi/>
+      </w:pPr>
+      <w:r>
+        <w:rPr>
+          <w:lang w:val="ar_AE" w:bidi="ar_AE"/>
+        </w:rPr>
+      </w:r>
+      <w:r>
+        <w:rPr>
           <w:b/>
           <w:lang w:val="ar_AE" w:bidi="ar_AE"/>
         </w:rPr>
@@ -11967,6 +13455,22 @@
       </w:r>
       <w:r>
         <w:rPr>
+          <w:lang w:val="ar_AE" w:bidi="ar_AE"/>
+        </w:rPr>
+        <w:t>עַל־הַ֣ר קָדְשִׁ֔⁠י</w:t>
+      </w:r>
+    </w:p>
+    <w:p>
+      <w:pPr>
+        <w:bidi/>
+      </w:pPr>
+      <w:r>
+        <w:rPr>
+          <w:lang w:val="ar_AE" w:bidi="ar_AE"/>
+        </w:rPr>
+      </w:r>
+      <w:r>
+        <w:rPr>
           <w:b/>
           <w:lang w:val="ar_AE" w:bidi="ar_AE"/>
         </w:rPr>
@@ -12086,6 +13590,22 @@
       </w:r>
       <w:r>
         <w:rPr>
+          <w:lang w:val="ar_AE" w:bidi="ar_AE"/>
+        </w:rPr>
+        <w:t>יִשְׁתּ֥וּ כָֽל־הַ⁠גּוֹיִ֖ם תָּמִ֑יד</w:t>
+      </w:r>
+    </w:p>
+    <w:p>
+      <w:pPr>
+        <w:bidi/>
+      </w:pPr>
+      <w:r>
+        <w:rPr>
+          <w:lang w:val="ar_AE" w:bidi="ar_AE"/>
+        </w:rPr>
+      </w:r>
+      <w:r>
+        <w:rPr>
           <w:b/>
           <w:lang w:val="ar_AE" w:bidi="ar_AE"/>
         </w:rPr>
@@ -12205,6 +13725,22 @@
       </w:r>
       <w:r>
         <w:rPr>
+          <w:lang w:val="ar_AE" w:bidi="ar_AE"/>
+        </w:rPr>
+        <w:t>וְ⁠שָׁת֣וּ וְ⁠לָע֔וּ</w:t>
+      </w:r>
+    </w:p>
+    <w:p>
+      <w:pPr>
+        <w:bidi/>
+      </w:pPr>
+      <w:r>
+        <w:rPr>
+          <w:lang w:val="ar_AE" w:bidi="ar_AE"/>
+        </w:rPr>
+      </w:r>
+      <w:r>
+        <w:rPr>
           <w:b/>
           <w:lang w:val="ar_AE" w:bidi="ar_AE"/>
         </w:rPr>
@@ -12337,6 +13873,22 @@
       </w:r>
       <w:r>
         <w:rPr>
+          <w:lang w:val="ar_AE" w:bidi="ar_AE"/>
+        </w:rPr>
+        <w:t>וְ⁠שָׁת֣וּ וְ⁠לָע֔וּ</w:t>
+      </w:r>
+    </w:p>
+    <w:p>
+      <w:pPr>
+        <w:bidi/>
+      </w:pPr>
+      <w:r>
+        <w:rPr>
+          <w:lang w:val="ar_AE" w:bidi="ar_AE"/>
+        </w:rPr>
+      </w:r>
+      <w:r>
+        <w:rPr>
           <w:b/>
           <w:lang w:val="ar_AE" w:bidi="ar_AE"/>
         </w:rPr>
@@ -12442,6 +13994,22 @@
         <w:rPr>
           <w:lang w:val="ar_AE" w:bidi="ar_AE"/>
         </w:rPr>
+      </w:r>
+    </w:p>
+    <w:p>
+      <w:pPr>
+        <w:bidi/>
+      </w:pPr>
+      <w:r>
+        <w:rPr>
+          <w:lang w:val="ar_AE" w:bidi="ar_AE"/>
+        </w:rPr>
+      </w:r>
+      <w:r>
+        <w:rPr>
+          <w:lang w:val="ar_AE" w:bidi="ar_AE"/>
+        </w:rPr>
+        <w:t>וּ⁠בְ⁠הַ֥ר צִיּ֛וֹן תִּהְיֶ֥ה פְלֵיטָ֖ה</w:t>
       </w:r>
     </w:p>
     <w:p>
@@ -12592,6 +14160,22 @@
       </w:r>
       <w:r>
         <w:rPr>
+          <w:lang w:val="ar_AE" w:bidi="ar_AE"/>
+        </w:rPr>
+        <w:t>וּ⁠בְ⁠הַ֥ר צִיּ֛וֹן</w:t>
+      </w:r>
+    </w:p>
+    <w:p>
+      <w:pPr>
+        <w:bidi/>
+      </w:pPr>
+      <w:r>
+        <w:rPr>
+          <w:lang w:val="ar_AE" w:bidi="ar_AE"/>
+        </w:rPr>
+      </w:r>
+      <w:r>
+        <w:rPr>
           <w:b/>
           <w:lang w:val="ar_AE" w:bidi="ar_AE"/>
         </w:rPr>
@@ -12684,6 +14268,22 @@
       </w:r>
       <w:r>
         <w:rPr>
+          <w:lang w:val="ar_AE" w:bidi="ar_AE"/>
+        </w:rPr>
+        <w:t>וְ⁠הָ֣יָה קֹ֑דֶשׁ</w:t>
+      </w:r>
+    </w:p>
+    <w:p>
+      <w:pPr>
+        <w:bidi/>
+      </w:pPr>
+      <w:r>
+        <w:rPr>
+          <w:lang w:val="ar_AE" w:bidi="ar_AE"/>
+        </w:rPr>
+      </w:r>
+      <w:r>
+        <w:rPr>
           <w:b/>
           <w:lang w:val="ar_AE" w:bidi="ar_AE"/>
         </w:rPr>
@@ -12803,6 +14403,22 @@
       </w:r>
       <w:r>
         <w:rPr>
+          <w:lang w:val="ar_AE" w:bidi="ar_AE"/>
+        </w:rPr>
+        <w:t>בֵּ֣ית יַֽעֲקֹ֔ב</w:t>
+      </w:r>
+    </w:p>
+    <w:p>
+      <w:pPr>
+        <w:bidi/>
+      </w:pPr>
+      <w:r>
+        <w:rPr>
+          <w:lang w:val="ar_AE" w:bidi="ar_AE"/>
+        </w:rPr>
+      </w:r>
+      <w:r>
+        <w:rPr>
           <w:b/>
           <w:lang w:val="ar_AE" w:bidi="ar_AE"/>
         </w:rPr>
@@ -12922,6 +14538,22 @@
       </w:r>
       <w:r>
         <w:rPr>
+          <w:lang w:val="ar_AE" w:bidi="ar_AE"/>
+        </w:rPr>
+        <w:t>אֵ֖ת מוֹרָֽשֵׁי⁠הֶם</w:t>
+      </w:r>
+    </w:p>
+    <w:p>
+      <w:pPr>
+        <w:bidi/>
+      </w:pPr>
+      <w:r>
+        <w:rPr>
+          <w:lang w:val="ar_AE" w:bidi="ar_AE"/>
+        </w:rPr>
+      </w:r>
+      <w:r>
+        <w:rPr>
           <w:b/>
           <w:lang w:val="ar_AE" w:bidi="ar_AE"/>
         </w:rPr>
@@ -13019,6 +14651,22 @@
       </w:r>
       <w:r>
         <w:rPr>
+          <w:lang w:val="ar_AE" w:bidi="ar_AE"/>
+        </w:rPr>
+        <w:t>וְ⁠הָיָה֩ בֵית־יַעֲקֹ֨ב אֵ֜שׁ וּ⁠בֵ֧ית יוֹסֵ֣ף לֶהָבָ֗ה</w:t>
+      </w:r>
+    </w:p>
+    <w:p>
+      <w:pPr>
+        <w:bidi/>
+      </w:pPr>
+      <w:r>
+        <w:rPr>
+          <w:lang w:val="ar_AE" w:bidi="ar_AE"/>
+        </w:rPr>
+      </w:r>
+      <w:r>
+        <w:rPr>
           <w:b/>
           <w:lang w:val="ar_AE" w:bidi="ar_AE"/>
         </w:rPr>
@@ -13125,6 +14773,22 @@
       </w:r>
       <w:r>
         <w:rPr>
+          <w:lang w:val="ar_AE" w:bidi="ar_AE"/>
+        </w:rPr>
+        <w:t>בֵית־יַעֲקֹ֨ב</w:t>
+      </w:r>
+    </w:p>
+    <w:p>
+      <w:pPr>
+        <w:bidi/>
+      </w:pPr>
+      <w:r>
+        <w:rPr>
+          <w:lang w:val="ar_AE" w:bidi="ar_AE"/>
+        </w:rPr>
+      </w:r>
+      <w:r>
+        <w:rPr>
           <w:b/>
           <w:lang w:val="ar_AE" w:bidi="ar_AE"/>
         </w:rPr>
@@ -13244,6 +14908,22 @@
       </w:r>
       <w:r>
         <w:rPr>
+          <w:lang w:val="ar_AE" w:bidi="ar_AE"/>
+        </w:rPr>
+        <w:t>וּ⁠בֵ֧ית יוֹסֵ֣ף</w:t>
+      </w:r>
+    </w:p>
+    <w:p>
+      <w:pPr>
+        <w:bidi/>
+      </w:pPr>
+      <w:r>
+        <w:rPr>
+          <w:lang w:val="ar_AE" w:bidi="ar_AE"/>
+        </w:rPr>
+      </w:r>
+      <w:r>
+        <w:rPr>
           <w:b/>
           <w:lang w:val="ar_AE" w:bidi="ar_AE"/>
         </w:rPr>
@@ -13350,6 +15030,22 @@
       </w:r>
       <w:r>
         <w:rPr>
+          <w:lang w:val="ar_AE" w:bidi="ar_AE"/>
+        </w:rPr>
+        <w:t>וּ⁠בֵ֤ית עֵשָׂו֙ &amp; לְ⁠בֵ֣ית עֵשָׂ֔ו</w:t>
+      </w:r>
+    </w:p>
+    <w:p>
+      <w:pPr>
+        <w:bidi/>
+      </w:pPr>
+      <w:r>
+        <w:rPr>
+          <w:lang w:val="ar_AE" w:bidi="ar_AE"/>
+        </w:rPr>
+      </w:r>
+      <w:r>
+        <w:rPr>
           <w:b/>
           <w:lang w:val="ar_AE" w:bidi="ar_AE"/>
         </w:rPr>
@@ -13470,6 +15166,22 @@
       </w:r>
       <w:r>
         <w:rPr>
+          <w:lang w:val="ar_AE" w:bidi="ar_AE"/>
+        </w:rPr>
+        <w:t>אֵ֜שׁ &amp; לֶהָבָ֗ה &amp; לְ⁠קַ֔שׁ</w:t>
+      </w:r>
+    </w:p>
+    <w:p>
+      <w:pPr>
+        <w:bidi/>
+      </w:pPr>
+      <w:r>
+        <w:rPr>
+          <w:lang w:val="ar_AE" w:bidi="ar_AE"/>
+        </w:rPr>
+      </w:r>
+      <w:r>
+        <w:rPr>
           <w:b/>
           <w:lang w:val="ar_AE" w:bidi="ar_AE"/>
         </w:rPr>
@@ -13562,6 +15274,22 @@
       </w:r>
       <w:r>
         <w:rPr>
+          <w:lang w:val="ar_AE" w:bidi="ar_AE"/>
+        </w:rPr>
+        <w:t>לְ⁠קַ֔שׁ</w:t>
+      </w:r>
+    </w:p>
+    <w:p>
+      <w:pPr>
+        <w:bidi/>
+      </w:pPr>
+      <w:r>
+        <w:rPr>
+          <w:lang w:val="ar_AE" w:bidi="ar_AE"/>
+        </w:rPr>
+      </w:r>
+      <w:r>
+        <w:rPr>
           <w:b/>
           <w:lang w:val="ar_AE" w:bidi="ar_AE"/>
         </w:rPr>
@@ -13681,6 +15409,22 @@
       </w:r>
       <w:r>
         <w:rPr>
+          <w:lang w:val="ar_AE" w:bidi="ar_AE"/>
+        </w:rPr>
+        <w:t>וְ⁠דָלְק֥וּ בָ⁠הֶ֖ם וַ⁠אֲכָל֑וּ⁠ם</w:t>
+      </w:r>
+    </w:p>
+    <w:p>
+      <w:pPr>
+        <w:bidi/>
+      </w:pPr>
+      <w:r>
+        <w:rPr>
+          <w:lang w:val="ar_AE" w:bidi="ar_AE"/>
+        </w:rPr>
+      </w:r>
+      <w:r>
+        <w:rPr>
           <w:b/>
           <w:lang w:val="ar_AE" w:bidi="ar_AE"/>
         </w:rPr>
@@ -13813,6 +15557,22 @@
       </w:r>
       <w:r>
         <w:rPr>
+          <w:lang w:val="ar_AE" w:bidi="ar_AE"/>
+        </w:rPr>
+        <w:t>כִּ֥י</w:t>
+      </w:r>
+    </w:p>
+    <w:p>
+      <w:pPr>
+        <w:bidi/>
+      </w:pPr>
+      <w:r>
+        <w:rPr>
+          <w:lang w:val="ar_AE" w:bidi="ar_AE"/>
+        </w:rPr>
+      </w:r>
+      <w:r>
+        <w:rPr>
           <w:b/>
           <w:lang w:val="ar_AE" w:bidi="ar_AE"/>
         </w:rPr>
@@ -13919,6 +15679,22 @@
       </w:r>
       <w:r>
         <w:rPr>
+          <w:lang w:val="ar_AE" w:bidi="ar_AE"/>
+        </w:rPr>
+        <w:t>כִּ֥י יְהוָ֖ה דִּבֵּֽר</w:t>
+      </w:r>
+    </w:p>
+    <w:p>
+      <w:pPr>
+        <w:bidi/>
+      </w:pPr>
+      <w:r>
+        <w:rPr>
+          <w:lang w:val="ar_AE" w:bidi="ar_AE"/>
+        </w:rPr>
+      </w:r>
+      <w:r>
+        <w:rPr>
           <w:b/>
           <w:lang w:val="ar_AE" w:bidi="ar_AE"/>
         </w:rPr>
@@ -14025,6 +15801,22 @@
       </w:r>
       <w:r>
         <w:rPr>
+          <w:lang w:val="ar_AE" w:bidi="ar_AE"/>
+        </w:rPr>
+        <w:t>וְ⁠יָרְשׁ֨וּ</w:t>
+      </w:r>
+    </w:p>
+    <w:p>
+      <w:pPr>
+        <w:bidi/>
+      </w:pPr>
+      <w:r>
+        <w:rPr>
+          <w:lang w:val="ar_AE" w:bidi="ar_AE"/>
+        </w:rPr>
+      </w:r>
+      <w:r>
+        <w:rPr>
           <w:b/>
           <w:lang w:val="ar_AE" w:bidi="ar_AE"/>
         </w:rPr>
@@ -14109,6 +15901,22 @@
       </w:r>
       <w:r>
         <w:rPr>
+          <w:lang w:val="ar_AE" w:bidi="ar_AE"/>
+        </w:rPr>
+        <w:t>הַ⁠נֶּ֜גֶב</w:t>
+      </w:r>
+    </w:p>
+    <w:p>
+      <w:pPr>
+        <w:bidi/>
+      </w:pPr>
+      <w:r>
+        <w:rPr>
+          <w:lang w:val="ar_AE" w:bidi="ar_AE"/>
+        </w:rPr>
+      </w:r>
+      <w:r>
+        <w:rPr>
           <w:b/>
           <w:lang w:val="ar_AE" w:bidi="ar_AE"/>
         </w:rPr>
@@ -14222,6 +16030,22 @@
       </w:r>
       <w:r>
         <w:rPr>
+          <w:lang w:val="ar_AE" w:bidi="ar_AE"/>
+        </w:rPr>
+        <w:t>אֶת־הַ֣ר עֵשָׂ֗ו</w:t>
+      </w:r>
+    </w:p>
+    <w:p>
+      <w:pPr>
+        <w:bidi/>
+      </w:pPr>
+      <w:r>
+        <w:rPr>
+          <w:lang w:val="ar_AE" w:bidi="ar_AE"/>
+        </w:rPr>
+      </w:r>
+      <w:r>
+        <w:rPr>
           <w:b/>
           <w:lang w:val="ar_AE" w:bidi="ar_AE"/>
         </w:rPr>
@@ -14328,6 +16152,22 @@
       </w:r>
       <w:r>
         <w:rPr>
+          <w:lang w:val="ar_AE" w:bidi="ar_AE"/>
+        </w:rPr>
+        <w:t>וְ⁠הַ⁠שְּׁפֵלָה֙</w:t>
+      </w:r>
+    </w:p>
+    <w:p>
+      <w:pPr>
+        <w:bidi/>
+      </w:pPr>
+      <w:r>
+        <w:rPr>
+          <w:lang w:val="ar_AE" w:bidi="ar_AE"/>
+        </w:rPr>
+      </w:r>
+      <w:r>
+        <w:rPr>
           <w:b/>
           <w:lang w:val="ar_AE" w:bidi="ar_AE"/>
         </w:rPr>
@@ -14441,6 +16281,22 @@
       </w:r>
       <w:r>
         <w:rPr>
+          <w:lang w:val="ar_AE" w:bidi="ar_AE"/>
+        </w:rPr>
+        <w:t>וְ⁠הַ⁠שְּׁפֵלָה֙ אֶת־פְּלִשְׁתִּ֔ים</w:t>
+      </w:r>
+    </w:p>
+    <w:p>
+      <w:pPr>
+        <w:bidi/>
+      </w:pPr>
+      <w:r>
+        <w:rPr>
+          <w:lang w:val="ar_AE" w:bidi="ar_AE"/>
+        </w:rPr>
+      </w:r>
+      <w:r>
+        <w:rPr>
           <w:b/>
           <w:lang w:val="ar_AE" w:bidi="ar_AE"/>
         </w:rPr>
@@ -14560,6 +16416,22 @@
       </w:r>
       <w:r>
         <w:rPr>
+          <w:lang w:val="ar_AE" w:bidi="ar_AE"/>
+        </w:rPr>
+        <w:t>אֶת־פְּלִשְׁתִּ֔ים</w:t>
+      </w:r>
+    </w:p>
+    <w:p>
+      <w:pPr>
+        <w:bidi/>
+      </w:pPr>
+      <w:r>
+        <w:rPr>
+          <w:lang w:val="ar_AE" w:bidi="ar_AE"/>
+        </w:rPr>
+      </w:r>
+      <w:r>
+        <w:rPr>
           <w:b/>
           <w:lang w:val="ar_AE" w:bidi="ar_AE"/>
         </w:rPr>
@@ -14679,6 +16551,22 @@
       </w:r>
       <w:r>
         <w:rPr>
+          <w:lang w:val="ar_AE" w:bidi="ar_AE"/>
+        </w:rPr>
+        <w:t>וְ⁠יָרְשׁוּ֙</w:t>
+      </w:r>
+    </w:p>
+    <w:p>
+      <w:pPr>
+        <w:bidi/>
+      </w:pPr>
+      <w:r>
+        <w:rPr>
+          <w:lang w:val="ar_AE" w:bidi="ar_AE"/>
+        </w:rPr>
+      </w:r>
+      <w:r>
+        <w:rPr>
           <w:b/>
           <w:lang w:val="ar_AE" w:bidi="ar_AE"/>
         </w:rPr>
@@ -14763,6 +16651,22 @@
       </w:r>
       <w:r>
         <w:rPr>
+          <w:lang w:val="ar_AE" w:bidi="ar_AE"/>
+        </w:rPr>
+        <w:t>אֶת־שְׂדֵ֣ה אֶפְרַ֔יִם וְ⁠אֵ֖ת שְׂדֵ֣ה שֹׁמְר֑וֹן</w:t>
+      </w:r>
+    </w:p>
+    <w:p>
+      <w:pPr>
+        <w:bidi/>
+      </w:pPr>
+      <w:r>
+        <w:rPr>
+          <w:lang w:val="ar_AE" w:bidi="ar_AE"/>
+        </w:rPr>
+      </w:r>
+      <w:r>
+        <w:rPr>
           <w:b/>
           <w:lang w:val="ar_AE" w:bidi="ar_AE"/>
         </w:rPr>
@@ -14882,6 +16786,22 @@
       </w:r>
       <w:r>
         <w:rPr>
+          <w:lang w:val="ar_AE" w:bidi="ar_AE"/>
+        </w:rPr>
+        <w:t>וּ⁠בִנְיָמִ֖ן</w:t>
+      </w:r>
+    </w:p>
+    <w:p>
+      <w:pPr>
+        <w:bidi/>
+      </w:pPr>
+      <w:r>
+        <w:rPr>
+          <w:lang w:val="ar_AE" w:bidi="ar_AE"/>
+        </w:rPr>
+      </w:r>
+      <w:r>
+        <w:rPr>
           <w:b/>
           <w:lang w:val="ar_AE" w:bidi="ar_AE"/>
         </w:rPr>
@@ -15001,6 +16921,22 @@
       </w:r>
       <w:r>
         <w:rPr>
+          <w:lang w:val="ar_AE" w:bidi="ar_AE"/>
+        </w:rPr>
+        <w:t>וּ⁠בִנְיָמִ֖ן אֶת־הַ⁠גִּלְעָֽד</w:t>
+      </w:r>
+    </w:p>
+    <w:p>
+      <w:pPr>
+        <w:bidi/>
+      </w:pPr>
+      <w:r>
+        <w:rPr>
+          <w:lang w:val="ar_AE" w:bidi="ar_AE"/>
+        </w:rPr>
+      </w:r>
+      <w:r>
+        <w:rPr>
           <w:b/>
           <w:lang w:val="ar_AE" w:bidi="ar_AE"/>
         </w:rPr>
@@ -15120,6 +17056,22 @@
       </w:r>
       <w:r>
         <w:rPr>
+          <w:lang w:val="ar_AE" w:bidi="ar_AE"/>
+        </w:rPr>
+        <w:t>אֶת־הַ⁠גִּלְעָֽד</w:t>
+      </w:r>
+    </w:p>
+    <w:p>
+      <w:pPr>
+        <w:bidi/>
+      </w:pPr>
+      <w:r>
+        <w:rPr>
+          <w:lang w:val="ar_AE" w:bidi="ar_AE"/>
+        </w:rPr>
+      </w:r>
+      <w:r>
+        <w:rPr>
           <w:b/>
           <w:lang w:val="ar_AE" w:bidi="ar_AE"/>
         </w:rPr>
@@ -15219,6 +17171,22 @@
       </w:r>
       <w:r>
         <w:rPr>
+          <w:lang w:val="ar_AE" w:bidi="ar_AE"/>
+        </w:rPr>
+        <w:t>וְ⁠גָלֻ֣ת הַֽ⁠חֵל־הַ֠⁠זֶּה</w:t>
+      </w:r>
+    </w:p>
+    <w:p>
+      <w:pPr>
+        <w:bidi/>
+      </w:pPr>
+      <w:r>
+        <w:rPr>
+          <w:lang w:val="ar_AE" w:bidi="ar_AE"/>
+        </w:rPr>
+      </w:r>
+      <w:r>
+        <w:rPr>
           <w:b/>
           <w:lang w:val="ar_AE" w:bidi="ar_AE"/>
         </w:rPr>
@@ -15338,6 +17306,22 @@
       </w:r>
       <w:r>
         <w:rPr>
+          <w:lang w:val="ar_AE" w:bidi="ar_AE"/>
+        </w:rPr>
+        <w:t>הַֽ⁠חֵל</w:t>
+      </w:r>
+    </w:p>
+    <w:p>
+      <w:pPr>
+        <w:bidi/>
+      </w:pPr>
+      <w:r>
+        <w:rPr>
+          <w:lang w:val="ar_AE" w:bidi="ar_AE"/>
+        </w:rPr>
+      </w:r>
+      <w:r>
+        <w:rPr>
           <w:b/>
           <w:lang w:val="ar_AE" w:bidi="ar_AE"/>
         </w:rPr>
@@ -15421,6 +17405,22 @@
       </w:r>
       <w:r>
         <w:rPr>
+          <w:lang w:val="ar_AE" w:bidi="ar_AE"/>
+        </w:rPr>
+        <w:t>לִ⁠בְנֵ֨י יִשְׂרָאֵ֤ל</w:t>
+      </w:r>
+    </w:p>
+    <w:p>
+      <w:pPr>
+        <w:bidi/>
+      </w:pPr>
+      <w:r>
+        <w:rPr>
+          <w:lang w:val="ar_AE" w:bidi="ar_AE"/>
+        </w:rPr>
+      </w:r>
+      <w:r>
+        <w:rPr>
           <w:b/>
           <w:lang w:val="ar_AE" w:bidi="ar_AE"/>
         </w:rPr>
@@ -15579,6 +17579,22 @@
       </w:r>
       <w:r>
         <w:rPr>
+          <w:lang w:val="ar_AE" w:bidi="ar_AE"/>
+        </w:rPr>
+        <w:t>אֲשֶֽׁר־כְּנַעֲנִים֙</w:t>
+      </w:r>
+    </w:p>
+    <w:p>
+      <w:pPr>
+        <w:bidi/>
+      </w:pPr>
+      <w:r>
+        <w:rPr>
+          <w:lang w:val="ar_AE" w:bidi="ar_AE"/>
+        </w:rPr>
+      </w:r>
+      <w:r>
+        <w:rPr>
           <w:b/>
           <w:lang w:val="ar_AE" w:bidi="ar_AE"/>
         </w:rPr>
@@ -15685,6 +17701,22 @@
       </w:r>
       <w:r>
         <w:rPr>
+          <w:lang w:val="ar_AE" w:bidi="ar_AE"/>
+        </w:rPr>
+        <w:t>עַד־צָ֣רְפַ֔ת</w:t>
+      </w:r>
+    </w:p>
+    <w:p>
+      <w:pPr>
+        <w:bidi/>
+      </w:pPr>
+      <w:r>
+        <w:rPr>
+          <w:lang w:val="ar_AE" w:bidi="ar_AE"/>
+        </w:rPr>
+      </w:r>
+      <w:r>
+        <w:rPr>
           <w:b/>
           <w:lang w:val="ar_AE" w:bidi="ar_AE"/>
         </w:rPr>
@@ -15791,6 +17823,22 @@
       </w:r>
       <w:r>
         <w:rPr>
+          <w:lang w:val="ar_AE" w:bidi="ar_AE"/>
+        </w:rPr>
+        <w:t>עַד־צָ֣רְפַ֔ת</w:t>
+      </w:r>
+    </w:p>
+    <w:p>
+      <w:pPr>
+        <w:bidi/>
+      </w:pPr>
+      <w:r>
+        <w:rPr>
+          <w:lang w:val="ar_AE" w:bidi="ar_AE"/>
+        </w:rPr>
+      </w:r>
+      <w:r>
+        <w:rPr>
           <w:b/>
           <w:lang w:val="ar_AE" w:bidi="ar_AE"/>
         </w:rPr>
@@ -15895,6 +17943,22 @@
       </w:r>
       <w:r>
         <w:rPr>
+          <w:lang w:val="ar_AE" w:bidi="ar_AE"/>
+        </w:rPr>
+        <w:t>וְ⁠גָלֻ֥ת יְרוּשָׁלִַ֖ם</w:t>
+      </w:r>
+    </w:p>
+    <w:p>
+      <w:pPr>
+        <w:bidi/>
+      </w:pPr>
+      <w:r>
+        <w:rPr>
+          <w:lang w:val="ar_AE" w:bidi="ar_AE"/>
+        </w:rPr>
+      </w:r>
+      <w:r>
+        <w:rPr>
           <w:b/>
           <w:lang w:val="ar_AE" w:bidi="ar_AE"/>
         </w:rPr>
@@ -16014,6 +18078,22 @@
       </w:r>
       <w:r>
         <w:rPr>
+          <w:lang w:val="ar_AE" w:bidi="ar_AE"/>
+        </w:rPr>
+        <w:t>בִּ⁠סְפָרַ֑ד</w:t>
+      </w:r>
+    </w:p>
+    <w:p>
+      <w:pPr>
+        <w:bidi/>
+      </w:pPr>
+      <w:r>
+        <w:rPr>
+          <w:lang w:val="ar_AE" w:bidi="ar_AE"/>
+        </w:rPr>
+      </w:r>
+      <w:r>
+        <w:rPr>
           <w:b/>
           <w:lang w:val="ar_AE" w:bidi="ar_AE"/>
         </w:rPr>
@@ -16127,6 +18207,22 @@
       </w:r>
       <w:r>
         <w:rPr>
+          <w:lang w:val="ar_AE" w:bidi="ar_AE"/>
+        </w:rPr>
+        <w:t>יִֽרְשׁ֕וּ</w:t>
+      </w:r>
+    </w:p>
+    <w:p>
+      <w:pPr>
+        <w:bidi/>
+      </w:pPr>
+      <w:r>
+        <w:rPr>
+          <w:lang w:val="ar_AE" w:bidi="ar_AE"/>
+        </w:rPr>
+      </w:r>
+      <w:r>
+        <w:rPr>
           <w:b/>
           <w:lang w:val="ar_AE" w:bidi="ar_AE"/>
         </w:rPr>
@@ -16233,6 +18329,22 @@
         <w:rPr>
           <w:lang w:val="ar_AE" w:bidi="ar_AE"/>
         </w:rPr>
+      </w:r>
+    </w:p>
+    <w:p>
+      <w:pPr>
+        <w:bidi/>
+      </w:pPr>
+      <w:r>
+        <w:rPr>
+          <w:lang w:val="ar_AE" w:bidi="ar_AE"/>
+        </w:rPr>
+      </w:r>
+      <w:r>
+        <w:rPr>
+          <w:lang w:val="ar_AE" w:bidi="ar_AE"/>
+        </w:rPr>
+        <w:t>הַ⁠נֶּֽגֶב</w:t>
       </w:r>
     </w:p>
     <w:p>
@@ -16377,6 +18489,22 @@
       </w:r>
       <w:r>
         <w:rPr>
+          <w:lang w:val="ar_AE" w:bidi="ar_AE"/>
+        </w:rPr>
+        <w:t>וְ⁠עָל֤וּ מֽוֹשִׁעִים֙ בְּ⁠הַ֣ר צִיּ֔וֹן לִ⁠שְׁפֹּ֖ט אֶת־הַ֣ר עֵשָׂ֑ו</w:t>
+      </w:r>
+    </w:p>
+    <w:p>
+      <w:pPr>
+        <w:bidi/>
+      </w:pPr>
+      <w:r>
+        <w:rPr>
+          <w:lang w:val="ar_AE" w:bidi="ar_AE"/>
+        </w:rPr>
+      </w:r>
+      <w:r>
+        <w:rPr>
           <w:b/>
           <w:lang w:val="ar_AE" w:bidi="ar_AE"/>
         </w:rPr>
@@ -16483,6 +18611,22 @@
       </w:r>
       <w:r>
         <w:rPr>
+          <w:lang w:val="ar_AE" w:bidi="ar_AE"/>
+        </w:rPr>
+        <w:t>מֽוֹשִׁעִים֙</w:t>
+      </w:r>
+    </w:p>
+    <w:p>
+      <w:pPr>
+        <w:bidi/>
+      </w:pPr>
+      <w:r>
+        <w:rPr>
+          <w:lang w:val="ar_AE" w:bidi="ar_AE"/>
+        </w:rPr>
+      </w:r>
+      <w:r>
+        <w:rPr>
           <w:b/>
           <w:lang w:val="ar_AE" w:bidi="ar_AE"/>
         </w:rPr>
@@ -16580,6 +18724,22 @@
       </w:r>
       <w:r>
         <w:rPr>
+          <w:lang w:val="ar_AE" w:bidi="ar_AE"/>
+        </w:rPr>
+        <w:t>בְּ⁠הַ֣ר צִיּ֔וֹן</w:t>
+      </w:r>
+    </w:p>
+    <w:p>
+      <w:pPr>
+        <w:bidi/>
+      </w:pPr>
+      <w:r>
+        <w:rPr>
+          <w:lang w:val="ar_AE" w:bidi="ar_AE"/>
+        </w:rPr>
+      </w:r>
+      <w:r>
+        <w:rPr>
           <w:b/>
           <w:lang w:val="ar_AE" w:bidi="ar_AE"/>
         </w:rPr>
@@ -16686,6 +18846,22 @@
       </w:r>
       <w:r>
         <w:rPr>
+          <w:lang w:val="ar_AE" w:bidi="ar_AE"/>
+        </w:rPr>
+        <w:t>אֶת־הַ֣ר עֵשָׂ֑ו</w:t>
+      </w:r>
+    </w:p>
+    <w:p>
+      <w:pPr>
+        <w:bidi/>
+      </w:pPr>
+      <w:r>
+        <w:rPr>
+          <w:lang w:val="ar_AE" w:bidi="ar_AE"/>
+        </w:rPr>
+      </w:r>
+      <w:r>
+        <w:rPr>
           <w:b/>
           <w:lang w:val="ar_AE" w:bidi="ar_AE"/>
         </w:rPr>
@@ -16779,6 +18955,22 @@
         <w:rPr>
           <w:lang w:val="ar_AE" w:bidi="ar_AE"/>
         </w:rPr>
+      </w:r>
+    </w:p>
+    <w:p>
+      <w:pPr>
+        <w:bidi/>
+      </w:pPr>
+      <w:r>
+        <w:rPr>
+          <w:lang w:val="ar_AE" w:bidi="ar_AE"/>
+        </w:rPr>
+      </w:r>
+      <w:r>
+        <w:rPr>
+          <w:lang w:val="ar_AE" w:bidi="ar_AE"/>
+        </w:rPr>
+        <w:t>וְ⁠הָיְתָ֥ה לַֽ⁠יהוָ֖ה הַ⁠מְּלוּכָֽה</w:t>
       </w:r>
     </w:p>
     <w:p>

</xml_diff>